<commit_message>
Fill Lab 6 report with run results and discussion answers
Co-Authored-By: Claude Opus 5.5 <noreply@anthropic.com>
Claude-Session: https://claude.ai/code/session_01MRtG6dEqhFRvA9gCPi6R4t
</commit_message>
<xml_diff>
--- a/Lab6_PDC/PDC_Lab06_Report.docx
+++ b/Lab6_PDC/PDC_Lab06_Report.docx
@@ -361,7 +361,18 @@
               <w:right w:type="dxa" w:w="100"/>
             </w:tcMar>
           </w:tcPr>
-          <w:p/>
+          <w:p>
+            <w:r>
+              <w:rPr>
+                <w:rFonts w:ascii="Calibri" w:cs="Calibri" w:eastAsia="Calibri" w:hAnsi="Calibri"/>
+                <w:b w:val="false"/>
+                <w:bCs w:val="false"/>
+                <w:sz w:val="20"/>
+                <w:szCs w:val="20"/>
+              </w:rPr>
+              <w:t xml:space="preserve">14 October 2026</w:t>
+            </w:r>
+          </w:p>
         </w:tc>
       </w:tr>
     </w:tbl>
@@ -400,7 +411,7 @@
           <w:sz w:val="22"/>
           <w:szCs w:val="22"/>
         </w:rPr>
-        <w:t xml:space="preserve">Number of logical cores on this machine (Environment.ProcessorCount): ____</w:t>
+        <w:t xml:space="preserve">Number of logical cores on this machine (Environment.ProcessorCount): 8</w:t>
       </w:r>
     </w:p>
     <w:p>
@@ -1255,7 +1266,18 @@
               <w:right w:type="dxa" w:w="100"/>
             </w:tcMar>
           </w:tcPr>
-          <w:p/>
+          <w:p>
+            <w:r>
+              <w:rPr>
+                <w:rFonts w:ascii="Calibri" w:cs="Calibri" w:eastAsia="Calibri" w:hAnsi="Calibri"/>
+                <w:b w:val="false"/>
+                <w:bCs w:val="false"/>
+                <w:sz w:val="20"/>
+                <w:szCs w:val="20"/>
+              </w:rPr>
+              <w:t xml:space="preserve">1</w:t>
+            </w:r>
+          </w:p>
         </w:tc>
         <w:tc>
           <w:tcPr>
@@ -1273,7 +1295,18 @@
               <w:right w:type="dxa" w:w="100"/>
             </w:tcMar>
           </w:tcPr>
-          <w:p/>
+          <w:p>
+            <w:r>
+              <w:rPr>
+                <w:rFonts w:ascii="Calibri" w:cs="Calibri" w:eastAsia="Calibri" w:hAnsi="Calibri"/>
+                <w:b w:val="false"/>
+                <w:bCs w:val="false"/>
+                <w:sz w:val="20"/>
+                <w:szCs w:val="20"/>
+              </w:rPr>
+              <w:t xml:space="preserve">1763</w:t>
+            </w:r>
+          </w:p>
         </w:tc>
         <w:tc>
           <w:tcPr>
@@ -1291,7 +1324,18 @@
               <w:right w:type="dxa" w:w="100"/>
             </w:tcMar>
           </w:tcPr>
-          <w:p/>
+          <w:p>
+            <w:r>
+              <w:rPr>
+                <w:rFonts w:ascii="Calibri" w:cs="Calibri" w:eastAsia="Calibri" w:hAnsi="Calibri"/>
+                <w:b w:val="false"/>
+                <w:bCs w:val="false"/>
+                <w:sz w:val="20"/>
+                <w:szCs w:val="20"/>
+              </w:rPr>
+              <w:t xml:space="preserve">1600</w:t>
+            </w:r>
+          </w:p>
         </w:tc>
         <w:tc>
           <w:tcPr>
@@ -1309,7 +1353,18 @@
               <w:right w:type="dxa" w:w="100"/>
             </w:tcMar>
           </w:tcPr>
-          <w:p/>
+          <w:p>
+            <w:r>
+              <w:rPr>
+                <w:rFonts w:ascii="Calibri" w:cs="Calibri" w:eastAsia="Calibri" w:hAnsi="Calibri"/>
+                <w:b w:val="false"/>
+                <w:bCs w:val="false"/>
+                <w:sz w:val="20"/>
+                <w:szCs w:val="20"/>
+              </w:rPr>
+              <w:t xml:space="preserve">2</w:t>
+            </w:r>
+          </w:p>
         </w:tc>
       </w:tr>
       <w:tr>
@@ -1358,7 +1413,18 @@
               <w:right w:type="dxa" w:w="100"/>
             </w:tcMar>
           </w:tcPr>
-          <w:p/>
+          <w:p>
+            <w:r>
+              <w:rPr>
+                <w:rFonts w:ascii="Calibri" w:cs="Calibri" w:eastAsia="Calibri" w:hAnsi="Calibri"/>
+                <w:b w:val="false"/>
+                <w:bCs w:val="false"/>
+                <w:sz w:val="20"/>
+                <w:szCs w:val="20"/>
+              </w:rPr>
+              <w:t xml:space="preserve">3</w:t>
+            </w:r>
+          </w:p>
         </w:tc>
         <w:tc>
           <w:tcPr>
@@ -1376,7 +1442,18 @@
               <w:right w:type="dxa" w:w="100"/>
             </w:tcMar>
           </w:tcPr>
-          <w:p/>
+          <w:p>
+            <w:r>
+              <w:rPr>
+                <w:rFonts w:ascii="Calibri" w:cs="Calibri" w:eastAsia="Calibri" w:hAnsi="Calibri"/>
+                <w:b w:val="false"/>
+                <w:bCs w:val="false"/>
+                <w:sz w:val="20"/>
+                <w:szCs w:val="20"/>
+              </w:rPr>
+              <w:t xml:space="preserve">889</w:t>
+            </w:r>
+          </w:p>
         </w:tc>
         <w:tc>
           <w:tcPr>
@@ -1394,7 +1471,18 @@
               <w:right w:type="dxa" w:w="100"/>
             </w:tcMar>
           </w:tcPr>
-          <w:p/>
+          <w:p>
+            <w:r>
+              <w:rPr>
+                <w:rFonts w:ascii="Calibri" w:cs="Calibri" w:eastAsia="Calibri" w:hAnsi="Calibri"/>
+                <w:b w:val="false"/>
+                <w:bCs w:val="false"/>
+                <w:sz w:val="20"/>
+                <w:szCs w:val="20"/>
+              </w:rPr>
+              <w:t xml:space="preserve">800</w:t>
+            </w:r>
+          </w:p>
         </w:tc>
         <w:tc>
           <w:tcPr>
@@ -1412,7 +1500,18 @@
               <w:right w:type="dxa" w:w="100"/>
             </w:tcMar>
           </w:tcPr>
-          <w:p/>
+          <w:p>
+            <w:r>
+              <w:rPr>
+                <w:rFonts w:ascii="Calibri" w:cs="Calibri" w:eastAsia="Calibri" w:hAnsi="Calibri"/>
+                <w:b w:val="false"/>
+                <w:bCs w:val="false"/>
+                <w:sz w:val="20"/>
+                <w:szCs w:val="20"/>
+              </w:rPr>
+              <w:t xml:space="preserve">2, 4, 6</w:t>
+            </w:r>
+          </w:p>
         </w:tc>
       </w:tr>
       <w:tr>
@@ -1461,7 +1560,18 @@
               <w:right w:type="dxa" w:w="100"/>
             </w:tcMar>
           </w:tcPr>
-          <w:p/>
+          <w:p>
+            <w:r>
+              <w:rPr>
+                <w:rFonts w:ascii="Calibri" w:cs="Calibri" w:eastAsia="Calibri" w:hAnsi="Calibri"/>
+                <w:b w:val="false"/>
+                <w:bCs w:val="false"/>
+                <w:sz w:val="20"/>
+                <w:szCs w:val="20"/>
+              </w:rPr>
+              <w:t xml:space="preserve">6</w:t>
+            </w:r>
+          </w:p>
         </w:tc>
         <w:tc>
           <w:tcPr>
@@ -1479,7 +1589,18 @@
               <w:right w:type="dxa" w:w="100"/>
             </w:tcMar>
           </w:tcPr>
-          <w:p/>
+          <w:p>
+            <w:r>
+              <w:rPr>
+                <w:rFonts w:ascii="Calibri" w:cs="Calibri" w:eastAsia="Calibri" w:hAnsi="Calibri"/>
+                <w:b w:val="false"/>
+                <w:bCs w:val="false"/>
+                <w:sz w:val="20"/>
+                <w:szCs w:val="20"/>
+              </w:rPr>
+              <w:t xml:space="preserve">453</w:t>
+            </w:r>
+          </w:p>
         </w:tc>
         <w:tc>
           <w:tcPr>
@@ -1497,7 +1618,18 @@
               <w:right w:type="dxa" w:w="100"/>
             </w:tcMar>
           </w:tcPr>
-          <w:p/>
+          <w:p>
+            <w:r>
+              <w:rPr>
+                <w:rFonts w:ascii="Calibri" w:cs="Calibri" w:eastAsia="Calibri" w:hAnsi="Calibri"/>
+                <w:b w:val="false"/>
+                <w:bCs w:val="false"/>
+                <w:sz w:val="20"/>
+                <w:szCs w:val="20"/>
+              </w:rPr>
+              <w:t xml:space="preserve">400</w:t>
+            </w:r>
+          </w:p>
         </w:tc>
         <w:tc>
           <w:tcPr>
@@ -1515,7 +1647,18 @@
               <w:right w:type="dxa" w:w="100"/>
             </w:tcMar>
           </w:tcPr>
-          <w:p/>
+          <w:p>
+            <w:r>
+              <w:rPr>
+                <w:rFonts w:ascii="Calibri" w:cs="Calibri" w:eastAsia="Calibri" w:hAnsi="Calibri"/>
+                <w:b w:val="false"/>
+                <w:bCs w:val="false"/>
+                <w:sz w:val="20"/>
+                <w:szCs w:val="20"/>
+              </w:rPr>
+              <w:t xml:space="preserve">2, 4, 6, 7, 8, 9</w:t>
+            </w:r>
+          </w:p>
         </w:tc>
       </w:tr>
       <w:tr>
@@ -1564,7 +1707,18 @@
               <w:right w:type="dxa" w:w="100"/>
             </w:tcMar>
           </w:tcPr>
-          <w:p/>
+          <w:p>
+            <w:r>
+              <w:rPr>
+                <w:rFonts w:ascii="Calibri" w:cs="Calibri" w:eastAsia="Calibri" w:hAnsi="Calibri"/>
+                <w:b w:val="false"/>
+                <w:bCs w:val="false"/>
+                <w:sz w:val="20"/>
+                <w:szCs w:val="20"/>
+              </w:rPr>
+              <w:t xml:space="preserve">9</w:t>
+            </w:r>
+          </w:p>
         </w:tc>
         <w:tc>
           <w:tcPr>
@@ -1582,7 +1736,18 @@
               <w:right w:type="dxa" w:w="100"/>
             </w:tcMar>
           </w:tcPr>
-          <w:p/>
+          <w:p>
+            <w:r>
+              <w:rPr>
+                <w:rFonts w:ascii="Calibri" w:cs="Calibri" w:eastAsia="Calibri" w:hAnsi="Calibri"/>
+                <w:b w:val="false"/>
+                <w:bCs w:val="false"/>
+                <w:sz w:val="20"/>
+                <w:szCs w:val="20"/>
+              </w:rPr>
+              <w:t xml:space="preserve">273</w:t>
+            </w:r>
+          </w:p>
         </w:tc>
         <w:tc>
           <w:tcPr>
@@ -1600,7 +1765,18 @@
               <w:right w:type="dxa" w:w="100"/>
             </w:tcMar>
           </w:tcPr>
-          <w:p/>
+          <w:p>
+            <w:r>
+              <w:rPr>
+                <w:rFonts w:ascii="Calibri" w:cs="Calibri" w:eastAsia="Calibri" w:hAnsi="Calibri"/>
+                <w:b w:val="false"/>
+                <w:bCs w:val="false"/>
+                <w:sz w:val="20"/>
+                <w:szCs w:val="20"/>
+              </w:rPr>
+              <w:t xml:space="preserve">200</w:t>
+            </w:r>
+          </w:p>
         </w:tc>
         <w:tc>
           <w:tcPr>
@@ -1618,13 +1794,800 @@
               <w:right w:type="dxa" w:w="100"/>
             </w:tcMar>
           </w:tcPr>
-          <w:p/>
+          <w:p>
+            <w:r>
+              <w:rPr>
+                <w:rFonts w:ascii="Calibri" w:cs="Calibri" w:eastAsia="Calibri" w:hAnsi="Calibri"/>
+                <w:b w:val="false"/>
+                <w:bCs w:val="false"/>
+                <w:sz w:val="20"/>
+                <w:szCs w:val="20"/>
+              </w:rPr>
+              <w:t xml:space="preserve">2, 4, 6, 7, 8, 9, 10, 11, 12</w:t>
+            </w:r>
+          </w:p>
         </w:tc>
       </w:tr>
     </w:tbl>
     <w:p/>
     <w:p>
       <w:pPr>
+        <w:pStyle w:val="Heading2"/>
+        <w:spacing w:after="120" w:before="200"/>
+      </w:pPr>
+      <w:r>
+        <w:rPr>
+          <w:rFonts w:ascii="Arial" w:cs="Arial" w:eastAsia="Arial" w:hAnsi="Arial"/>
+        </w:rPr>
+        <w:t xml:space="preserve">Second run of each setting</w:t>
+      </w:r>
+    </w:p>
+    <w:tbl>
+      <w:tblPr>
+        <w:tblW w:type="dxa" w:w="9026"/>
+        <w:tblBorders>
+          <w:top w:val="single" w:color="auto" w:sz="4"/>
+          <w:left w:val="single" w:color="auto" w:sz="4"/>
+          <w:bottom w:val="single" w:color="auto" w:sz="4"/>
+          <w:right w:val="single" w:color="auto" w:sz="4"/>
+          <w:insideH w:val="single" w:color="auto" w:sz="4"/>
+          <w:insideV w:val="single" w:color="auto" w:sz="4"/>
+        </w:tblBorders>
+      </w:tblPr>
+      <w:tblGrid>
+        <w:gridCol w:w="1500"/>
+        <w:gridCol w:w="1881"/>
+        <w:gridCol w:w="1881"/>
+        <w:gridCol w:w="1881"/>
+        <w:gridCol w:w="1883"/>
+      </w:tblGrid>
+      <w:tr>
+        <w:trPr>
+          <w:tblHeader/>
+        </w:trPr>
+        <w:tc>
+          <w:tcPr>
+            <w:tcW w:type="dxa" w:w="1500"/>
+            <w:tcBorders>
+              <w:top w:val="single" w:color="808080" w:sz="4"/>
+              <w:left w:val="single" w:color="808080" w:sz="4"/>
+              <w:bottom w:val="single" w:color="808080" w:sz="4"/>
+              <w:right w:val="single" w:color="808080" w:sz="4"/>
+            </w:tcBorders>
+            <w:shd w:fill="D9E2F3" w:color="auto" w:val="clear"/>
+            <w:tcMar>
+              <w:top w:type="dxa" w:w="60"/>
+              <w:left w:type="dxa" w:w="100"/>
+              <w:bottom w:type="dxa" w:w="60"/>
+              <w:right w:type="dxa" w:w="100"/>
+            </w:tcMar>
+          </w:tcPr>
+          <w:p>
+            <w:r>
+              <w:rPr>
+                <w:rFonts w:ascii="Calibri" w:cs="Calibri" w:eastAsia="Calibri" w:hAnsi="Calibri"/>
+                <w:b/>
+                <w:bCs/>
+                <w:sz w:val="20"/>
+                <w:szCs w:val="20"/>
+              </w:rPr>
+              <w:t xml:space="preserve">Maximum degree</w:t>
+            </w:r>
+          </w:p>
+        </w:tc>
+        <w:tc>
+          <w:tcPr>
+            <w:tcW w:type="dxa" w:w="1881"/>
+            <w:tcBorders>
+              <w:top w:val="single" w:color="808080" w:sz="4"/>
+              <w:left w:val="single" w:color="808080" w:sz="4"/>
+              <w:bottom w:val="single" w:color="808080" w:sz="4"/>
+              <w:right w:val="single" w:color="808080" w:sz="4"/>
+            </w:tcBorders>
+            <w:shd w:fill="D9E2F3" w:color="auto" w:val="clear"/>
+            <w:tcMar>
+              <w:top w:type="dxa" w:w="60"/>
+              <w:left w:type="dxa" w:w="100"/>
+              <w:bottom w:type="dxa" w:w="60"/>
+              <w:right w:type="dxa" w:w="100"/>
+            </w:tcMar>
+          </w:tcPr>
+          <w:p>
+            <w:r>
+              <w:rPr>
+                <w:rFonts w:ascii="Calibri" w:cs="Calibri" w:eastAsia="Calibri" w:hAnsi="Calibri"/>
+                <w:b/>
+                <w:bCs/>
+                <w:sz w:val="20"/>
+                <w:szCs w:val="20"/>
+              </w:rPr>
+              <w:t xml:space="preserve">Distinct threads used</w:t>
+            </w:r>
+          </w:p>
+        </w:tc>
+        <w:tc>
+          <w:tcPr>
+            <w:tcW w:type="dxa" w:w="1881"/>
+            <w:tcBorders>
+              <w:top w:val="single" w:color="808080" w:sz="4"/>
+              <w:left w:val="single" w:color="808080" w:sz="4"/>
+              <w:bottom w:val="single" w:color="808080" w:sz="4"/>
+              <w:right w:val="single" w:color="808080" w:sz="4"/>
+            </w:tcBorders>
+            <w:shd w:fill="D9E2F3" w:color="auto" w:val="clear"/>
+            <w:tcMar>
+              <w:top w:type="dxa" w:w="60"/>
+              <w:left w:type="dxa" w:w="100"/>
+              <w:bottom w:type="dxa" w:w="60"/>
+              <w:right w:type="dxa" w:w="100"/>
+            </w:tcMar>
+          </w:tcPr>
+          <w:p>
+            <w:r>
+              <w:rPr>
+                <w:rFonts w:ascii="Calibri" w:cs="Calibri" w:eastAsia="Calibri" w:hAnsi="Calibri"/>
+                <w:b/>
+                <w:bCs/>
+                <w:sz w:val="20"/>
+                <w:szCs w:val="20"/>
+              </w:rPr>
+              <w:t xml:space="preserve">Elapsed (ms)</w:t>
+            </w:r>
+          </w:p>
+        </w:tc>
+        <w:tc>
+          <w:tcPr>
+            <w:tcW w:type="dxa" w:w="1881"/>
+            <w:tcBorders>
+              <w:top w:val="single" w:color="808080" w:sz="4"/>
+              <w:left w:val="single" w:color="808080" w:sz="4"/>
+              <w:bottom w:val="single" w:color="808080" w:sz="4"/>
+              <w:right w:val="single" w:color="808080" w:sz="4"/>
+            </w:tcBorders>
+            <w:shd w:fill="D9E2F3" w:color="auto" w:val="clear"/>
+            <w:tcMar>
+              <w:top w:type="dxa" w:w="60"/>
+              <w:left w:type="dxa" w:w="100"/>
+              <w:bottom w:type="dxa" w:w="60"/>
+              <w:right w:type="dxa" w:w="100"/>
+            </w:tcMar>
+          </w:tcPr>
+          <w:p>
+            <w:r>
+              <w:rPr>
+                <w:rFonts w:ascii="Calibri" w:cs="Calibri" w:eastAsia="Calibri" w:hAnsi="Calibri"/>
+                <w:b/>
+                <w:bCs/>
+                <w:sz w:val="20"/>
+                <w:szCs w:val="20"/>
+              </w:rPr>
+              <w:t xml:space="preserve">Thread IDs seen</w:t>
+            </w:r>
+          </w:p>
+        </w:tc>
+        <w:tc>
+          <w:tcPr>
+            <w:tcW w:type="dxa" w:w="1883"/>
+            <w:tcBorders>
+              <w:top w:val="single" w:color="808080" w:sz="4"/>
+              <w:left w:val="single" w:color="808080" w:sz="4"/>
+              <w:bottom w:val="single" w:color="808080" w:sz="4"/>
+              <w:right w:val="single" w:color="808080" w:sz="4"/>
+            </w:tcBorders>
+            <w:shd w:fill="D9E2F3" w:color="auto" w:val="clear"/>
+            <w:tcMar>
+              <w:top w:type="dxa" w:w="60"/>
+              <w:left w:type="dxa" w:w="100"/>
+              <w:bottom w:type="dxa" w:w="60"/>
+              <w:right w:type="dxa" w:w="100"/>
+            </w:tcMar>
+          </w:tcPr>
+          <w:p>
+            <w:r>
+              <w:rPr>
+                <w:rFonts w:ascii="Calibri" w:cs="Calibri" w:eastAsia="Calibri" w:hAnsi="Calibri"/>
+                <w:b/>
+                <w:bCs/>
+                <w:sz w:val="20"/>
+                <w:szCs w:val="20"/>
+              </w:rPr>
+              <w:t xml:space="preserve">Same IDs as first run?</w:t>
+            </w:r>
+          </w:p>
+        </w:tc>
+      </w:tr>
+      <w:tr>
+        <w:tc>
+          <w:tcPr>
+            <w:tcW w:type="dxa" w:w="1500"/>
+            <w:tcBorders>
+              <w:top w:val="single" w:color="808080" w:sz="4"/>
+              <w:left w:val="single" w:color="808080" w:sz="4"/>
+              <w:bottom w:val="single" w:color="808080" w:sz="4"/>
+              <w:right w:val="single" w:color="808080" w:sz="4"/>
+            </w:tcBorders>
+            <w:tcMar>
+              <w:top w:type="dxa" w:w="60"/>
+              <w:left w:type="dxa" w:w="100"/>
+              <w:bottom w:type="dxa" w:w="60"/>
+              <w:right w:type="dxa" w:w="100"/>
+            </w:tcMar>
+          </w:tcPr>
+          <w:p>
+            <w:r>
+              <w:rPr>
+                <w:rFonts w:ascii="Calibri" w:cs="Calibri" w:eastAsia="Calibri" w:hAnsi="Calibri"/>
+                <w:b/>
+                <w:bCs/>
+                <w:sz w:val="20"/>
+                <w:szCs w:val="20"/>
+              </w:rPr>
+              <w:t xml:space="preserve">1</w:t>
+            </w:r>
+          </w:p>
+        </w:tc>
+        <w:tc>
+          <w:tcPr>
+            <w:tcW w:type="dxa" w:w="1881"/>
+            <w:tcBorders>
+              <w:top w:val="single" w:color="808080" w:sz="4"/>
+              <w:left w:val="single" w:color="808080" w:sz="4"/>
+              <w:bottom w:val="single" w:color="808080" w:sz="4"/>
+              <w:right w:val="single" w:color="808080" w:sz="4"/>
+            </w:tcBorders>
+            <w:tcMar>
+              <w:top w:type="dxa" w:w="60"/>
+              <w:left w:type="dxa" w:w="100"/>
+              <w:bottom w:type="dxa" w:w="60"/>
+              <w:right w:type="dxa" w:w="100"/>
+            </w:tcMar>
+          </w:tcPr>
+          <w:p>
+            <w:r>
+              <w:rPr>
+                <w:rFonts w:ascii="Calibri" w:cs="Calibri" w:eastAsia="Calibri" w:hAnsi="Calibri"/>
+                <w:b w:val="false"/>
+                <w:bCs w:val="false"/>
+                <w:sz w:val="20"/>
+                <w:szCs w:val="20"/>
+              </w:rPr>
+              <w:t xml:space="preserve">1</w:t>
+            </w:r>
+          </w:p>
+        </w:tc>
+        <w:tc>
+          <w:tcPr>
+            <w:tcW w:type="dxa" w:w="1881"/>
+            <w:tcBorders>
+              <w:top w:val="single" w:color="808080" w:sz="4"/>
+              <w:left w:val="single" w:color="808080" w:sz="4"/>
+              <w:bottom w:val="single" w:color="808080" w:sz="4"/>
+              <w:right w:val="single" w:color="808080" w:sz="4"/>
+            </w:tcBorders>
+            <w:tcMar>
+              <w:top w:type="dxa" w:w="60"/>
+              <w:left w:type="dxa" w:w="100"/>
+              <w:bottom w:type="dxa" w:w="60"/>
+              <w:right w:type="dxa" w:w="100"/>
+            </w:tcMar>
+          </w:tcPr>
+          <w:p>
+            <w:r>
+              <w:rPr>
+                <w:rFonts w:ascii="Calibri" w:cs="Calibri" w:eastAsia="Calibri" w:hAnsi="Calibri"/>
+                <w:b w:val="false"/>
+                <w:bCs w:val="false"/>
+                <w:sz w:val="20"/>
+                <w:szCs w:val="20"/>
+              </w:rPr>
+              <w:t xml:space="preserve">1758</w:t>
+            </w:r>
+          </w:p>
+        </w:tc>
+        <w:tc>
+          <w:tcPr>
+            <w:tcW w:type="dxa" w:w="1881"/>
+            <w:tcBorders>
+              <w:top w:val="single" w:color="808080" w:sz="4"/>
+              <w:left w:val="single" w:color="808080" w:sz="4"/>
+              <w:bottom w:val="single" w:color="808080" w:sz="4"/>
+              <w:right w:val="single" w:color="808080" w:sz="4"/>
+            </w:tcBorders>
+            <w:tcMar>
+              <w:top w:type="dxa" w:w="60"/>
+              <w:left w:type="dxa" w:w="100"/>
+              <w:bottom w:type="dxa" w:w="60"/>
+              <w:right w:type="dxa" w:w="100"/>
+            </w:tcMar>
+          </w:tcPr>
+          <w:p>
+            <w:r>
+              <w:rPr>
+                <w:rFonts w:ascii="Calibri" w:cs="Calibri" w:eastAsia="Calibri" w:hAnsi="Calibri"/>
+                <w:b w:val="false"/>
+                <w:bCs w:val="false"/>
+                <w:sz w:val="20"/>
+                <w:szCs w:val="20"/>
+              </w:rPr>
+              <w:t xml:space="preserve">2</w:t>
+            </w:r>
+          </w:p>
+        </w:tc>
+        <w:tc>
+          <w:tcPr>
+            <w:tcW w:type="dxa" w:w="1883"/>
+            <w:tcBorders>
+              <w:top w:val="single" w:color="808080" w:sz="4"/>
+              <w:left w:val="single" w:color="808080" w:sz="4"/>
+              <w:bottom w:val="single" w:color="808080" w:sz="4"/>
+              <w:right w:val="single" w:color="808080" w:sz="4"/>
+            </w:tcBorders>
+            <w:tcMar>
+              <w:top w:type="dxa" w:w="60"/>
+              <w:left w:type="dxa" w:w="100"/>
+              <w:bottom w:type="dxa" w:w="60"/>
+              <w:right w:type="dxa" w:w="100"/>
+            </w:tcMar>
+          </w:tcPr>
+          <w:p>
+            <w:r>
+              <w:rPr>
+                <w:rFonts w:ascii="Calibri" w:cs="Calibri" w:eastAsia="Calibri" w:hAnsi="Calibri"/>
+                <w:b w:val="false"/>
+                <w:bCs w:val="false"/>
+                <w:sz w:val="20"/>
+                <w:szCs w:val="20"/>
+              </w:rPr>
+              <w:t xml:space="preserve">Y</w:t>
+            </w:r>
+          </w:p>
+        </w:tc>
+      </w:tr>
+      <w:tr>
+        <w:tc>
+          <w:tcPr>
+            <w:tcW w:type="dxa" w:w="1500"/>
+            <w:tcBorders>
+              <w:top w:val="single" w:color="808080" w:sz="4"/>
+              <w:left w:val="single" w:color="808080" w:sz="4"/>
+              <w:bottom w:val="single" w:color="808080" w:sz="4"/>
+              <w:right w:val="single" w:color="808080" w:sz="4"/>
+            </w:tcBorders>
+            <w:tcMar>
+              <w:top w:type="dxa" w:w="60"/>
+              <w:left w:type="dxa" w:w="100"/>
+              <w:bottom w:type="dxa" w:w="60"/>
+              <w:right w:type="dxa" w:w="100"/>
+            </w:tcMar>
+          </w:tcPr>
+          <w:p>
+            <w:r>
+              <w:rPr>
+                <w:rFonts w:ascii="Calibri" w:cs="Calibri" w:eastAsia="Calibri" w:hAnsi="Calibri"/>
+                <w:b/>
+                <w:bCs/>
+                <w:sz w:val="20"/>
+                <w:szCs w:val="20"/>
+              </w:rPr>
+              <w:t xml:space="preserve">2</w:t>
+            </w:r>
+          </w:p>
+        </w:tc>
+        <w:tc>
+          <w:tcPr>
+            <w:tcW w:type="dxa" w:w="1881"/>
+            <w:tcBorders>
+              <w:top w:val="single" w:color="808080" w:sz="4"/>
+              <w:left w:val="single" w:color="808080" w:sz="4"/>
+              <w:bottom w:val="single" w:color="808080" w:sz="4"/>
+              <w:right w:val="single" w:color="808080" w:sz="4"/>
+            </w:tcBorders>
+            <w:tcMar>
+              <w:top w:type="dxa" w:w="60"/>
+              <w:left w:type="dxa" w:w="100"/>
+              <w:bottom w:type="dxa" w:w="60"/>
+              <w:right w:type="dxa" w:w="100"/>
+            </w:tcMar>
+          </w:tcPr>
+          <w:p>
+            <w:r>
+              <w:rPr>
+                <w:rFonts w:ascii="Calibri" w:cs="Calibri" w:eastAsia="Calibri" w:hAnsi="Calibri"/>
+                <w:b w:val="false"/>
+                <w:bCs w:val="false"/>
+                <w:sz w:val="20"/>
+                <w:szCs w:val="20"/>
+              </w:rPr>
+              <w:t xml:space="preserve">3</w:t>
+            </w:r>
+          </w:p>
+        </w:tc>
+        <w:tc>
+          <w:tcPr>
+            <w:tcW w:type="dxa" w:w="1881"/>
+            <w:tcBorders>
+              <w:top w:val="single" w:color="808080" w:sz="4"/>
+              <w:left w:val="single" w:color="808080" w:sz="4"/>
+              <w:bottom w:val="single" w:color="808080" w:sz="4"/>
+              <w:right w:val="single" w:color="808080" w:sz="4"/>
+            </w:tcBorders>
+            <w:tcMar>
+              <w:top w:type="dxa" w:w="60"/>
+              <w:left w:type="dxa" w:w="100"/>
+              <w:bottom w:type="dxa" w:w="60"/>
+              <w:right w:type="dxa" w:w="100"/>
+            </w:tcMar>
+          </w:tcPr>
+          <w:p>
+            <w:r>
+              <w:rPr>
+                <w:rFonts w:ascii="Calibri" w:cs="Calibri" w:eastAsia="Calibri" w:hAnsi="Calibri"/>
+                <w:b w:val="false"/>
+                <w:bCs w:val="false"/>
+                <w:sz w:val="20"/>
+                <w:szCs w:val="20"/>
+              </w:rPr>
+              <w:t xml:space="preserve">886</w:t>
+            </w:r>
+          </w:p>
+        </w:tc>
+        <w:tc>
+          <w:tcPr>
+            <w:tcW w:type="dxa" w:w="1881"/>
+            <w:tcBorders>
+              <w:top w:val="single" w:color="808080" w:sz="4"/>
+              <w:left w:val="single" w:color="808080" w:sz="4"/>
+              <w:bottom w:val="single" w:color="808080" w:sz="4"/>
+              <w:right w:val="single" w:color="808080" w:sz="4"/>
+            </w:tcBorders>
+            <w:tcMar>
+              <w:top w:type="dxa" w:w="60"/>
+              <w:left w:type="dxa" w:w="100"/>
+              <w:bottom w:type="dxa" w:w="60"/>
+              <w:right w:type="dxa" w:w="100"/>
+            </w:tcMar>
+          </w:tcPr>
+          <w:p>
+            <w:r>
+              <w:rPr>
+                <w:rFonts w:ascii="Calibri" w:cs="Calibri" w:eastAsia="Calibri" w:hAnsi="Calibri"/>
+                <w:b w:val="false"/>
+                <w:bCs w:val="false"/>
+                <w:sz w:val="20"/>
+                <w:szCs w:val="20"/>
+              </w:rPr>
+              <w:t xml:space="preserve">2, 4, 6</w:t>
+            </w:r>
+          </w:p>
+        </w:tc>
+        <w:tc>
+          <w:tcPr>
+            <w:tcW w:type="dxa" w:w="1883"/>
+            <w:tcBorders>
+              <w:top w:val="single" w:color="808080" w:sz="4"/>
+              <w:left w:val="single" w:color="808080" w:sz="4"/>
+              <w:bottom w:val="single" w:color="808080" w:sz="4"/>
+              <w:right w:val="single" w:color="808080" w:sz="4"/>
+            </w:tcBorders>
+            <w:tcMar>
+              <w:top w:type="dxa" w:w="60"/>
+              <w:left w:type="dxa" w:w="100"/>
+              <w:bottom w:type="dxa" w:w="60"/>
+              <w:right w:type="dxa" w:w="100"/>
+            </w:tcMar>
+          </w:tcPr>
+          <w:p>
+            <w:r>
+              <w:rPr>
+                <w:rFonts w:ascii="Calibri" w:cs="Calibri" w:eastAsia="Calibri" w:hAnsi="Calibri"/>
+                <w:b w:val="false"/>
+                <w:bCs w:val="false"/>
+                <w:sz w:val="20"/>
+                <w:szCs w:val="20"/>
+              </w:rPr>
+              <w:t xml:space="preserve">Y</w:t>
+            </w:r>
+          </w:p>
+        </w:tc>
+      </w:tr>
+      <w:tr>
+        <w:tc>
+          <w:tcPr>
+            <w:tcW w:type="dxa" w:w="1500"/>
+            <w:tcBorders>
+              <w:top w:val="single" w:color="808080" w:sz="4"/>
+              <w:left w:val="single" w:color="808080" w:sz="4"/>
+              <w:bottom w:val="single" w:color="808080" w:sz="4"/>
+              <w:right w:val="single" w:color="808080" w:sz="4"/>
+            </w:tcBorders>
+            <w:tcMar>
+              <w:top w:type="dxa" w:w="60"/>
+              <w:left w:type="dxa" w:w="100"/>
+              <w:bottom w:type="dxa" w:w="60"/>
+              <w:right w:type="dxa" w:w="100"/>
+            </w:tcMar>
+          </w:tcPr>
+          <w:p>
+            <w:r>
+              <w:rPr>
+                <w:rFonts w:ascii="Calibri" w:cs="Calibri" w:eastAsia="Calibri" w:hAnsi="Calibri"/>
+                <w:b/>
+                <w:bCs/>
+                <w:sz w:val="20"/>
+                <w:szCs w:val="20"/>
+              </w:rPr>
+              <w:t xml:space="preserve">4</w:t>
+            </w:r>
+          </w:p>
+        </w:tc>
+        <w:tc>
+          <w:tcPr>
+            <w:tcW w:type="dxa" w:w="1881"/>
+            <w:tcBorders>
+              <w:top w:val="single" w:color="808080" w:sz="4"/>
+              <w:left w:val="single" w:color="808080" w:sz="4"/>
+              <w:bottom w:val="single" w:color="808080" w:sz="4"/>
+              <w:right w:val="single" w:color="808080" w:sz="4"/>
+            </w:tcBorders>
+            <w:tcMar>
+              <w:top w:type="dxa" w:w="60"/>
+              <w:left w:type="dxa" w:w="100"/>
+              <w:bottom w:type="dxa" w:w="60"/>
+              <w:right w:type="dxa" w:w="100"/>
+            </w:tcMar>
+          </w:tcPr>
+          <w:p>
+            <w:r>
+              <w:rPr>
+                <w:rFonts w:ascii="Calibri" w:cs="Calibri" w:eastAsia="Calibri" w:hAnsi="Calibri"/>
+                <w:b w:val="false"/>
+                <w:bCs w:val="false"/>
+                <w:sz w:val="20"/>
+                <w:szCs w:val="20"/>
+              </w:rPr>
+              <w:t xml:space="preserve">4</w:t>
+            </w:r>
+          </w:p>
+        </w:tc>
+        <w:tc>
+          <w:tcPr>
+            <w:tcW w:type="dxa" w:w="1881"/>
+            <w:tcBorders>
+              <w:top w:val="single" w:color="808080" w:sz="4"/>
+              <w:left w:val="single" w:color="808080" w:sz="4"/>
+              <w:bottom w:val="single" w:color="808080" w:sz="4"/>
+              <w:right w:val="single" w:color="808080" w:sz="4"/>
+            </w:tcBorders>
+            <w:tcMar>
+              <w:top w:type="dxa" w:w="60"/>
+              <w:left w:type="dxa" w:w="100"/>
+              <w:bottom w:type="dxa" w:w="60"/>
+              <w:right w:type="dxa" w:w="100"/>
+            </w:tcMar>
+          </w:tcPr>
+          <w:p>
+            <w:r>
+              <w:rPr>
+                <w:rFonts w:ascii="Calibri" w:cs="Calibri" w:eastAsia="Calibri" w:hAnsi="Calibri"/>
+                <w:b w:val="false"/>
+                <w:bCs w:val="false"/>
+                <w:sz w:val="20"/>
+                <w:szCs w:val="20"/>
+              </w:rPr>
+              <w:t xml:space="preserve">451</w:t>
+            </w:r>
+          </w:p>
+        </w:tc>
+        <w:tc>
+          <w:tcPr>
+            <w:tcW w:type="dxa" w:w="1881"/>
+            <w:tcBorders>
+              <w:top w:val="single" w:color="808080" w:sz="4"/>
+              <w:left w:val="single" w:color="808080" w:sz="4"/>
+              <w:bottom w:val="single" w:color="808080" w:sz="4"/>
+              <w:right w:val="single" w:color="808080" w:sz="4"/>
+            </w:tcBorders>
+            <w:tcMar>
+              <w:top w:type="dxa" w:w="60"/>
+              <w:left w:type="dxa" w:w="100"/>
+              <w:bottom w:type="dxa" w:w="60"/>
+              <w:right w:type="dxa" w:w="100"/>
+            </w:tcMar>
+          </w:tcPr>
+          <w:p>
+            <w:r>
+              <w:rPr>
+                <w:rFonts w:ascii="Calibri" w:cs="Calibri" w:eastAsia="Calibri" w:hAnsi="Calibri"/>
+                <w:b w:val="false"/>
+                <w:bCs w:val="false"/>
+                <w:sz w:val="20"/>
+                <w:szCs w:val="20"/>
+              </w:rPr>
+              <w:t xml:space="preserve">2, 4, 6, 7</w:t>
+            </w:r>
+          </w:p>
+        </w:tc>
+        <w:tc>
+          <w:tcPr>
+            <w:tcW w:type="dxa" w:w="1883"/>
+            <w:tcBorders>
+              <w:top w:val="single" w:color="808080" w:sz="4"/>
+              <w:left w:val="single" w:color="808080" w:sz="4"/>
+              <w:bottom w:val="single" w:color="808080" w:sz="4"/>
+              <w:right w:val="single" w:color="808080" w:sz="4"/>
+            </w:tcBorders>
+            <w:tcMar>
+              <w:top w:type="dxa" w:w="60"/>
+              <w:left w:type="dxa" w:w="100"/>
+              <w:bottom w:type="dxa" w:w="60"/>
+              <w:right w:type="dxa" w:w="100"/>
+            </w:tcMar>
+          </w:tcPr>
+          <w:p>
+            <w:r>
+              <w:rPr>
+                <w:rFonts w:ascii="Calibri" w:cs="Calibri" w:eastAsia="Calibri" w:hAnsi="Calibri"/>
+                <w:b w:val="false"/>
+                <w:bCs w:val="false"/>
+                <w:sz w:val="20"/>
+                <w:szCs w:val="20"/>
+              </w:rPr>
+              <w:t xml:space="preserve">N (subset of run 1)</w:t>
+            </w:r>
+          </w:p>
+        </w:tc>
+      </w:tr>
+      <w:tr>
+        <w:tc>
+          <w:tcPr>
+            <w:tcW w:type="dxa" w:w="1500"/>
+            <w:tcBorders>
+              <w:top w:val="single" w:color="808080" w:sz="4"/>
+              <w:left w:val="single" w:color="808080" w:sz="4"/>
+              <w:bottom w:val="single" w:color="808080" w:sz="4"/>
+              <w:right w:val="single" w:color="808080" w:sz="4"/>
+            </w:tcBorders>
+            <w:tcMar>
+              <w:top w:type="dxa" w:w="60"/>
+              <w:left w:type="dxa" w:w="100"/>
+              <w:bottom w:type="dxa" w:w="60"/>
+              <w:right w:type="dxa" w:w="100"/>
+            </w:tcMar>
+          </w:tcPr>
+          <w:p>
+            <w:r>
+              <w:rPr>
+                <w:rFonts w:ascii="Calibri" w:cs="Calibri" w:eastAsia="Calibri" w:hAnsi="Calibri"/>
+                <w:b/>
+                <w:bCs/>
+                <w:sz w:val="20"/>
+                <w:szCs w:val="20"/>
+              </w:rPr>
+              <w:t xml:space="preserve">8</w:t>
+            </w:r>
+          </w:p>
+        </w:tc>
+        <w:tc>
+          <w:tcPr>
+            <w:tcW w:type="dxa" w:w="1881"/>
+            <w:tcBorders>
+              <w:top w:val="single" w:color="808080" w:sz="4"/>
+              <w:left w:val="single" w:color="808080" w:sz="4"/>
+              <w:bottom w:val="single" w:color="808080" w:sz="4"/>
+              <w:right w:val="single" w:color="808080" w:sz="4"/>
+            </w:tcBorders>
+            <w:tcMar>
+              <w:top w:type="dxa" w:w="60"/>
+              <w:left w:type="dxa" w:w="100"/>
+              <w:bottom w:type="dxa" w:w="60"/>
+              <w:right w:type="dxa" w:w="100"/>
+            </w:tcMar>
+          </w:tcPr>
+          <w:p>
+            <w:r>
+              <w:rPr>
+                <w:rFonts w:ascii="Calibri" w:cs="Calibri" w:eastAsia="Calibri" w:hAnsi="Calibri"/>
+                <w:b w:val="false"/>
+                <w:bCs w:val="false"/>
+                <w:sz w:val="20"/>
+                <w:szCs w:val="20"/>
+              </w:rPr>
+              <w:t xml:space="preserve">8</w:t>
+            </w:r>
+          </w:p>
+        </w:tc>
+        <w:tc>
+          <w:tcPr>
+            <w:tcW w:type="dxa" w:w="1881"/>
+            <w:tcBorders>
+              <w:top w:val="single" w:color="808080" w:sz="4"/>
+              <w:left w:val="single" w:color="808080" w:sz="4"/>
+              <w:bottom w:val="single" w:color="808080" w:sz="4"/>
+              <w:right w:val="single" w:color="808080" w:sz="4"/>
+            </w:tcBorders>
+            <w:tcMar>
+              <w:top w:type="dxa" w:w="60"/>
+              <w:left w:type="dxa" w:w="100"/>
+              <w:bottom w:type="dxa" w:w="60"/>
+              <w:right w:type="dxa" w:w="100"/>
+            </w:tcMar>
+          </w:tcPr>
+          <w:p>
+            <w:r>
+              <w:rPr>
+                <w:rFonts w:ascii="Calibri" w:cs="Calibri" w:eastAsia="Calibri" w:hAnsi="Calibri"/>
+                <w:b w:val="false"/>
+                <w:bCs w:val="false"/>
+                <w:sz w:val="20"/>
+                <w:szCs w:val="20"/>
+              </w:rPr>
+              <w:t xml:space="preserve">234</w:t>
+            </w:r>
+          </w:p>
+        </w:tc>
+        <w:tc>
+          <w:tcPr>
+            <w:tcW w:type="dxa" w:w="1881"/>
+            <w:tcBorders>
+              <w:top w:val="single" w:color="808080" w:sz="4"/>
+              <w:left w:val="single" w:color="808080" w:sz="4"/>
+              <w:bottom w:val="single" w:color="808080" w:sz="4"/>
+              <w:right w:val="single" w:color="808080" w:sz="4"/>
+            </w:tcBorders>
+            <w:tcMar>
+              <w:top w:type="dxa" w:w="60"/>
+              <w:left w:type="dxa" w:w="100"/>
+              <w:bottom w:type="dxa" w:w="60"/>
+              <w:right w:type="dxa" w:w="100"/>
+            </w:tcMar>
+          </w:tcPr>
+          <w:p>
+            <w:r>
+              <w:rPr>
+                <w:rFonts w:ascii="Calibri" w:cs="Calibri" w:eastAsia="Calibri" w:hAnsi="Calibri"/>
+                <w:b w:val="false"/>
+                <w:bCs w:val="false"/>
+                <w:sz w:val="20"/>
+                <w:szCs w:val="20"/>
+              </w:rPr>
+              <w:t xml:space="preserve">2, 4, 6, 7, 8, 9, 10, 11</w:t>
+            </w:r>
+          </w:p>
+        </w:tc>
+        <w:tc>
+          <w:tcPr>
+            <w:tcW w:type="dxa" w:w="1883"/>
+            <w:tcBorders>
+              <w:top w:val="single" w:color="808080" w:sz="4"/>
+              <w:left w:val="single" w:color="808080" w:sz="4"/>
+              <w:bottom w:val="single" w:color="808080" w:sz="4"/>
+              <w:right w:val="single" w:color="808080" w:sz="4"/>
+            </w:tcBorders>
+            <w:tcMar>
+              <w:top w:type="dxa" w:w="60"/>
+              <w:left w:type="dxa" w:w="100"/>
+              <w:bottom w:type="dxa" w:w="60"/>
+              <w:right w:type="dxa" w:w="100"/>
+            </w:tcMar>
+          </w:tcPr>
+          <w:p>
+            <w:r>
+              <w:rPr>
+                <w:rFonts w:ascii="Calibri" w:cs="Calibri" w:eastAsia="Calibri" w:hAnsi="Calibri"/>
+                <w:b w:val="false"/>
+                <w:bCs w:val="false"/>
+                <w:sz w:val="20"/>
+                <w:szCs w:val="20"/>
+              </w:rPr>
+              <w:t xml:space="preserve">N (subset of run 1)</w:t>
+            </w:r>
+          </w:p>
+        </w:tc>
+      </w:tr>
+    </w:tbl>
+    <w:p/>
+    <w:p>
+      <w:pPr>
         <w:spacing w:after="120"/>
       </w:pPr>
       <w:r>
@@ -1633,7 +2596,7 @@
           <w:sz w:val="22"/>
           <w:szCs w:val="22"/>
         </w:rPr>
-        <w:t xml:space="preserve">Environment.ProcessorCount (run without an argument): ____</w:t>
+        <w:t xml:space="preserve">Environment.ProcessorCount (run without an argument): 8. Without an argument the program uses a limit equal to ProcessorCount (8): 9 distinct threads, elapsed 226 ms, predicted 200 ms.</w:t>
       </w:r>
     </w:p>
     <w:p>
@@ -1646,7 +2609,7 @@
           <w:sz w:val="22"/>
           <w:szCs w:val="22"/>
         </w:rPr>
-        <w:t xml:space="preserve">Same thread IDs in the second run of each setting? (Y/N): ____</w:t>
+        <w:t xml:space="preserve">Same thread IDs in the second run of each setting? (Y/N): Y for limits 1 and 2; N for limits 4 and 8, where the second run used only a subset of the IDs of the first run (no new IDs appeared).</w:t>
       </w:r>
     </w:p>
     <w:p>
@@ -1699,13 +2662,36 @@
       <w:r>
         <w:rPr>
           <w:rFonts w:ascii="Calibri" w:cs="Calibri" w:eastAsia="Calibri" w:hAnsi="Calibri"/>
-          <w:i/>
-          <w:iCs/>
-          <w:color w:val="7F7F7F"/>
           <w:sz w:val="22"/>
           <w:szCs w:val="22"/>
         </w:rPr>
-        <w:t xml:space="preserve">[ Answer to be added after the runs ]</w:t>
+        <w:t xml:space="preserve">Only with a limit of 1, where one thread printed iterations 0 to 15 in order. With 2, 4 and 8 the lines were interleaved and the order changed between the two runs of the same setting. For example, with a limit of 4 the first run started with 12, 0, 4, 8 and the second with 12, 0, 8, 4, and the same iteration ran on a different thread (iteration 0 on thread 2 in run 1 and on thread 6 in run 2).</w:t>
+      </w:r>
+    </w:p>
+    <w:p>
+      <w:pPr>
+        <w:spacing w:after="120"/>
+      </w:pPr>
+      <w:r>
+        <w:rPr>
+          <w:rFonts w:ascii="Calibri" w:cs="Calibri" w:eastAsia="Calibri" w:hAnsi="Calibri"/>
+          <w:sz w:val="22"/>
+          <w:szCs w:val="22"/>
+        </w:rPr>
+        <w:t xml:space="preserve">The order also shows how Parallel.For splits the work: with a limit of 2, thread 2 took the block 0 to 7 and thread 4 the block 8 to 14 (iteration 15 went to the replacement thread 6, see Question 2), and with 8 each thread started at an even index (0, 2, 4, ... 14). Inside a block the order is fixed, but the blocks run at the same time.</w:t>
+      </w:r>
+    </w:p>
+    <w:p>
+      <w:pPr>
+        <w:spacing w:after="120"/>
+      </w:pPr>
+      <w:r>
+        <w:rPr>
+          <w:rFonts w:ascii="Calibri" w:cs="Calibri" w:eastAsia="Calibri" w:hAnsi="Calibri"/>
+          <w:sz w:val="22"/>
+          <w:szCs w:val="22"/>
+        </w:rPr>
+        <w:t xml:space="preserve">Parallel.For only promises that every iteration runs once. Which thread runs which block, and when, depends on the operating system scheduler and on which threads are free, and Console.WriteLine calls from different threads are printed in whatever order they reach the console. Guaranteeing an order would need synchronization between iterations and would remove most of the parallelism, so the library leaves it to the programmer (like OpenMP, which needs an explicit ordered clause).</w:t>
       </w:r>
     </w:p>
     <w:p>
@@ -1730,13 +2716,36 @@
       <w:r>
         <w:rPr>
           <w:rFonts w:ascii="Calibri" w:cs="Calibri" w:eastAsia="Calibri" w:hAnsi="Calibri"/>
-          <w:i/>
-          <w:iCs/>
-          <w:color w:val="7F7F7F"/>
           <w:sz w:val="22"/>
           <w:szCs w:val="22"/>
         </w:rPr>
-        <w:t xml:space="preserve">[ Answer to be added after the runs ]</w:t>
+        <w:t xml:space="preserve">Limit 1: 1 thread. Limit 2: 3 threads. Limit 4: 6 threads in the first run and 4 in the second. Limit 8: 9 threads in the first run and 8 in the second. So the number of distinct threads can be higher than the limit. The extra threads ran only one iteration each, at the end (for example 6:1 with a limit of 2, and 8:1 and 9:1 with a limit of 4). This happens because a Parallel.For worker gives its thread back to the pool after a while and a replacement worker continues the remaining iterations, possibly on another pool thread. The elapsed times show that no more than the limit ever ran at the same moment (for example 889 ms with a limit of 2, which is what 2 concurrent workers need).</w:t>
+      </w:r>
+    </w:p>
+    <w:p>
+      <w:pPr>
+        <w:spacing w:after="120"/>
+      </w:pPr>
+      <w:r>
+        <w:rPr>
+          <w:rFonts w:ascii="Calibri" w:cs="Calibri" w:eastAsia="Calibri" w:hAnsi="Calibri"/>
+          <w:sz w:val="22"/>
+          <w:szCs w:val="22"/>
+        </w:rPr>
+        <w:t xml:space="preserve">The calling thread (ID 2) took part in every run (calling_thread_participated=YES). Parallel.For does not just wait: the thread that calls it runs one of the workers itself, so with a limit of 1 the whole loop ran on the calling thread.</w:t>
+      </w:r>
+    </w:p>
+    <w:p>
+      <w:pPr>
+        <w:spacing w:after="120"/>
+      </w:pPr>
+      <w:r>
+        <w:rPr>
+          <w:rFonts w:ascii="Calibri" w:cs="Calibri" w:eastAsia="Calibri" w:hAnsi="Calibri"/>
+          <w:sz w:val="22"/>
+          <w:szCs w:val="22"/>
+        </w:rPr>
+        <w:t xml:space="preserve">Fewer threads than the limit can be used when there are fewer iterations or chunks than the limit, when the loop is so short that the workers already running finish everything before new ones start, or when the thread pool has no free thread yet (the pool creates new threads slowly once its minimum is used up). The limit is an upper bound, not a guaranteed team size.</w:t>
       </w:r>
     </w:p>
     <w:p>
@@ -1761,13 +2770,36 @@
       <w:r>
         <w:rPr>
           <w:rFonts w:ascii="Calibri" w:cs="Calibri" w:eastAsia="Calibri" w:hAnsi="Calibri"/>
-          <w:i/>
-          <w:iCs/>
-          <w:color w:val="7F7F7F"/>
           <w:sz w:val="22"/>
           <w:szCs w:val="22"/>
         </w:rPr>
-        <w:t xml:space="preserve">[ Answer to be added after the runs ]</w:t>
+        <w:t xml:space="preserve">Elapsed was always a little above the prediction: 1763 vs 1600 ms (limit 1), 889 vs 800 ms (2), 453 vs 400 ms (4) and 273 vs 200 ms (8). Each step of halving the time was achieved, so the sleeping loop scaled almost perfectly up to 8. The extra time is mostly per iteration: on Windows Thread.Sleep(100) usually lasts about 109 ms because of the 15.6 ms timer tick, and 16 x 109 = about 1750 ms matches the limit-1 result. Thread start-up and printing add a little more, which is why the gap is largest with 8 threads (273 ms), where the pool had to provide 8 threads at once.</w:t>
+      </w:r>
+    </w:p>
+    <w:p>
+      <w:pPr>
+        <w:spacing w:after="120"/>
+      </w:pPr>
+      <w:r>
+        <w:rPr>
+          <w:rFonts w:ascii="Calibri" w:cs="Calibri" w:eastAsia="Calibri" w:hAnsi="Calibri"/>
+          <w:sz w:val="22"/>
+          <w:szCs w:val="22"/>
+        </w:rPr>
+        <w:t xml:space="preserve">This machine has 8 logical processors, so the largest limit tested (8) equals ProcessorCount and the default run without an argument also used 8 (226 ms). For a limit above 8 with sleeping iterations, the time would keep dropping, because a sleeping thread does not use a core, but only as fast as the thread pool adds threads beyond its minimum (it adds them gradually), so the gain would be smaller than predicted.</w:t>
+      </w:r>
+    </w:p>
+    <w:p>
+      <w:pPr>
+        <w:spacing w:after="120"/>
+      </w:pPr>
+      <w:r>
+        <w:rPr>
+          <w:rFonts w:ascii="Calibri" w:cs="Calibri" w:eastAsia="Calibri" w:hAnsi="Calibri"/>
+          <w:sz w:val="22"/>
+          <w:szCs w:val="22"/>
+        </w:rPr>
+        <w:t xml:space="preserve">If the iterations were CPU-bound, the answer would change: at most 8 iterations can really run at once, so a limit above 8 would not reduce the time any further. The extra threads would only take turns on the same cores, adding context-switch overhead.</w:t>
       </w:r>
     </w:p>
     <w:p>
@@ -1792,13 +2824,23 @@
       <w:r>
         <w:rPr>
           <w:rFonts w:ascii="Calibri" w:cs="Calibri" w:eastAsia="Calibri" w:hAnsi="Calibri"/>
-          <w:i/>
-          <w:iCs/>
-          <w:color w:val="7F7F7F"/>
           <w:sz w:val="22"/>
           <w:szCs w:val="22"/>
         </w:rPr>
-        <w:t xml:space="preserve">[ Answer to be added after the runs ]</w:t>
+        <w:t xml:space="preserve">In OpenMP a parallel region creates a team of exactly OMP_NUM_THREADS threads, numbered 0 to N-1 by omp_get_thread_num(), the master thread is always 0, and the same team is normally reused in later regions. Here the IDs are managed thread IDs (2, 4, 6, 7, ...), they are not contiguous and not a rank inside a team, and the threads come from the shared .NET thread pool, which reuses them for any work in the process. The same pool threads appeared again in later settings (2, 4, 6, 7, ...), and the calling thread (2) plays the role of the master thread.</w:t>
+      </w:r>
+    </w:p>
+    <w:p>
+      <w:pPr>
+        <w:spacing w:after="120"/>
+      </w:pPr>
+      <w:r>
+        <w:rPr>
+          <w:rFonts w:ascii="Calibri" w:cs="Calibri" w:eastAsia="Calibri" w:hAnsi="Calibri"/>
+          <w:sz w:val="22"/>
+          <w:szCs w:val="22"/>
+        </w:rPr>
+        <w:t xml:space="preserve">MaxDegreeOfParallelism limits how many workers (iterations) of this one loop may run at the same time. It does not create threads, does not fix which or how many distinct threads are used over the whole loop (we saw 9 distinct threads with a limit of 8), and does not limit other work in the process. It is an upper bound, whereas OMP_NUM_THREADS requests a fixed team size.</w:t>
       </w:r>
     </w:p>
     <w:p>
@@ -2979,7 +4021,18 @@
               <w:right w:type="dxa" w:w="100"/>
             </w:tcMar>
           </w:tcPr>
-          <w:p/>
+          <w:p>
+            <w:r>
+              <w:rPr>
+                <w:rFonts w:ascii="Calibri" w:cs="Calibri" w:eastAsia="Calibri" w:hAnsi="Calibri"/>
+                <w:b w:val="false"/>
+                <w:bCs w:val="false"/>
+                <w:sz w:val="20"/>
+                <w:szCs w:val="20"/>
+              </w:rPr>
+              <w:t xml:space="preserve">230.46</w:t>
+            </w:r>
+          </w:p>
         </w:tc>
         <w:tc>
           <w:tcPr>
@@ -2997,7 +4050,18 @@
               <w:right w:type="dxa" w:w="100"/>
             </w:tcMar>
           </w:tcPr>
-          <w:p/>
+          <w:p>
+            <w:r>
+              <w:rPr>
+                <w:rFonts w:ascii="Calibri" w:cs="Calibri" w:eastAsia="Calibri" w:hAnsi="Calibri"/>
+                <w:b w:val="false"/>
+                <w:bCs w:val="false"/>
+                <w:sz w:val="20"/>
+                <w:szCs w:val="20"/>
+              </w:rPr>
+              <w:t xml:space="preserve">225.70</w:t>
+            </w:r>
+          </w:p>
         </w:tc>
         <w:tc>
           <w:tcPr>
@@ -3015,7 +4079,18 @@
               <w:right w:type="dxa" w:w="100"/>
             </w:tcMar>
           </w:tcPr>
-          <w:p/>
+          <w:p>
+            <w:r>
+              <w:rPr>
+                <w:rFonts w:ascii="Calibri" w:cs="Calibri" w:eastAsia="Calibri" w:hAnsi="Calibri"/>
+                <w:b w:val="false"/>
+                <w:bCs w:val="false"/>
+                <w:sz w:val="20"/>
+                <w:szCs w:val="20"/>
+              </w:rPr>
+              <w:t xml:space="preserve">257.41</w:t>
+            </w:r>
+          </w:p>
         </w:tc>
         <w:tc>
           <w:tcPr>
@@ -3033,7 +4108,18 @@
               <w:right w:type="dxa" w:w="100"/>
             </w:tcMar>
           </w:tcPr>
-          <w:p/>
+          <w:p>
+            <w:r>
+              <w:rPr>
+                <w:rFonts w:ascii="Calibri" w:cs="Calibri" w:eastAsia="Calibri" w:hAnsi="Calibri"/>
+                <w:b w:val="false"/>
+                <w:bCs w:val="false"/>
+                <w:sz w:val="20"/>
+                <w:szCs w:val="20"/>
+              </w:rPr>
+              <w:t xml:space="preserve">237.86</w:t>
+            </w:r>
+          </w:p>
         </w:tc>
         <w:tc>
           <w:tcPr>
@@ -3051,7 +4137,18 @@
               <w:right w:type="dxa" w:w="100"/>
             </w:tcMar>
           </w:tcPr>
-          <w:p/>
+          <w:p>
+            <w:r>
+              <w:rPr>
+                <w:rFonts w:ascii="Calibri" w:cs="Calibri" w:eastAsia="Calibri" w:hAnsi="Calibri"/>
+                <w:b w:val="false"/>
+                <w:bCs w:val="false"/>
+                <w:sz w:val="20"/>
+                <w:szCs w:val="20"/>
+              </w:rPr>
+              <w:t xml:space="preserve">1.00</w:t>
+            </w:r>
+          </w:p>
         </w:tc>
         <w:tc>
           <w:tcPr>
@@ -3069,7 +4166,18 @@
               <w:right w:type="dxa" w:w="100"/>
             </w:tcMar>
           </w:tcPr>
-          <w:p/>
+          <w:p>
+            <w:r>
+              <w:rPr>
+                <w:rFonts w:ascii="Calibri" w:cs="Calibri" w:eastAsia="Calibri" w:hAnsi="Calibri"/>
+                <w:b w:val="false"/>
+                <w:bCs w:val="false"/>
+                <w:sz w:val="20"/>
+                <w:szCs w:val="20"/>
+              </w:rPr>
+              <w:t xml:space="preserve">Y</w:t>
+            </w:r>
+          </w:p>
         </w:tc>
       </w:tr>
       <w:tr>
@@ -3118,7 +4226,18 @@
               <w:right w:type="dxa" w:w="100"/>
             </w:tcMar>
           </w:tcPr>
-          <w:p/>
+          <w:p>
+            <w:r>
+              <w:rPr>
+                <w:rFonts w:ascii="Calibri" w:cs="Calibri" w:eastAsia="Calibri" w:hAnsi="Calibri"/>
+                <w:b w:val="false"/>
+                <w:bCs w:val="false"/>
+                <w:sz w:val="20"/>
+                <w:szCs w:val="20"/>
+              </w:rPr>
+              <w:t xml:space="preserve">218.39</w:t>
+            </w:r>
+          </w:p>
         </w:tc>
         <w:tc>
           <w:tcPr>
@@ -3136,7 +4255,18 @@
               <w:right w:type="dxa" w:w="100"/>
             </w:tcMar>
           </w:tcPr>
-          <w:p/>
+          <w:p>
+            <w:r>
+              <w:rPr>
+                <w:rFonts w:ascii="Calibri" w:cs="Calibri" w:eastAsia="Calibri" w:hAnsi="Calibri"/>
+                <w:b w:val="false"/>
+                <w:bCs w:val="false"/>
+                <w:sz w:val="20"/>
+                <w:szCs w:val="20"/>
+              </w:rPr>
+              <w:t xml:space="preserve">221.89</w:t>
+            </w:r>
+          </w:p>
         </w:tc>
         <w:tc>
           <w:tcPr>
@@ -3154,7 +4284,18 @@
               <w:right w:type="dxa" w:w="100"/>
             </w:tcMar>
           </w:tcPr>
-          <w:p/>
+          <w:p>
+            <w:r>
+              <w:rPr>
+                <w:rFonts w:ascii="Calibri" w:cs="Calibri" w:eastAsia="Calibri" w:hAnsi="Calibri"/>
+                <w:b w:val="false"/>
+                <w:bCs w:val="false"/>
+                <w:sz w:val="20"/>
+                <w:szCs w:val="20"/>
+              </w:rPr>
+              <w:t xml:space="preserve">213.45</w:t>
+            </w:r>
+          </w:p>
         </w:tc>
         <w:tc>
           <w:tcPr>
@@ -3172,7 +4313,18 @@
               <w:right w:type="dxa" w:w="100"/>
             </w:tcMar>
           </w:tcPr>
-          <w:p/>
+          <w:p>
+            <w:r>
+              <w:rPr>
+                <w:rFonts w:ascii="Calibri" w:cs="Calibri" w:eastAsia="Calibri" w:hAnsi="Calibri"/>
+                <w:b w:val="false"/>
+                <w:bCs w:val="false"/>
+                <w:sz w:val="20"/>
+                <w:szCs w:val="20"/>
+              </w:rPr>
+              <w:t xml:space="preserve">217.91</w:t>
+            </w:r>
+          </w:p>
         </w:tc>
         <w:tc>
           <w:tcPr>
@@ -3190,7 +4342,18 @@
               <w:right w:type="dxa" w:w="100"/>
             </w:tcMar>
           </w:tcPr>
-          <w:p/>
+          <w:p>
+            <w:r>
+              <w:rPr>
+                <w:rFonts w:ascii="Calibri" w:cs="Calibri" w:eastAsia="Calibri" w:hAnsi="Calibri"/>
+                <w:b w:val="false"/>
+                <w:bCs w:val="false"/>
+                <w:sz w:val="20"/>
+                <w:szCs w:val="20"/>
+              </w:rPr>
+              <w:t xml:space="preserve">1.09</w:t>
+            </w:r>
+          </w:p>
         </w:tc>
         <w:tc>
           <w:tcPr>
@@ -3208,7 +4371,18 @@
               <w:right w:type="dxa" w:w="100"/>
             </w:tcMar>
           </w:tcPr>
-          <w:p/>
+          <w:p>
+            <w:r>
+              <w:rPr>
+                <w:rFonts w:ascii="Calibri" w:cs="Calibri" w:eastAsia="Calibri" w:hAnsi="Calibri"/>
+                <w:b w:val="false"/>
+                <w:bCs w:val="false"/>
+                <w:sz w:val="20"/>
+                <w:szCs w:val="20"/>
+              </w:rPr>
+              <w:t xml:space="preserve">Y</w:t>
+            </w:r>
+          </w:p>
         </w:tc>
       </w:tr>
       <w:tr>
@@ -3257,7 +4431,18 @@
               <w:right w:type="dxa" w:w="100"/>
             </w:tcMar>
           </w:tcPr>
-          <w:p/>
+          <w:p>
+            <w:r>
+              <w:rPr>
+                <w:rFonts w:ascii="Calibri" w:cs="Calibri" w:eastAsia="Calibri" w:hAnsi="Calibri"/>
+                <w:b w:val="false"/>
+                <w:bCs w:val="false"/>
+                <w:sz w:val="20"/>
+                <w:szCs w:val="20"/>
+              </w:rPr>
+              <w:t xml:space="preserve">207.18</w:t>
+            </w:r>
+          </w:p>
         </w:tc>
         <w:tc>
           <w:tcPr>
@@ -3275,7 +4460,18 @@
               <w:right w:type="dxa" w:w="100"/>
             </w:tcMar>
           </w:tcPr>
-          <w:p/>
+          <w:p>
+            <w:r>
+              <w:rPr>
+                <w:rFonts w:ascii="Calibri" w:cs="Calibri" w:eastAsia="Calibri" w:hAnsi="Calibri"/>
+                <w:b w:val="false"/>
+                <w:bCs w:val="false"/>
+                <w:sz w:val="20"/>
+                <w:szCs w:val="20"/>
+              </w:rPr>
+              <w:t xml:space="preserve">206.78</w:t>
+            </w:r>
+          </w:p>
         </w:tc>
         <w:tc>
           <w:tcPr>
@@ -3293,7 +4489,18 @@
               <w:right w:type="dxa" w:w="100"/>
             </w:tcMar>
           </w:tcPr>
-          <w:p/>
+          <w:p>
+            <w:r>
+              <w:rPr>
+                <w:rFonts w:ascii="Calibri" w:cs="Calibri" w:eastAsia="Calibri" w:hAnsi="Calibri"/>
+                <w:b w:val="false"/>
+                <w:bCs w:val="false"/>
+                <w:sz w:val="20"/>
+                <w:szCs w:val="20"/>
+              </w:rPr>
+              <w:t xml:space="preserve">214.18</w:t>
+            </w:r>
+          </w:p>
         </w:tc>
         <w:tc>
           <w:tcPr>
@@ -3311,7 +4518,18 @@
               <w:right w:type="dxa" w:w="100"/>
             </w:tcMar>
           </w:tcPr>
-          <w:p/>
+          <w:p>
+            <w:r>
+              <w:rPr>
+                <w:rFonts w:ascii="Calibri" w:cs="Calibri" w:eastAsia="Calibri" w:hAnsi="Calibri"/>
+                <w:b w:val="false"/>
+                <w:bCs w:val="false"/>
+                <w:sz w:val="20"/>
+                <w:szCs w:val="20"/>
+              </w:rPr>
+              <w:t xml:space="preserve">209.38</w:t>
+            </w:r>
+          </w:p>
         </w:tc>
         <w:tc>
           <w:tcPr>
@@ -3329,7 +4547,18 @@
               <w:right w:type="dxa" w:w="100"/>
             </w:tcMar>
           </w:tcPr>
-          <w:p/>
+          <w:p>
+            <w:r>
+              <w:rPr>
+                <w:rFonts w:ascii="Calibri" w:cs="Calibri" w:eastAsia="Calibri" w:hAnsi="Calibri"/>
+                <w:b w:val="false"/>
+                <w:bCs w:val="false"/>
+                <w:sz w:val="20"/>
+                <w:szCs w:val="20"/>
+              </w:rPr>
+              <w:t xml:space="preserve">1.14</w:t>
+            </w:r>
+          </w:p>
         </w:tc>
         <w:tc>
           <w:tcPr>
@@ -3347,7 +4576,18 @@
               <w:right w:type="dxa" w:w="100"/>
             </w:tcMar>
           </w:tcPr>
-          <w:p/>
+          <w:p>
+            <w:r>
+              <w:rPr>
+                <w:rFonts w:ascii="Calibri" w:cs="Calibri" w:eastAsia="Calibri" w:hAnsi="Calibri"/>
+                <w:b w:val="false"/>
+                <w:bCs w:val="false"/>
+                <w:sz w:val="20"/>
+                <w:szCs w:val="20"/>
+              </w:rPr>
+              <w:t xml:space="preserve">Y</w:t>
+            </w:r>
+          </w:p>
         </w:tc>
       </w:tr>
       <w:tr>
@@ -3396,7 +4636,18 @@
               <w:right w:type="dxa" w:w="100"/>
             </w:tcMar>
           </w:tcPr>
-          <w:p/>
+          <w:p>
+            <w:r>
+              <w:rPr>
+                <w:rFonts w:ascii="Calibri" w:cs="Calibri" w:eastAsia="Calibri" w:hAnsi="Calibri"/>
+                <w:b w:val="false"/>
+                <w:bCs w:val="false"/>
+                <w:sz w:val="20"/>
+                <w:szCs w:val="20"/>
+              </w:rPr>
+              <w:t xml:space="preserve">217.23</w:t>
+            </w:r>
+          </w:p>
         </w:tc>
         <w:tc>
           <w:tcPr>
@@ -3414,7 +4665,18 @@
               <w:right w:type="dxa" w:w="100"/>
             </w:tcMar>
           </w:tcPr>
-          <w:p/>
+          <w:p>
+            <w:r>
+              <w:rPr>
+                <w:rFonts w:ascii="Calibri" w:cs="Calibri" w:eastAsia="Calibri" w:hAnsi="Calibri"/>
+                <w:b w:val="false"/>
+                <w:bCs w:val="false"/>
+                <w:sz w:val="20"/>
+                <w:szCs w:val="20"/>
+              </w:rPr>
+              <w:t xml:space="preserve">210.08</w:t>
+            </w:r>
+          </w:p>
         </w:tc>
         <w:tc>
           <w:tcPr>
@@ -3432,7 +4694,18 @@
               <w:right w:type="dxa" w:w="100"/>
             </w:tcMar>
           </w:tcPr>
-          <w:p/>
+          <w:p>
+            <w:r>
+              <w:rPr>
+                <w:rFonts w:ascii="Calibri" w:cs="Calibri" w:eastAsia="Calibri" w:hAnsi="Calibri"/>
+                <w:b w:val="false"/>
+                <w:bCs w:val="false"/>
+                <w:sz w:val="20"/>
+                <w:szCs w:val="20"/>
+              </w:rPr>
+              <w:t xml:space="preserve">213.23</w:t>
+            </w:r>
+          </w:p>
         </w:tc>
         <w:tc>
           <w:tcPr>
@@ -3450,7 +4723,18 @@
               <w:right w:type="dxa" w:w="100"/>
             </w:tcMar>
           </w:tcPr>
-          <w:p/>
+          <w:p>
+            <w:r>
+              <w:rPr>
+                <w:rFonts w:ascii="Calibri" w:cs="Calibri" w:eastAsia="Calibri" w:hAnsi="Calibri"/>
+                <w:b w:val="false"/>
+                <w:bCs w:val="false"/>
+                <w:sz w:val="20"/>
+                <w:szCs w:val="20"/>
+              </w:rPr>
+              <w:t xml:space="preserve">213.51</w:t>
+            </w:r>
+          </w:p>
         </w:tc>
         <w:tc>
           <w:tcPr>
@@ -3468,7 +4752,18 @@
               <w:right w:type="dxa" w:w="100"/>
             </w:tcMar>
           </w:tcPr>
-          <w:p/>
+          <w:p>
+            <w:r>
+              <w:rPr>
+                <w:rFonts w:ascii="Calibri" w:cs="Calibri" w:eastAsia="Calibri" w:hAnsi="Calibri"/>
+                <w:b w:val="false"/>
+                <w:bCs w:val="false"/>
+                <w:sz w:val="20"/>
+                <w:szCs w:val="20"/>
+              </w:rPr>
+              <w:t xml:space="preserve">1.11</w:t>
+            </w:r>
+          </w:p>
         </w:tc>
         <w:tc>
           <w:tcPr>
@@ -3486,7 +4781,18 @@
               <w:right w:type="dxa" w:w="100"/>
             </w:tcMar>
           </w:tcPr>
-          <w:p/>
+          <w:p>
+            <w:r>
+              <w:rPr>
+                <w:rFonts w:ascii="Calibri" w:cs="Calibri" w:eastAsia="Calibri" w:hAnsi="Calibri"/>
+                <w:b w:val="false"/>
+                <w:bCs w:val="false"/>
+                <w:sz w:val="20"/>
+                <w:szCs w:val="20"/>
+              </w:rPr>
+              <w:t xml:space="preserve">Y</w:t>
+            </w:r>
+          </w:p>
         </w:tc>
       </w:tr>
     </w:tbl>
@@ -3501,7 +4807,7 @@
           <w:sz w:val="22"/>
           <w:szCs w:val="22"/>
         </w:rPr>
-        <w:t xml:space="preserve">Speedup = average time with a limit of 1 / average time with the given limit.</w:t>
+        <w:t xml:space="preserve">Speedup = average time with a limit of 1 / average time with the given limit. Every run printed correct=YES.</w:t>
       </w:r>
     </w:p>
     <w:p>
@@ -3542,7 +4848,7 @@
           <w:sz w:val="22"/>
           <w:szCs w:val="22"/>
         </w:rPr>
-        <w:t xml:space="preserve">Inside VecAdd() a local int n = N; was declared and used inside the static lambda body instead of N. The build failed with the following compiler error, and the change was then undone:</w:t>
+        <w:t xml:space="preserve">Inside VecAdd() a local int n = N; was declared and the loop condition inside the static lambda was changed to i &lt; n. The build failed with the following compiler error, and the change was then undone (the build succeeded again):</w:t>
       </w:r>
     </w:p>
     <w:p>
@@ -3552,10 +4858,12 @@
       <w:r>
         <w:rPr>
           <w:rFonts w:ascii="Calibri" w:cs="Calibri" w:eastAsia="Calibri" w:hAnsi="Calibri"/>
+          <w:b/>
+          <w:bCs/>
           <w:sz w:val="22"/>
           <w:szCs w:val="22"/>
         </w:rPr>
-        <w:t xml:space="preserve">____</w:t>
+        <w:t xml:space="preserve">Program.cs(51,43): error CS8820: A static anonymous function cannot contain a reference to 'n'.</w:t>
       </w:r>
     </w:p>
     <w:p>
@@ -3608,13 +4916,23 @@
       <w:r>
         <w:rPr>
           <w:rFonts w:ascii="Calibri" w:cs="Calibri" w:eastAsia="Calibri" w:hAnsi="Calibri"/>
-          <w:i/>
-          <w:iCs/>
-          <w:color w:val="7F7F7F"/>
           <w:sz w:val="22"/>
           <w:szCs w:val="22"/>
         </w:rPr>
-        <w:t xml:space="preserve">[ Answer to be added after the runs ]</w:t>
+        <w:t xml:space="preserve">i is declared inside the lambda body (in the for statement), so every call of the lambda, that is every chunk, gets its own i on its own thread's stack. No other thread can see or change it, which is exactly what private(i) means in OpenMP.</w:t>
+      </w:r>
+    </w:p>
+    <w:p>
+      <w:pPr>
+        <w:spacing w:after="120"/>
+      </w:pPr>
+      <w:r>
+        <w:rPr>
+          <w:rFonts w:ascii="Calibri" w:cs="Calibri" w:eastAsia="Calibri" w:hAnsi="Calibri"/>
+          <w:sz w:val="22"/>
+          <w:szCs w:val="22"/>
+        </w:rPr>
+        <w:t xml:space="preserve">A variable declared outside the lambda is captured: the compiler moves it into one shared closure object on the heap, and all threads read and write that same copy. Written inside a parallel lambda, it becomes a data race: one thread can overwrite the value another thread has just stored and is about to use. Task 3 shows this bug.</w:t>
       </w:r>
     </w:p>
     <w:p>
@@ -3639,13 +4957,23 @@
       <w:r>
         <w:rPr>
           <w:rFonts w:ascii="Calibri" w:cs="Calibri" w:eastAsia="Calibri" w:hAnsi="Calibri"/>
-          <w:i/>
-          <w:iCs/>
-          <w:color w:val="7F7F7F"/>
           <w:sz w:val="22"/>
           <w:szCs w:val="22"/>
         </w:rPr>
-        <w:t xml:space="preserve">[ Answer to be added after the runs ]</w:t>
+        <w:t xml:space="preserve">A static lambda may not capture anything from the method around it: no locals, no parameters and no this. So the arrays a, b, c and the size N had to be static members of the VecMath class, and the only per-call data the lambda gets is its parameter range. When a local n was used inside it, the build failed with error CS8820: "A static anonymous function cannot contain a reference to 'n'."</w:t>
+      </w:r>
+    </w:p>
+    <w:p>
+      <w:pPr>
+        <w:spacing w:after="120"/>
+      </w:pPr>
+      <w:r>
+        <w:rPr>
+          <w:rFonts w:ascii="Calibri" w:cs="Calibri" w:eastAsia="Calibri" w:hAnsi="Calibri"/>
+          <w:sz w:val="22"/>
+          <w:szCs w:val="22"/>
+        </w:rPr>
+        <w:t xml:space="preserve">In a large program it is easy to use an outer variable inside a parallel lambda by accident and create a shared variable without noticing. With static the compiler checks this for you: every variable the lambda uses is either its own (private) or a clearly shared static member, so the data scoping is visible and checked, much like default(none) in OpenMP. It also avoids allocating a closure object on every call.</w:t>
       </w:r>
     </w:p>
     <w:p>
@@ -3670,13 +4998,23 @@
       <w:r>
         <w:rPr>
           <w:rFonts w:ascii="Calibri" w:cs="Calibri" w:eastAsia="Calibri" w:hAnsi="Calibri"/>
-          <w:i/>
-          <w:iCs/>
-          <w:color w:val="7F7F7F"/>
           <w:sz w:val="22"/>
           <w:szCs w:val="22"/>
         </w:rPr>
-        <w:t xml:space="preserve">[ Answer to be added after the runs ]</w:t>
+        <w:t xml:space="preserve">The speedup was very small: 1.09 with 2 threads, 1.14 with 4 and 1.11 with 8 (237.86, 217.91, 209.38 and 213.51 ms). Going from 4 to 8 threads made it slightly slower.</w:t>
+      </w:r>
+    </w:p>
+    <w:p>
+      <w:pPr>
+        <w:spacing w:after="120"/>
+      </w:pPr>
+      <w:r>
+        <w:rPr>
+          <w:rFonts w:ascii="Calibri" w:cs="Calibri" w:eastAsia="Calibri" w:hAnsi="Calibri"/>
+          <w:sz w:val="22"/>
+          <w:szCs w:val="22"/>
+        </w:rPr>
+        <w:t xml:space="preserve">Vector addition is memory-bound. Each element needs one addition but 24 bytes of memory traffic (read a[i] and b[i], write c[i]). One pass moves 5,000,000 x 24 bytes = 120 MB, so 20 passes move 2.4 GB. One thread already reaches about 10 GB/s (2.4 GB in 0.238 s) and 4 threads about 11.5 GB/s, which is close to what the memory system of the machine can deliver. Once the memory bus is saturated, more threads cannot fetch data any faster; they only wait for memory together, and the extra scheduling costs time. That is why the speedup stops at about 1.1x.</w:t>
       </w:r>
     </w:p>
     <w:p>
@@ -3701,13 +5039,23 @@
       <w:r>
         <w:rPr>
           <w:rFonts w:ascii="Calibri" w:cs="Calibri" w:eastAsia="Calibri" w:hAnsi="Calibri"/>
-          <w:i/>
-          <w:iCs/>
-          <w:color w:val="7F7F7F"/>
           <w:sz w:val="22"/>
           <w:szCs w:val="22"/>
         </w:rPr>
-        <w:t xml:space="preserve">[ Answer to be added after the runs ]</w:t>
+        <w:t xml:space="preserve">The chunks from Partitioner.Create(0, N) do not overlap, so each c[i] is written by exactly one thread, and a and b are only read. No element is written by two threads or written by one while another reads it, so there is no data race and nothing to lock. correct=YES was printed in all 12 runs.</w:t>
+      </w:r>
+    </w:p>
+    <w:p>
+      <w:pPr>
+        <w:spacing w:after="120"/>
+      </w:pPr>
+      <w:r>
+        <w:rPr>
+          <w:rFonts w:ascii="Calibri" w:cs="Calibri" w:eastAsia="Calibri" w:hAnsi="Calibri"/>
+          <w:sz w:val="22"/>
+          <w:szCs w:val="22"/>
+        </w:rPr>
+        <w:t xml:space="preserve">Parallel.ForEach does not return until every chunk has finished: there is an implicit barrier at the end of the call, like the barrier at the end of an OpenMP parallel for. This barrier also makes all the writes to c visible to the calling thread, so the next pass and Verify() always see the complete result.</w:t>
       </w:r>
     </w:p>
     <w:p>
@@ -3732,13 +5080,10 @@
       <w:r>
         <w:rPr>
           <w:rFonts w:ascii="Calibri" w:cs="Calibri" w:eastAsia="Calibri" w:hAnsi="Calibri"/>
-          <w:i/>
-          <w:iCs/>
-          <w:color w:val="7F7F7F"/>
           <w:sz w:val="22"/>
           <w:szCs w:val="22"/>
         </w:rPr>
-        <w:t xml:space="preserve">[ Answer to be added after the runs ]</w:t>
+        <w:t xml:space="preserve">The work per element is one addition, which takes about a nanosecond. Parallel.For with a delegate per element would call the delegate 5,000,000 times per pass and handle shared loop state for each index, so the overhead would be much larger than the work itself. Partitioner.Create(0, N) splits the range into a small number of large chunks, so the delegate is called once per chunk, and inside it a plain for loop runs over thousands of elements with no overhead. This gives the same result with much less overhead, similar to giving each OpenMP thread a large static block of the loop.</w:t>
       </w:r>
     </w:p>
     <w:p>
@@ -5232,7 +6577,18 @@
               <w:right w:type="dxa" w:w="100"/>
             </w:tcMar>
           </w:tcPr>
-          <w:p/>
+          <w:p>
+            <w:r>
+              <w:rPr>
+                <w:rFonts w:ascii="Calibri" w:cs="Calibri" w:eastAsia="Calibri" w:hAnsi="Calibri"/>
+                <w:b w:val="false"/>
+                <w:bCs w:val="false"/>
+                <w:sz w:val="20"/>
+                <w:szCs w:val="20"/>
+              </w:rPr>
+              <w:t xml:space="preserve">199,888</w:t>
+            </w:r>
+          </w:p>
         </w:tc>
         <w:tc>
           <w:tcPr>
@@ -5250,7 +6606,18 @@
               <w:right w:type="dxa" w:w="100"/>
             </w:tcMar>
           </w:tcPr>
-          <w:p/>
+          <w:p>
+            <w:r>
+              <w:rPr>
+                <w:rFonts w:ascii="Calibri" w:cs="Calibri" w:eastAsia="Calibri" w:hAnsi="Calibri"/>
+                <w:b w:val="false"/>
+                <w:bCs w:val="false"/>
+                <w:sz w:val="20"/>
+                <w:szCs w:val="20"/>
+              </w:rPr>
+              <w:t xml:space="preserve">0</w:t>
+            </w:r>
+          </w:p>
         </w:tc>
         <w:tc>
           <w:tcPr>
@@ -5268,7 +6635,18 @@
               <w:right w:type="dxa" w:w="100"/>
             </w:tcMar>
           </w:tcPr>
-          <w:p/>
+          <w:p>
+            <w:r>
+              <w:rPr>
+                <w:rFonts w:ascii="Calibri" w:cs="Calibri" w:eastAsia="Calibri" w:hAnsi="Calibri"/>
+                <w:b w:val="false"/>
+                <w:bCs w:val="false"/>
+                <w:sz w:val="20"/>
+                <w:szCs w:val="20"/>
+              </w:rPr>
+              <w:t xml:space="preserve">pending</w:t>
+            </w:r>
+          </w:p>
         </w:tc>
       </w:tr>
       <w:tr>
@@ -5317,7 +6695,18 @@
               <w:right w:type="dxa" w:w="100"/>
             </w:tcMar>
           </w:tcPr>
-          <w:p/>
+          <w:p>
+            <w:r>
+              <w:rPr>
+                <w:rFonts w:ascii="Calibri" w:cs="Calibri" w:eastAsia="Calibri" w:hAnsi="Calibri"/>
+                <w:b w:val="false"/>
+                <w:bCs w:val="false"/>
+                <w:sz w:val="20"/>
+                <w:szCs w:val="20"/>
+              </w:rPr>
+              <w:t xml:space="preserve">199,579</w:t>
+            </w:r>
+          </w:p>
         </w:tc>
         <w:tc>
           <w:tcPr>
@@ -5335,7 +6724,18 @@
               <w:right w:type="dxa" w:w="100"/>
             </w:tcMar>
           </w:tcPr>
-          <w:p/>
+          <w:p>
+            <w:r>
+              <w:rPr>
+                <w:rFonts w:ascii="Calibri" w:cs="Calibri" w:eastAsia="Calibri" w:hAnsi="Calibri"/>
+                <w:b w:val="false"/>
+                <w:bCs w:val="false"/>
+                <w:sz w:val="20"/>
+                <w:szCs w:val="20"/>
+              </w:rPr>
+              <w:t xml:space="preserve">0</w:t>
+            </w:r>
+          </w:p>
         </w:tc>
         <w:tc>
           <w:tcPr>
@@ -5353,7 +6753,18 @@
               <w:right w:type="dxa" w:w="100"/>
             </w:tcMar>
           </w:tcPr>
-          <w:p/>
+          <w:p>
+            <w:r>
+              <w:rPr>
+                <w:rFonts w:ascii="Calibri" w:cs="Calibri" w:eastAsia="Calibri" w:hAnsi="Calibri"/>
+                <w:b w:val="false"/>
+                <w:bCs w:val="false"/>
+                <w:sz w:val="20"/>
+                <w:szCs w:val="20"/>
+              </w:rPr>
+              <w:t xml:space="preserve">pending</w:t>
+            </w:r>
+          </w:p>
         </w:tc>
       </w:tr>
       <w:tr>
@@ -5402,7 +6813,18 @@
               <w:right w:type="dxa" w:w="100"/>
             </w:tcMar>
           </w:tcPr>
-          <w:p/>
+          <w:p>
+            <w:r>
+              <w:rPr>
+                <w:rFonts w:ascii="Calibri" w:cs="Calibri" w:eastAsia="Calibri" w:hAnsi="Calibri"/>
+                <w:b w:val="false"/>
+                <w:bCs w:val="false"/>
+                <w:sz w:val="20"/>
+                <w:szCs w:val="20"/>
+              </w:rPr>
+              <w:t xml:space="preserve">199,889</w:t>
+            </w:r>
+          </w:p>
         </w:tc>
         <w:tc>
           <w:tcPr>
@@ -5420,7 +6842,18 @@
               <w:right w:type="dxa" w:w="100"/>
             </w:tcMar>
           </w:tcPr>
-          <w:p/>
+          <w:p>
+            <w:r>
+              <w:rPr>
+                <w:rFonts w:ascii="Calibri" w:cs="Calibri" w:eastAsia="Calibri" w:hAnsi="Calibri"/>
+                <w:b w:val="false"/>
+                <w:bCs w:val="false"/>
+                <w:sz w:val="20"/>
+                <w:szCs w:val="20"/>
+              </w:rPr>
+              <w:t xml:space="preserve">0</w:t>
+            </w:r>
+          </w:p>
         </w:tc>
         <w:tc>
           <w:tcPr>
@@ -5438,7 +6871,18 @@
               <w:right w:type="dxa" w:w="100"/>
             </w:tcMar>
           </w:tcPr>
-          <w:p/>
+          <w:p>
+            <w:r>
+              <w:rPr>
+                <w:rFonts w:ascii="Calibri" w:cs="Calibri" w:eastAsia="Calibri" w:hAnsi="Calibri"/>
+                <w:b w:val="false"/>
+                <w:bCs w:val="false"/>
+                <w:sz w:val="20"/>
+                <w:szCs w:val="20"/>
+              </w:rPr>
+              <w:t xml:space="preserve">pending</w:t>
+            </w:r>
+          </w:p>
         </w:tc>
       </w:tr>
       <w:tr>
@@ -5487,7 +6931,18 @@
               <w:right w:type="dxa" w:w="100"/>
             </w:tcMar>
           </w:tcPr>
-          <w:p/>
+          <w:p>
+            <w:r>
+              <w:rPr>
+                <w:rFonts w:ascii="Calibri" w:cs="Calibri" w:eastAsia="Calibri" w:hAnsi="Calibri"/>
+                <w:b w:val="false"/>
+                <w:bCs w:val="false"/>
+                <w:sz w:val="20"/>
+                <w:szCs w:val="20"/>
+              </w:rPr>
+              <w:t xml:space="preserve">199,805</w:t>
+            </w:r>
+          </w:p>
         </w:tc>
         <w:tc>
           <w:tcPr>
@@ -5505,7 +6960,18 @@
               <w:right w:type="dxa" w:w="100"/>
             </w:tcMar>
           </w:tcPr>
-          <w:p/>
+          <w:p>
+            <w:r>
+              <w:rPr>
+                <w:rFonts w:ascii="Calibri" w:cs="Calibri" w:eastAsia="Calibri" w:hAnsi="Calibri"/>
+                <w:b w:val="false"/>
+                <w:bCs w:val="false"/>
+                <w:sz w:val="20"/>
+                <w:szCs w:val="20"/>
+              </w:rPr>
+              <w:t xml:space="preserve">0</w:t>
+            </w:r>
+          </w:p>
         </w:tc>
         <w:tc>
           <w:tcPr>
@@ -5523,7 +6989,18 @@
               <w:right w:type="dxa" w:w="100"/>
             </w:tcMar>
           </w:tcPr>
-          <w:p/>
+          <w:p>
+            <w:r>
+              <w:rPr>
+                <w:rFonts w:ascii="Calibri" w:cs="Calibri" w:eastAsia="Calibri" w:hAnsi="Calibri"/>
+                <w:b w:val="false"/>
+                <w:bCs w:val="false"/>
+                <w:sz w:val="20"/>
+                <w:szCs w:val="20"/>
+              </w:rPr>
+              <w:t xml:space="preserve">pending</w:t>
+            </w:r>
+          </w:p>
         </w:tc>
       </w:tr>
       <w:tr>
@@ -5572,7 +7049,18 @@
               <w:right w:type="dxa" w:w="100"/>
             </w:tcMar>
           </w:tcPr>
-          <w:p/>
+          <w:p>
+            <w:r>
+              <w:rPr>
+                <w:rFonts w:ascii="Calibri" w:cs="Calibri" w:eastAsia="Calibri" w:hAnsi="Calibri"/>
+                <w:b w:val="false"/>
+                <w:bCs w:val="false"/>
+                <w:sz w:val="20"/>
+                <w:szCs w:val="20"/>
+              </w:rPr>
+              <w:t xml:space="preserve">199,863</w:t>
+            </w:r>
+          </w:p>
         </w:tc>
         <w:tc>
           <w:tcPr>
@@ -5590,7 +7078,18 @@
               <w:right w:type="dxa" w:w="100"/>
             </w:tcMar>
           </w:tcPr>
-          <w:p/>
+          <w:p>
+            <w:r>
+              <w:rPr>
+                <w:rFonts w:ascii="Calibri" w:cs="Calibri" w:eastAsia="Calibri" w:hAnsi="Calibri"/>
+                <w:b w:val="false"/>
+                <w:bCs w:val="false"/>
+                <w:sz w:val="20"/>
+                <w:szCs w:val="20"/>
+              </w:rPr>
+              <w:t xml:space="preserve">0</w:t>
+            </w:r>
+          </w:p>
         </w:tc>
         <w:tc>
           <w:tcPr>
@@ -5608,7 +7107,18 @@
               <w:right w:type="dxa" w:w="100"/>
             </w:tcMar>
           </w:tcPr>
-          <w:p/>
+          <w:p>
+            <w:r>
+              <w:rPr>
+                <w:rFonts w:ascii="Calibri" w:cs="Calibri" w:eastAsia="Calibri" w:hAnsi="Calibri"/>
+                <w:b w:val="false"/>
+                <w:bCs w:val="false"/>
+                <w:sz w:val="20"/>
+                <w:szCs w:val="20"/>
+              </w:rPr>
+              <w:t xml:space="preserve">pending</w:t>
+            </w:r>
+          </w:p>
         </w:tc>
       </w:tr>
       <w:tr>
@@ -5657,7 +7167,18 @@
               <w:right w:type="dxa" w:w="100"/>
             </w:tcMar>
           </w:tcPr>
-          <w:p/>
+          <w:p>
+            <w:r>
+              <w:rPr>
+                <w:rFonts w:ascii="Calibri" w:cs="Calibri" w:eastAsia="Calibri" w:hAnsi="Calibri"/>
+                <w:b w:val="false"/>
+                <w:bCs w:val="false"/>
+                <w:sz w:val="20"/>
+                <w:szCs w:val="20"/>
+              </w:rPr>
+              <w:t xml:space="preserve">199,782</w:t>
+            </w:r>
+          </w:p>
         </w:tc>
         <w:tc>
           <w:tcPr>
@@ -5675,7 +7196,18 @@
               <w:right w:type="dxa" w:w="100"/>
             </w:tcMar>
           </w:tcPr>
-          <w:p/>
+          <w:p>
+            <w:r>
+              <w:rPr>
+                <w:rFonts w:ascii="Calibri" w:cs="Calibri" w:eastAsia="Calibri" w:hAnsi="Calibri"/>
+                <w:b w:val="false"/>
+                <w:bCs w:val="false"/>
+                <w:sz w:val="20"/>
+                <w:szCs w:val="20"/>
+              </w:rPr>
+              <w:t xml:space="preserve">0</w:t>
+            </w:r>
+          </w:p>
         </w:tc>
         <w:tc>
           <w:tcPr>
@@ -5693,7 +7225,18 @@
               <w:right w:type="dxa" w:w="100"/>
             </w:tcMar>
           </w:tcPr>
-          <w:p/>
+          <w:p>
+            <w:r>
+              <w:rPr>
+                <w:rFonts w:ascii="Calibri" w:cs="Calibri" w:eastAsia="Calibri" w:hAnsi="Calibri"/>
+                <w:b w:val="false"/>
+                <w:bCs w:val="false"/>
+                <w:sz w:val="20"/>
+                <w:szCs w:val="20"/>
+              </w:rPr>
+              <w:t xml:space="preserve">pending</w:t>
+            </w:r>
+          </w:p>
         </w:tc>
       </w:tr>
       <w:tr>
@@ -5742,7 +7285,18 @@
               <w:right w:type="dxa" w:w="100"/>
             </w:tcMar>
           </w:tcPr>
-          <w:p/>
+          <w:p>
+            <w:r>
+              <w:rPr>
+                <w:rFonts w:ascii="Calibri" w:cs="Calibri" w:eastAsia="Calibri" w:hAnsi="Calibri"/>
+                <w:b w:val="false"/>
+                <w:bCs w:val="false"/>
+                <w:sz w:val="20"/>
+                <w:szCs w:val="20"/>
+              </w:rPr>
+              <w:t xml:space="preserve">199,923</w:t>
+            </w:r>
+          </w:p>
         </w:tc>
         <w:tc>
           <w:tcPr>
@@ -5760,7 +7314,18 @@
               <w:right w:type="dxa" w:w="100"/>
             </w:tcMar>
           </w:tcPr>
-          <w:p/>
+          <w:p>
+            <w:r>
+              <w:rPr>
+                <w:rFonts w:ascii="Calibri" w:cs="Calibri" w:eastAsia="Calibri" w:hAnsi="Calibri"/>
+                <w:b w:val="false"/>
+                <w:bCs w:val="false"/>
+                <w:sz w:val="20"/>
+                <w:szCs w:val="20"/>
+              </w:rPr>
+              <w:t xml:space="preserve">0</w:t>
+            </w:r>
+          </w:p>
         </w:tc>
         <w:tc>
           <w:tcPr>
@@ -5778,7 +7343,18 @@
               <w:right w:type="dxa" w:w="100"/>
             </w:tcMar>
           </w:tcPr>
-          <w:p/>
+          <w:p>
+            <w:r>
+              <w:rPr>
+                <w:rFonts w:ascii="Calibri" w:cs="Calibri" w:eastAsia="Calibri" w:hAnsi="Calibri"/>
+                <w:b w:val="false"/>
+                <w:bCs w:val="false"/>
+                <w:sz w:val="20"/>
+                <w:szCs w:val="20"/>
+              </w:rPr>
+              <w:t xml:space="preserve">pending</w:t>
+            </w:r>
+          </w:p>
         </w:tc>
       </w:tr>
       <w:tr>
@@ -5827,7 +7403,18 @@
               <w:right w:type="dxa" w:w="100"/>
             </w:tcMar>
           </w:tcPr>
-          <w:p/>
+          <w:p>
+            <w:r>
+              <w:rPr>
+                <w:rFonts w:ascii="Calibri" w:cs="Calibri" w:eastAsia="Calibri" w:hAnsi="Calibri"/>
+                <w:b w:val="false"/>
+                <w:bCs w:val="false"/>
+                <w:sz w:val="20"/>
+                <w:szCs w:val="20"/>
+              </w:rPr>
+              <w:t xml:space="preserve">199,856</w:t>
+            </w:r>
+          </w:p>
         </w:tc>
         <w:tc>
           <w:tcPr>
@@ -5845,7 +7432,18 @@
               <w:right w:type="dxa" w:w="100"/>
             </w:tcMar>
           </w:tcPr>
-          <w:p/>
+          <w:p>
+            <w:r>
+              <w:rPr>
+                <w:rFonts w:ascii="Calibri" w:cs="Calibri" w:eastAsia="Calibri" w:hAnsi="Calibri"/>
+                <w:b w:val="false"/>
+                <w:bCs w:val="false"/>
+                <w:sz w:val="20"/>
+                <w:szCs w:val="20"/>
+              </w:rPr>
+              <w:t xml:space="preserve">0</w:t>
+            </w:r>
+          </w:p>
         </w:tc>
         <w:tc>
           <w:tcPr>
@@ -5863,7 +7461,18 @@
               <w:right w:type="dxa" w:w="100"/>
             </w:tcMar>
           </w:tcPr>
-          <w:p/>
+          <w:p>
+            <w:r>
+              <w:rPr>
+                <w:rFonts w:ascii="Calibri" w:cs="Calibri" w:eastAsia="Calibri" w:hAnsi="Calibri"/>
+                <w:b w:val="false"/>
+                <w:bCs w:val="false"/>
+                <w:sz w:val="20"/>
+                <w:szCs w:val="20"/>
+              </w:rPr>
+              <w:t xml:space="preserve">pending</w:t>
+            </w:r>
+          </w:p>
         </w:tc>
       </w:tr>
       <w:tr>
@@ -5912,7 +7521,18 @@
               <w:right w:type="dxa" w:w="100"/>
             </w:tcMar>
           </w:tcPr>
-          <w:p/>
+          <w:p>
+            <w:r>
+              <w:rPr>
+                <w:rFonts w:ascii="Calibri" w:cs="Calibri" w:eastAsia="Calibri" w:hAnsi="Calibri"/>
+                <w:b w:val="false"/>
+                <w:bCs w:val="false"/>
+                <w:sz w:val="20"/>
+                <w:szCs w:val="20"/>
+              </w:rPr>
+              <w:t xml:space="preserve">199,848</w:t>
+            </w:r>
+          </w:p>
         </w:tc>
         <w:tc>
           <w:tcPr>
@@ -5930,7 +7550,18 @@
               <w:right w:type="dxa" w:w="100"/>
             </w:tcMar>
           </w:tcPr>
-          <w:p/>
+          <w:p>
+            <w:r>
+              <w:rPr>
+                <w:rFonts w:ascii="Calibri" w:cs="Calibri" w:eastAsia="Calibri" w:hAnsi="Calibri"/>
+                <w:b w:val="false"/>
+                <w:bCs w:val="false"/>
+                <w:sz w:val="20"/>
+                <w:szCs w:val="20"/>
+              </w:rPr>
+              <w:t xml:space="preserve">0</w:t>
+            </w:r>
+          </w:p>
         </w:tc>
         <w:tc>
           <w:tcPr>
@@ -5948,7 +7579,18 @@
               <w:right w:type="dxa" w:w="100"/>
             </w:tcMar>
           </w:tcPr>
-          <w:p/>
+          <w:p>
+            <w:r>
+              <w:rPr>
+                <w:rFonts w:ascii="Calibri" w:cs="Calibri" w:eastAsia="Calibri" w:hAnsi="Calibri"/>
+                <w:b w:val="false"/>
+                <w:bCs w:val="false"/>
+                <w:sz w:val="20"/>
+                <w:szCs w:val="20"/>
+              </w:rPr>
+              <w:t xml:space="preserve">pending</w:t>
+            </w:r>
+          </w:p>
         </w:tc>
       </w:tr>
       <w:tr>
@@ -5997,7 +7639,18 @@
               <w:right w:type="dxa" w:w="100"/>
             </w:tcMar>
           </w:tcPr>
-          <w:p/>
+          <w:p>
+            <w:r>
+              <w:rPr>
+                <w:rFonts w:ascii="Calibri" w:cs="Calibri" w:eastAsia="Calibri" w:hAnsi="Calibri"/>
+                <w:b w:val="false"/>
+                <w:bCs w:val="false"/>
+                <w:sz w:val="20"/>
+                <w:szCs w:val="20"/>
+              </w:rPr>
+              <w:t xml:space="preserve">199,844</w:t>
+            </w:r>
+          </w:p>
         </w:tc>
         <w:tc>
           <w:tcPr>
@@ -6015,7 +7668,18 @@
               <w:right w:type="dxa" w:w="100"/>
             </w:tcMar>
           </w:tcPr>
-          <w:p/>
+          <w:p>
+            <w:r>
+              <w:rPr>
+                <w:rFonts w:ascii="Calibri" w:cs="Calibri" w:eastAsia="Calibri" w:hAnsi="Calibri"/>
+                <w:b w:val="false"/>
+                <w:bCs w:val="false"/>
+                <w:sz w:val="20"/>
+                <w:szCs w:val="20"/>
+              </w:rPr>
+              <w:t xml:space="preserve">0</w:t>
+            </w:r>
+          </w:p>
         </w:tc>
         <w:tc>
           <w:tcPr>
@@ -6033,7 +7697,18 @@
               <w:right w:type="dxa" w:w="100"/>
             </w:tcMar>
           </w:tcPr>
-          <w:p/>
+          <w:p>
+            <w:r>
+              <w:rPr>
+                <w:rFonts w:ascii="Calibri" w:cs="Calibri" w:eastAsia="Calibri" w:hAnsi="Calibri"/>
+                <w:b w:val="false"/>
+                <w:bCs w:val="false"/>
+                <w:sz w:val="20"/>
+                <w:szCs w:val="20"/>
+              </w:rPr>
+              <w:t xml:space="preserve">pending</w:t>
+            </w:r>
+          </w:p>
         </w:tc>
       </w:tr>
     </w:tbl>
@@ -6048,7 +7723,7 @@
           <w:sz w:val="22"/>
           <w:szCs w:val="22"/>
         </w:rPr>
-        <w:t xml:space="preserve">Buggy mode with a limit of 1 thread, wrong elements: ____</w:t>
+        <w:t xml:space="preserve">Buggy mode with a limit of 1 thread, wrong elements: 0</w:t>
       </w:r>
     </w:p>
     <w:p>
@@ -6061,7 +7736,7 @@
           <w:sz w:val="22"/>
           <w:szCs w:val="22"/>
         </w:rPr>
-        <w:t xml:space="preserve">Environment.ProcessorCount: ____</w:t>
+        <w:t xml:space="preserve">Environment.ProcessorCount: 8</w:t>
       </w:r>
     </w:p>
     <w:p>
@@ -6102,7 +7777,7 @@
           <w:sz w:val="22"/>
           <w:szCs w:val="22"/>
         </w:rPr>
-        <w:t xml:space="preserve">The keyword static was added in front of the lambda in the bug case. The build failed with the following compiler error, and static was then removed again:</w:t>
+        <w:t xml:space="preserve">The keyword static was added in front of the lambda in the bug case. The build failed with the following compiler errors, and static was then removed again (the build succeeded again):</w:t>
       </w:r>
     </w:p>
     <w:p>
@@ -6112,10 +7787,27 @@
       <w:r>
         <w:rPr>
           <w:rFonts w:ascii="Calibri" w:cs="Calibri" w:eastAsia="Calibri" w:hAnsi="Calibri"/>
+          <w:b/>
+          <w:bCs/>
           <w:sz w:val="22"/>
           <w:szCs w:val="22"/>
         </w:rPr>
-        <w:t xml:space="preserve">____</w:t>
+        <w:t xml:space="preserve">Program.cs(22,13): error CS8820: A static anonymous function cannot contain a reference to 'tmp'.</w:t>
+      </w:r>
+    </w:p>
+    <w:p>
+      <w:pPr>
+        <w:spacing w:after="120"/>
+      </w:pPr>
+      <w:r>
+        <w:rPr>
+          <w:rFonts w:ascii="Calibri" w:cs="Calibri" w:eastAsia="Calibri" w:hAnsi="Calibri"/>
+          <w:b/>
+          <w:bCs/>
+          <w:sz w:val="22"/>
+          <w:szCs w:val="22"/>
+        </w:rPr>
+        <w:t xml:space="preserve">Program.cs(24,30): error CS8820: A static anonymous function cannot contain a reference to 'tmp'.</w:t>
       </w:r>
     </w:p>
     <w:p>
@@ -6168,13 +7860,36 @@
       <w:r>
         <w:rPr>
           <w:rFonts w:ascii="Calibri" w:cs="Calibri" w:eastAsia="Calibri" w:hAnsi="Calibri"/>
-          <w:i/>
-          <w:iCs/>
-          <w:color w:val="7F7F7F"/>
           <w:sz w:val="22"/>
           <w:szCs w:val="22"/>
         </w:rPr>
-        <w:t xml:space="preserve">[ Answer to be added after the runs ]</w:t>
+        <w:t xml:space="preserve">No. With 4 threads the 10 runs gave between 199,579 and 199,923 wrong elements out of 200,000 (about 99.9%), a different number every time. With 1 thread it printed 0 wrong elements.</w:t>
+      </w:r>
+    </w:p>
+    <w:p>
+      <w:pPr>
+        <w:spacing w:after="120"/>
+      </w:pPr>
+      <w:r>
+        <w:rPr>
+          <w:rFonts w:ascii="Calibri" w:cs="Calibri" w:eastAsia="Calibri" w:hAnsi="Calibri"/>
+          <w:sz w:val="22"/>
+          <w:szCs w:val="22"/>
+        </w:rPr>
+        <w:t xml:space="preserve">This is typical of a race condition: the result depends on the exact timing of the threads, which changes from run to run, so the error count varies. With one thread there is no other thread to overwrite tmp between the two statements, so the bug never shows, even though the code is exactly the same.</w:t>
+      </w:r>
+    </w:p>
+    <w:p>
+      <w:pPr>
+        <w:spacing w:after="120"/>
+      </w:pPr>
+      <w:r>
+        <w:rPr>
+          <w:rFonts w:ascii="Calibri" w:cs="Calibri" w:eastAsia="Calibri" w:hAnsi="Calibri"/>
+          <w:sz w:val="22"/>
+          <w:szCs w:val="22"/>
+        </w:rPr>
+        <w:t xml:space="preserve">A correct-looking run only shows that, with that particular timing, no harmful interleaving happened. On another machine, under a different load, with fewer threads or a shorter loop body, the same code could pass many times and then fail. The bug is in the code (a shared tmp), not in the run, so a passing test cannot prove the code is correct.</w:t>
       </w:r>
     </w:p>
     <w:p>
@@ -6199,13 +7914,75 @@
       <w:r>
         <w:rPr>
           <w:rFonts w:ascii="Calibri" w:cs="Calibri" w:eastAsia="Calibri" w:hAnsi="Calibri"/>
-          <w:i/>
-          <w:iCs/>
-          <w:color w:val="7F7F7F"/>
           <w:sz w:val="22"/>
           <w:szCs w:val="22"/>
         </w:rPr>
-        <w:t xml:space="preserve">[ Answer to be added after the runs ]</w:t>
+        <w:t xml:space="preserve">Let thread T1 handle i = 10 and thread T2 handle i = 20 (input[i] = i), with one shared tmp:</w:t>
+      </w:r>
+    </w:p>
+    <w:p>
+      <w:pPr>
+        <w:spacing w:after="120"/>
+      </w:pPr>
+      <w:r>
+        <w:rPr>
+          <w:rFonts w:ascii="Calibri" w:cs="Calibri" w:eastAsia="Calibri" w:hAnsi="Calibri"/>
+          <w:sz w:val="22"/>
+          <w:szCs w:val="22"/>
+        </w:rPr>
+        <w:t xml:space="preserve">1. T1 executes tmp = input[10] * 3, so tmp = 30.</w:t>
+      </w:r>
+    </w:p>
+    <w:p>
+      <w:pPr>
+        <w:spacing w:after="120"/>
+      </w:pPr>
+      <w:r>
+        <w:rPr>
+          <w:rFonts w:ascii="Calibri" w:cs="Calibri" w:eastAsia="Calibri" w:hAnsi="Calibri"/>
+          <w:sz w:val="22"/>
+          <w:szCs w:val="22"/>
+        </w:rPr>
+        <w:t xml:space="preserve">2. T2 executes tmp = input[20] * 3, so tmp = 60 (T1's value is overwritten).</w:t>
+      </w:r>
+    </w:p>
+    <w:p>
+      <w:pPr>
+        <w:spacing w:after="120"/>
+      </w:pPr>
+      <w:r>
+        <w:rPr>
+          <w:rFonts w:ascii="Calibri" w:cs="Calibri" w:eastAsia="Calibri" w:hAnsi="Calibri"/>
+          <w:sz w:val="22"/>
+          <w:szCs w:val="22"/>
+        </w:rPr>
+        <w:t xml:space="preserve">3. T1 executes output[10] = tmp + 7 = 67. The correct value is 30 + 7 = 37, so output[10] is wrong.</w:t>
+      </w:r>
+    </w:p>
+    <w:p>
+      <w:pPr>
+        <w:spacing w:after="120"/>
+      </w:pPr>
+      <w:r>
+        <w:rPr>
+          <w:rFonts w:ascii="Calibri" w:cs="Calibri" w:eastAsia="Calibri" w:hAnsi="Calibri"/>
+          <w:sz w:val="22"/>
+          <w:szCs w:val="22"/>
+        </w:rPr>
+        <w:t xml:space="preserve">4. T2 executes output[20] = tmp + 7 = 67, which happens to be correct.</w:t>
+      </w:r>
+    </w:p>
+    <w:p>
+      <w:pPr>
+        <w:spacing w:after="120"/>
+      </w:pPr>
+      <w:r>
+        <w:rPr>
+          <w:rFonts w:ascii="Calibri" w:cs="Calibri" w:eastAsia="Calibri" w:hAnsi="Calibri"/>
+          <w:sz w:val="22"/>
+          <w:szCs w:val="22"/>
+        </w:rPr>
+        <w:t xml:space="preserve">The Thread.SpinWait(20) between the two statements makes step 2 very likely, which is why almost every element was wrong.</w:t>
       </w:r>
     </w:p>
     <w:p>
@@ -6230,13 +8007,36 @@
       <w:r>
         <w:rPr>
           <w:rFonts w:ascii="Calibri" w:cs="Calibri" w:eastAsia="Calibri" w:hAnsi="Calibri"/>
-          <w:i/>
-          <w:iCs/>
-          <w:color w:val="7F7F7F"/>
           <w:sz w:val="22"/>
           <w:szCs w:val="22"/>
         </w:rPr>
-        <w:t xml:space="preserve">[ Answer to be added after the runs ]</w:t>
+        <w:t xml:space="preserve">Both fixes give every thread its own tmp, and both gave 0 wrong elements. The local fix simply declares int tmp inside the lambda, so each iteration has its own copy on its own stack. This is the simplest and clearest fix and is the usual choice when the value does not need to be carried between iterations.</w:t>
+      </w:r>
+    </w:p>
+    <w:p>
+      <w:pPr>
+        <w:spacing w:after="120"/>
+      </w:pPr>
+      <w:r>
+        <w:rPr>
+          <w:rFonts w:ascii="Calibri" w:cs="Calibri" w:eastAsia="Calibri" w:hAnsi="Calibri"/>
+          <w:sz w:val="22"/>
+          <w:szCs w:val="22"/>
+        </w:rPr>
+        <w:t xml:space="preserve">The thread-local-state fix uses the Parallel.For overload with localInit, body and localFinally. The initial value comes from the localInit delegate () =&gt; 0, which runs once for each worker, so each worker's tmp starts at 0. The body receives the current value and returns it, so the value is carried from one iteration to the next on the same worker, and localFinally runs once per worker at the end (empty here, but it is where per-thread results would be combined, as in a reduction).</w:t>
+      </w:r>
+    </w:p>
+    <w:p>
+      <w:pPr>
+        <w:spacing w:after="120"/>
+      </w:pPr>
+      <w:r>
+        <w:rPr>
+          <w:rFonts w:ascii="Calibri" w:cs="Calibri" w:eastAsia="Calibri" w:hAnsi="Calibri"/>
+          <w:sz w:val="22"/>
+          <w:szCs w:val="22"/>
+        </w:rPr>
+        <w:t xml:space="preserve">OpenMP private(tmp) gives each thread its own uninitialised copy, which matches the local version. firstprivate(tmp) gives each thread a copy initialised from the value before the region, which is close to localInit, except that localInit can compute any starting value instead of only copying the outer one. The localFinally step has no direct equivalent in private/firstprivate; it is closest to the combine step of a reduction.</w:t>
       </w:r>
     </w:p>
     <w:p>
@@ -6261,13 +8061,23 @@
       <w:r>
         <w:rPr>
           <w:rFonts w:ascii="Calibri" w:cs="Calibri" w:eastAsia="Calibri" w:hAnsi="Calibri"/>
-          <w:i/>
-          <w:iCs/>
-          <w:color w:val="7F7F7F"/>
           <w:sz w:val="22"/>
           <w:szCs w:val="22"/>
         </w:rPr>
-        <w:t xml:space="preserve">[ Answer to be added after the runs ]</w:t>
+        <w:t xml:space="preserve">static on a lambda tells the compiler that the lambda must not capture any local variables, parameters or this from the method around it. Adding it to the buggy lambda produced error CS8820 for both uses of tmp (lines 22 and 24), so the shared variable was reported before the program could run.</w:t>
+      </w:r>
+    </w:p>
+    <w:p>
+      <w:pPr>
+        <w:spacing w:after="120"/>
+      </w:pPr>
+      <w:r>
+        <w:rPr>
+          <w:rFonts w:ascii="Calibri" w:cs="Calibri" w:eastAsia="Calibri" w:hAnsi="Calibri"/>
+          <w:sz w:val="22"/>
+          <w:szCs w:val="22"/>
+        </w:rPr>
+        <w:t xml:space="preserve">A compile error is found every time, at once, and it points to the exact line. A race at run time may appear only sometimes, produces wrong data silently (the program still printed a result) and is very hard to reproduce and debug. Catching the mistake when building is much cheaper and safer than finding wrong results later.</w:t>
       </w:r>
     </w:p>
     <w:p>
@@ -6292,30 +8102,10 @@
       <w:r>
         <w:rPr>
           <w:rFonts w:ascii="Calibri" w:cs="Calibri" w:eastAsia="Calibri" w:hAnsi="Calibri"/>
-          <w:i/>
-          <w:iCs/>
-          <w:color w:val="7F7F7F"/>
           <w:sz w:val="22"/>
           <w:szCs w:val="22"/>
         </w:rPr>
-        <w:t xml:space="preserve">[ Answer to be added after the runs ]</w:t>
-      </w:r>
-    </w:p>
-    <w:p>
-      <w:r>
-        <w:br w:type="page"/>
-      </w:r>
-    </w:p>
-    <w:p>
-      <w:pPr>
-        <w:pStyle w:val="Heading1"/>
-        <w:spacing w:after="120" w:before="240"/>
-      </w:pPr>
-      <w:r>
-        <w:rPr>
-          <w:rFonts w:ascii="Arial" w:cs="Arial" w:eastAsia="Arial" w:hAnsi="Arial"/>
-        </w:rPr>
-        <w:t xml:space="preserve">Section 5: Task 4 — Independent Operations with Parallel.Invoke</w:t>
+        <w:t xml:space="preserve">No, the bug would not disappear, but it would show up much less often. SpinWait(20) widens the gap between writing tmp and reading it, so another thread almost always writes in between (about 99.9% wrong). Without it the gap is only a few instructions, so far fewer elements would be wrong, and some runs might even print 0.</w:t>
       </w:r>
     </w:p>
     <w:p>
@@ -6328,6 +8118,36 @@
           <w:sz w:val="22"/>
           <w:szCs w:val="22"/>
         </w:rPr>
+        <w:t xml:space="preserve">Even a run with 0 wrong elements would not mean the program was correct. All threads still share one tmp with no synchronization, so the data race is still there; it is just less likely to be visible. Timing changes, other load on the machine or a different CPU could make it appear again. The program is correct only when tmp is private, as in the two fixes.</w:t>
+      </w:r>
+    </w:p>
+    <w:p>
+      <w:r>
+        <w:br w:type="page"/>
+      </w:r>
+    </w:p>
+    <w:p>
+      <w:pPr>
+        <w:pStyle w:val="Heading1"/>
+        <w:spacing w:after="120" w:before="240"/>
+      </w:pPr>
+      <w:r>
+        <w:rPr>
+          <w:rFonts w:ascii="Arial" w:cs="Arial" w:eastAsia="Arial" w:hAnsi="Arial"/>
+        </w:rPr>
+        <w:t xml:space="preserve">Section 5: Task 4 — Independent Operations with Parallel.Invoke</w:t>
+      </w:r>
+    </w:p>
+    <w:p>
+      <w:pPr>
+        <w:spacing w:after="120"/>
+      </w:pPr>
+      <w:r>
+        <w:rPr>
+          <w:rFonts w:ascii="Calibri" w:cs="Calibri" w:eastAsia="Calibri" w:hAnsi="Calibri"/>
+          <w:sz w:val="22"/>
+          <w:szCs w:val="22"/>
+        </w:rPr>
         <w:t xml:space="preserve">Source file: ParallelSections/Program.cs</w:t>
       </w:r>
     </w:p>
@@ -7154,7 +8974,7 @@
           <w:sz w:val="16"/>
           <w:szCs w:val="16"/>
         </w:rPr>
-        <w:t xml:space="preserve">    // A: count primes below 5,000,000 by trial division (shortest)</w:t>
+        <w:t xml:space="preserve">    // A: count primes below 5,000,000 by trial division</w:t>
       </w:r>
     </w:p>
     <w:p>
@@ -7280,7 +9100,7 @@
           <w:sz w:val="16"/>
           <w:szCs w:val="16"/>
         </w:rPr>
-        <w:t xml:space="preserve">    // B: sum of the digits of every number below 90,000,000 (longest)</w:t>
+        <w:t xml:space="preserve">    // B: sum of the digits of every number below 90,000,000</w:t>
       </w:r>
     </w:p>
     <w:p>
@@ -7448,7 +9268,7 @@
           <w:sz w:val="16"/>
           <w:szCs w:val="16"/>
         </w:rPr>
-        <w:t xml:space="preserve">    // C: total Collatz steps for every start value below 2,500,000 (medium)</w:t>
+        <w:t xml:space="preserve">    // C: total Collatz steps for every start value below 2,500,000</w:t>
       </w:r>
     </w:p>
     <w:p>
@@ -7796,7 +9616,7 @@
         <w:rPr>
           <w:rFonts w:ascii="Arial" w:cs="Arial" w:eastAsia="Arial" w:hAnsi="Arial"/>
         </w:rPr>
-        <w:t xml:space="preserve">Serial times</w:t>
+        <w:t xml:space="preserve">Serial times (from the run with a limit of 1)</w:t>
       </w:r>
     </w:p>
     <w:tbl>
@@ -7986,7 +9806,18 @@
               <w:right w:type="dxa" w:w="100"/>
             </w:tcMar>
           </w:tcPr>
-          <w:p/>
+          <w:p>
+            <w:r>
+              <w:rPr>
+                <w:rFonts w:ascii="Calibri" w:cs="Calibri" w:eastAsia="Calibri" w:hAnsi="Calibri"/>
+                <w:b w:val="false"/>
+                <w:bCs w:val="false"/>
+                <w:sz w:val="20"/>
+                <w:szCs w:val="20"/>
+              </w:rPr>
+              <w:t xml:space="preserve">0.634</w:t>
+            </w:r>
+          </w:p>
         </w:tc>
       </w:tr>
       <w:tr>
@@ -8064,7 +9895,18 @@
               <w:right w:type="dxa" w:w="100"/>
             </w:tcMar>
           </w:tcPr>
-          <w:p/>
+          <w:p>
+            <w:r>
+              <w:rPr>
+                <w:rFonts w:ascii="Calibri" w:cs="Calibri" w:eastAsia="Calibri" w:hAnsi="Calibri"/>
+                <w:b w:val="false"/>
+                <w:bCs w:val="false"/>
+                <w:sz w:val="20"/>
+                <w:szCs w:val="20"/>
+              </w:rPr>
+              <w:t xml:space="preserve">0.558</w:t>
+            </w:r>
+          </w:p>
         </w:tc>
       </w:tr>
       <w:tr>
@@ -8142,7 +9984,18 @@
               <w:right w:type="dxa" w:w="100"/>
             </w:tcMar>
           </w:tcPr>
-          <w:p/>
+          <w:p>
+            <w:r>
+              <w:rPr>
+                <w:rFonts w:ascii="Calibri" w:cs="Calibri" w:eastAsia="Calibri" w:hAnsi="Calibri"/>
+                <w:b w:val="false"/>
+                <w:bCs w:val="false"/>
+                <w:sz w:val="20"/>
+                <w:szCs w:val="20"/>
+              </w:rPr>
+              <w:t xml:space="preserve">0.552</w:t>
+            </w:r>
+          </w:p>
         </w:tc>
       </w:tr>
       <w:tr>
@@ -8209,7 +10062,18 @@
               <w:right w:type="dxa" w:w="100"/>
             </w:tcMar>
           </w:tcPr>
-          <w:p/>
+          <w:p>
+            <w:r>
+              <w:rPr>
+                <w:rFonts w:ascii="Calibri" w:cs="Calibri" w:eastAsia="Calibri" w:hAnsi="Calibri"/>
+                <w:b w:val="false"/>
+                <w:bCs w:val="false"/>
+                <w:sz w:val="20"/>
+                <w:szCs w:val="20"/>
+              </w:rPr>
+              <w:t xml:space="preserve">1.745</w:t>
+            </w:r>
+          </w:p>
         </w:tc>
       </w:tr>
     </w:tbl>
@@ -8446,7 +10310,18 @@
               <w:right w:type="dxa" w:w="100"/>
             </w:tcMar>
           </w:tcPr>
-          <w:p/>
+          <w:p>
+            <w:r>
+              <w:rPr>
+                <w:rFonts w:ascii="Calibri" w:cs="Calibri" w:eastAsia="Calibri" w:hAnsi="Calibri"/>
+                <w:b w:val="false"/>
+                <w:bCs w:val="false"/>
+                <w:sz w:val="20"/>
+                <w:szCs w:val="20"/>
+              </w:rPr>
+              <w:t xml:space="preserve">2.163</w:t>
+            </w:r>
+          </w:p>
         </w:tc>
         <w:tc>
           <w:tcPr>
@@ -8464,7 +10339,18 @@
               <w:right w:type="dxa" w:w="100"/>
             </w:tcMar>
           </w:tcPr>
-          <w:p/>
+          <w:p>
+            <w:r>
+              <w:rPr>
+                <w:rFonts w:ascii="Calibri" w:cs="Calibri" w:eastAsia="Calibri" w:hAnsi="Calibri"/>
+                <w:b w:val="false"/>
+                <w:bCs w:val="false"/>
+                <w:sz w:val="20"/>
+                <w:szCs w:val="20"/>
+              </w:rPr>
+              <w:t xml:space="preserve">0.81</w:t>
+            </w:r>
+          </w:p>
         </w:tc>
         <w:tc>
           <w:tcPr>
@@ -8482,7 +10368,18 @@
               <w:right w:type="dxa" w:w="100"/>
             </w:tcMar>
           </w:tcPr>
-          <w:p/>
+          <w:p>
+            <w:r>
+              <w:rPr>
+                <w:rFonts w:ascii="Calibri" w:cs="Calibri" w:eastAsia="Calibri" w:hAnsi="Calibri"/>
+                <w:b w:val="false"/>
+                <w:bCs w:val="false"/>
+                <w:sz w:val="20"/>
+                <w:szCs w:val="20"/>
+              </w:rPr>
+              <w:t xml:space="preserve">2 / 2 / 2</w:t>
+            </w:r>
+          </w:p>
         </w:tc>
         <w:tc>
           <w:tcPr>
@@ -8500,7 +10397,18 @@
               <w:right w:type="dxa" w:w="100"/>
             </w:tcMar>
           </w:tcPr>
-          <w:p/>
+          <w:p>
+            <w:r>
+              <w:rPr>
+                <w:rFonts w:ascii="Calibri" w:cs="Calibri" w:eastAsia="Calibri" w:hAnsi="Calibri"/>
+                <w:b w:val="false"/>
+                <w:bCs w:val="false"/>
+                <w:sz w:val="20"/>
+                <w:szCs w:val="20"/>
+              </w:rPr>
+              <w:t xml:space="preserve">Y</w:t>
+            </w:r>
+          </w:p>
         </w:tc>
       </w:tr>
       <w:tr>
@@ -8549,7 +10457,18 @@
               <w:right w:type="dxa" w:w="100"/>
             </w:tcMar>
           </w:tcPr>
-          <w:p/>
+          <w:p>
+            <w:r>
+              <w:rPr>
+                <w:rFonts w:ascii="Calibri" w:cs="Calibri" w:eastAsia="Calibri" w:hAnsi="Calibri"/>
+                <w:b w:val="false"/>
+                <w:bCs w:val="false"/>
+                <w:sz w:val="20"/>
+                <w:szCs w:val="20"/>
+              </w:rPr>
+              <w:t xml:space="preserve">1.307</w:t>
+            </w:r>
+          </w:p>
         </w:tc>
         <w:tc>
           <w:tcPr>
@@ -8567,7 +10486,18 @@
               <w:right w:type="dxa" w:w="100"/>
             </w:tcMar>
           </w:tcPr>
-          <w:p/>
+          <w:p>
+            <w:r>
+              <w:rPr>
+                <w:rFonts w:ascii="Calibri" w:cs="Calibri" w:eastAsia="Calibri" w:hAnsi="Calibri"/>
+                <w:b w:val="false"/>
+                <w:bCs w:val="false"/>
+                <w:sz w:val="20"/>
+                <w:szCs w:val="20"/>
+              </w:rPr>
+              <w:t xml:space="preserve">1.34</w:t>
+            </w:r>
+          </w:p>
         </w:tc>
         <w:tc>
           <w:tcPr>
@@ -8585,7 +10515,18 @@
               <w:right w:type="dxa" w:w="100"/>
             </w:tcMar>
           </w:tcPr>
-          <w:p/>
+          <w:p>
+            <w:r>
+              <w:rPr>
+                <w:rFonts w:ascii="Calibri" w:cs="Calibri" w:eastAsia="Calibri" w:hAnsi="Calibri"/>
+                <w:b w:val="false"/>
+                <w:bCs w:val="false"/>
+                <w:sz w:val="20"/>
+                <w:szCs w:val="20"/>
+              </w:rPr>
+              <w:t xml:space="preserve">2 / 4 / 2</w:t>
+            </w:r>
+          </w:p>
         </w:tc>
         <w:tc>
           <w:tcPr>
@@ -8603,7 +10544,18 @@
               <w:right w:type="dxa" w:w="100"/>
             </w:tcMar>
           </w:tcPr>
-          <w:p/>
+          <w:p>
+            <w:r>
+              <w:rPr>
+                <w:rFonts w:ascii="Calibri" w:cs="Calibri" w:eastAsia="Calibri" w:hAnsi="Calibri"/>
+                <w:b w:val="false"/>
+                <w:bCs w:val="false"/>
+                <w:sz w:val="20"/>
+                <w:szCs w:val="20"/>
+              </w:rPr>
+              <w:t xml:space="preserve">Y</w:t>
+            </w:r>
+          </w:p>
         </w:tc>
       </w:tr>
       <w:tr>
@@ -8652,7 +10604,18 @@
               <w:right w:type="dxa" w:w="100"/>
             </w:tcMar>
           </w:tcPr>
-          <w:p/>
+          <w:p>
+            <w:r>
+              <w:rPr>
+                <w:rFonts w:ascii="Calibri" w:cs="Calibri" w:eastAsia="Calibri" w:hAnsi="Calibri"/>
+                <w:b w:val="false"/>
+                <w:bCs w:val="false"/>
+                <w:sz w:val="20"/>
+                <w:szCs w:val="20"/>
+              </w:rPr>
+              <w:t xml:space="preserve">1.123</w:t>
+            </w:r>
+          </w:p>
         </w:tc>
         <w:tc>
           <w:tcPr>
@@ -8670,7 +10633,18 @@
               <w:right w:type="dxa" w:w="100"/>
             </w:tcMar>
           </w:tcPr>
-          <w:p/>
+          <w:p>
+            <w:r>
+              <w:rPr>
+                <w:rFonts w:ascii="Calibri" w:cs="Calibri" w:eastAsia="Calibri" w:hAnsi="Calibri"/>
+                <w:b w:val="false"/>
+                <w:bCs w:val="false"/>
+                <w:sz w:val="20"/>
+                <w:szCs w:val="20"/>
+              </w:rPr>
+              <w:t xml:space="preserve">1.68</w:t>
+            </w:r>
+          </w:p>
         </w:tc>
         <w:tc>
           <w:tcPr>
@@ -8688,7 +10662,18 @@
               <w:right w:type="dxa" w:w="100"/>
             </w:tcMar>
           </w:tcPr>
-          <w:p/>
+          <w:p>
+            <w:r>
+              <w:rPr>
+                <w:rFonts w:ascii="Calibri" w:cs="Calibri" w:eastAsia="Calibri" w:hAnsi="Calibri"/>
+                <w:b w:val="false"/>
+                <w:bCs w:val="false"/>
+                <w:sz w:val="20"/>
+                <w:szCs w:val="20"/>
+              </w:rPr>
+              <w:t xml:space="preserve">2 / 4 / 6</w:t>
+            </w:r>
+          </w:p>
         </w:tc>
         <w:tc>
           <w:tcPr>
@@ -8706,7 +10691,18 @@
               <w:right w:type="dxa" w:w="100"/>
             </w:tcMar>
           </w:tcPr>
-          <w:p/>
+          <w:p>
+            <w:r>
+              <w:rPr>
+                <w:rFonts w:ascii="Calibri" w:cs="Calibri" w:eastAsia="Calibri" w:hAnsi="Calibri"/>
+                <w:b w:val="false"/>
+                <w:bCs w:val="false"/>
+                <w:sz w:val="20"/>
+                <w:szCs w:val="20"/>
+              </w:rPr>
+              <w:t xml:space="preserve">Y</w:t>
+            </w:r>
+          </w:p>
         </w:tc>
       </w:tr>
       <w:tr>
@@ -8755,7 +10751,18 @@
               <w:right w:type="dxa" w:w="100"/>
             </w:tcMar>
           </w:tcPr>
-          <w:p/>
+          <w:p>
+            <w:r>
+              <w:rPr>
+                <w:rFonts w:ascii="Calibri" w:cs="Calibri" w:eastAsia="Calibri" w:hAnsi="Calibri"/>
+                <w:b w:val="false"/>
+                <w:bCs w:val="false"/>
+                <w:sz w:val="20"/>
+                <w:szCs w:val="20"/>
+              </w:rPr>
+              <w:t xml:space="preserve">1.109</w:t>
+            </w:r>
+          </w:p>
         </w:tc>
         <w:tc>
           <w:tcPr>
@@ -8773,7 +10780,18 @@
               <w:right w:type="dxa" w:w="100"/>
             </w:tcMar>
           </w:tcPr>
-          <w:p/>
+          <w:p>
+            <w:r>
+              <w:rPr>
+                <w:rFonts w:ascii="Calibri" w:cs="Calibri" w:eastAsia="Calibri" w:hAnsi="Calibri"/>
+                <w:b w:val="false"/>
+                <w:bCs w:val="false"/>
+                <w:sz w:val="20"/>
+                <w:szCs w:val="20"/>
+              </w:rPr>
+              <w:t xml:space="preserve">1.59</w:t>
+            </w:r>
+          </w:p>
         </w:tc>
         <w:tc>
           <w:tcPr>
@@ -8791,7 +10809,18 @@
               <w:right w:type="dxa" w:w="100"/>
             </w:tcMar>
           </w:tcPr>
-          <w:p/>
+          <w:p>
+            <w:r>
+              <w:rPr>
+                <w:rFonts w:ascii="Calibri" w:cs="Calibri" w:eastAsia="Calibri" w:hAnsi="Calibri"/>
+                <w:b w:val="false"/>
+                <w:bCs w:val="false"/>
+                <w:sz w:val="20"/>
+                <w:szCs w:val="20"/>
+              </w:rPr>
+              <w:t xml:space="preserve">2 / 4 / 6</w:t>
+            </w:r>
+          </w:p>
         </w:tc>
         <w:tc>
           <w:tcPr>
@@ -8809,7 +10838,18 @@
               <w:right w:type="dxa" w:w="100"/>
             </w:tcMar>
           </w:tcPr>
-          <w:p/>
+          <w:p>
+            <w:r>
+              <w:rPr>
+                <w:rFonts w:ascii="Calibri" w:cs="Calibri" w:eastAsia="Calibri" w:hAnsi="Calibri"/>
+                <w:b w:val="false"/>
+                <w:bCs w:val="false"/>
+                <w:sz w:val="20"/>
+                <w:szCs w:val="20"/>
+              </w:rPr>
+              <w:t xml:space="preserve">Y</w:t>
+            </w:r>
+          </w:p>
         </w:tc>
       </w:tr>
       <w:tr>
@@ -8858,7 +10898,18 @@
               <w:right w:type="dxa" w:w="100"/>
             </w:tcMar>
           </w:tcPr>
-          <w:p/>
+          <w:p>
+            <w:r>
+              <w:rPr>
+                <w:rFonts w:ascii="Calibri" w:cs="Calibri" w:eastAsia="Calibri" w:hAnsi="Calibri"/>
+                <w:b w:val="false"/>
+                <w:bCs w:val="false"/>
+                <w:sz w:val="20"/>
+                <w:szCs w:val="20"/>
+              </w:rPr>
+              <w:t xml:space="preserve">1.289</w:t>
+            </w:r>
+          </w:p>
         </w:tc>
         <w:tc>
           <w:tcPr>
@@ -8876,7 +10927,18 @@
               <w:right w:type="dxa" w:w="100"/>
             </w:tcMar>
           </w:tcPr>
-          <w:p/>
+          <w:p>
+            <w:r>
+              <w:rPr>
+                <w:rFonts w:ascii="Calibri" w:cs="Calibri" w:eastAsia="Calibri" w:hAnsi="Calibri"/>
+                <w:b w:val="false"/>
+                <w:bCs w:val="false"/>
+                <w:sz w:val="20"/>
+                <w:szCs w:val="20"/>
+              </w:rPr>
+              <w:t xml:space="preserve">1.37</w:t>
+            </w:r>
+          </w:p>
         </w:tc>
         <w:tc>
           <w:tcPr>
@@ -8894,7 +10956,18 @@
               <w:right w:type="dxa" w:w="100"/>
             </w:tcMar>
           </w:tcPr>
-          <w:p/>
+          <w:p>
+            <w:r>
+              <w:rPr>
+                <w:rFonts w:ascii="Calibri" w:cs="Calibri" w:eastAsia="Calibri" w:hAnsi="Calibri"/>
+                <w:b w:val="false"/>
+                <w:bCs w:val="false"/>
+                <w:sz w:val="20"/>
+                <w:szCs w:val="20"/>
+              </w:rPr>
+              <w:t xml:space="preserve">2 / 4 / 6</w:t>
+            </w:r>
+          </w:p>
         </w:tc>
         <w:tc>
           <w:tcPr>
@@ -8912,7 +10985,18 @@
               <w:right w:type="dxa" w:w="100"/>
             </w:tcMar>
           </w:tcPr>
-          <w:p/>
+          <w:p>
+            <w:r>
+              <w:rPr>
+                <w:rFonts w:ascii="Calibri" w:cs="Calibri" w:eastAsia="Calibri" w:hAnsi="Calibri"/>
+                <w:b w:val="false"/>
+                <w:bCs w:val="false"/>
+                <w:sz w:val="20"/>
+                <w:szCs w:val="20"/>
+              </w:rPr>
+              <w:t xml:space="preserve">Y</w:t>
+            </w:r>
+          </w:p>
         </w:tc>
       </w:tr>
     </w:tbl>
@@ -8927,7 +11011,7 @@
           <w:sz w:val="22"/>
           <w:szCs w:val="22"/>
         </w:rPr>
-        <w:t xml:space="preserve">Speedup = serial total / wall time.</w:t>
+        <w:t xml:space="preserve">Speedup = serial total of the same run / wall time (each run measures its own serial times first). The calling thread was thread 2 in every run. Results: A = 348,513, B = 3,195,000,000, C = 352,279,005 in every run.</w:t>
       </w:r>
     </w:p>
     <w:p>
@@ -8940,7 +11024,7 @@
           <w:sz w:val="22"/>
           <w:szCs w:val="22"/>
         </w:rPr>
-        <w:t xml:space="preserve">Limit of 3, three runs, thread of A / B / C: run 1 ____, run 2 ____, run 3 ____. Same assignment every time? (Y/N): ____</w:t>
+        <w:t xml:space="preserve">Limit of 3, three runs, thread of A / B / C: run 1 2 / 4 / 6, run 2 pending, run 3 pending. Same assignment every time? (Y/N): pending</w:t>
       </w:r>
     </w:p>
     <w:p>
@@ -8993,13 +11077,36 @@
       <w:r>
         <w:rPr>
           <w:rFonts w:ascii="Calibri" w:cs="Calibri" w:eastAsia="Calibri" w:hAnsi="Calibri"/>
-          <w:i/>
-          <w:iCs/>
-          <w:color w:val="7F7F7F"/>
           <w:sz w:val="22"/>
           <w:szCs w:val="22"/>
         </w:rPr>
-        <w:t xml:space="preserve">[ Answer to be added after the runs ]</w:t>
+        <w:t xml:space="preserve">A (counting primes) took longest in every run, about 0.63 to 0.72 s; B and C took about 0.55 to 0.58 s each. In the run with a limit of 3 the serial times were A = 0.719 s, B = 0.584 s and C = 0.584 s (total 1.886 s), and the parallel wall time was 1.123 s, a speedup of 1.68.</w:t>
+      </w:r>
+    </w:p>
+    <w:p>
+      <w:pPr>
+        <w:spacing w:after="120"/>
+      </w:pPr>
+      <w:r>
+        <w:rPr>
+          <w:rFonts w:ascii="Calibri" w:cs="Calibri" w:eastAsia="Calibri" w:hAnsi="Calibri"/>
+          <w:sz w:val="22"/>
+          <w:szCs w:val="22"/>
+        </w:rPr>
+        <w:t xml:space="preserve">The best possible wall time is the longest single action, 0.719 s, because A cannot be split and the call cannot return before A finishes. That would be a speedup of 1.886 / 0.719 = 2.62, and never more than 3 with three actions. So the main limit on the speedup is the number of independent actions and the size of the largest one (load imbalance).</w:t>
+      </w:r>
+    </w:p>
+    <w:p>
+      <w:pPr>
+        <w:spacing w:after="120"/>
+      </w:pPr>
+      <w:r>
+        <w:rPr>
+          <w:rFonts w:ascii="Calibri" w:cs="Calibri" w:eastAsia="Calibri" w:hAnsi="Calibri"/>
+          <w:sz w:val="22"/>
+          <w:szCs w:val="22"/>
+        </w:rPr>
+        <w:t xml:space="preserve">The measured 1.123 s is longer than 0.719 s because each action ran slower when all three ran at the same time. When several cores are busy the CPU lowers its turbo clock, and if two actions share one physical core (hyper-threading: 8 logical processors do not mean 8 full cores) they compete for it. Thread start-up adds a little more.</w:t>
       </w:r>
     </w:p>
     <w:p>
@@ -9024,13 +11131,23 @@
       <w:r>
         <w:rPr>
           <w:rFonts w:ascii="Calibri" w:cs="Calibri" w:eastAsia="Calibri" w:hAnsi="Calibri"/>
-          <w:i/>
-          <w:iCs/>
-          <w:color w:val="7F7F7F"/>
           <w:sz w:val="22"/>
           <w:szCs w:val="22"/>
         </w:rPr>
-        <w:t xml:space="preserve">[ Answer to be added after the runs ]</w:t>
+        <w:t xml:space="preserve">There are only three actions, so at most three can run at once. With a limit of 4 or 8 exactly the same three threads (2, 4 and 6) ran A, B and C, and the wall time stayed about the same (1.109 s with 4) or was a little worse (1.289 s with 8, which is run-to-run variation in CPU clock and background load, not extra work).</w:t>
+      </w:r>
+    </w:p>
+    <w:p>
+      <w:pPr>
+        <w:spacing w:after="120"/>
+      </w:pPr>
+      <w:r>
+        <w:rPr>
+          <w:rFonts w:ascii="Calibri" w:cs="Calibri" w:eastAsia="Calibri" w:hAnsi="Calibri"/>
+          <w:sz w:val="22"/>
+          <w:szCs w:val="22"/>
+        </w:rPr>
+        <w:t xml:space="preserve">The extra threads were never used. MaxDegreeOfParallelism is only an upper bound; Parallel.Invoke creates one unit of work per action, so there was nothing for a fourth thread to do and no extra threads were started.</w:t>
       </w:r>
     </w:p>
     <w:p>
@@ -9055,13 +11172,23 @@
       <w:r>
         <w:rPr>
           <w:rFonts w:ascii="Calibri" w:cs="Calibri" w:eastAsia="Calibri" w:hAnsi="Calibri"/>
-          <w:i/>
-          <w:iCs/>
-          <w:color w:val="7F7F7F"/>
           <w:sz w:val="22"/>
           <w:szCs w:val="22"/>
         </w:rPr>
-        <w:t xml:space="preserve">[ Answer to be added after the runs ]</w:t>
+        <w:t xml:space="preserve">In the runs with limits of 3, 4 and 8 the assignment was the same: A on thread 2 (the calling thread), B on thread 4 and C on thread 6. With a limit of 2 it was A = 2, B = 4, C = 2: the calling thread ran A and then, when it finished, also took C. With a limit of 1 the calling thread ran all three, one after another. The repeated runs with a limit of 3 are recorded above.</w:t>
+      </w:r>
+    </w:p>
+    <w:p>
+      <w:pPr>
+        <w:spacing w:after="120"/>
+      </w:pPr>
+      <w:r>
+        <w:rPr>
+          <w:rFonts w:ascii="Calibri" w:cs="Calibri" w:eastAsia="Calibri" w:hAnsi="Calibri"/>
+          <w:sz w:val="22"/>
+          <w:szCs w:val="22"/>
+        </w:rPr>
+        <w:t xml:space="preserve">Parallel.Invoke does not guarantee any assignment or order. The repeated pattern comes from how the thread pool happens to hand out work in a fresh process (the calling thread runs the first action, and the same pool threads are created in the same order), not from any rule. Code must never depend on which thread runs which action.</w:t>
       </w:r>
     </w:p>
     <w:p>
@@ -9086,13 +11213,23 @@
       <w:r>
         <w:rPr>
           <w:rFonts w:ascii="Calibri" w:cs="Calibri" w:eastAsia="Calibri" w:hAnsi="Calibri"/>
-          <w:i/>
-          <w:iCs/>
-          <w:color w:val="7F7F7F"/>
           <w:sz w:val="22"/>
           <w:szCs w:val="22"/>
         </w:rPr>
-        <w:t xml:space="preserve">[ Answer to be added after the runs ]</w:t>
+        <w:t xml:space="preserve">Parallel.Invoke may run the actions at the same time, one after another, or in any order, so the result is only well-defined if the actions do not depend on each other's data. Here each action writes only its own result and thread variables (resultA, threadA, ...), so results_match=YES in every run.</w:t>
+      </w:r>
+    </w:p>
+    <w:p>
+      <w:pPr>
+        <w:spacing w:after="120"/>
+      </w:pPr>
+      <w:r>
+        <w:rPr>
+          <w:rFonts w:ascii="Calibri" w:cs="Calibri" w:eastAsia="Calibri" w:hAnsi="Calibri"/>
+          <w:sz w:val="22"/>
+          <w:szCs w:val="22"/>
+        </w:rPr>
+        <w:t xml:space="preserve">If A and B wrote to the same variable, for example both did total += value, each update is a read, an add and a write. A could read total, then B reads the same old value, both add, and the second write overwrites the first, so one update is lost. The final value would depend on timing and change from run to run, the same kind of race as in Task 3. Avoiding it needs a lock or Interlocked operations, or better, separate variables combined after the call.</w:t>
       </w:r>
     </w:p>
     <w:p>
@@ -9117,30 +11254,10 @@
       <w:r>
         <w:rPr>
           <w:rFonts w:ascii="Calibri" w:cs="Calibri" w:eastAsia="Calibri" w:hAnsi="Calibri"/>
-          <w:i/>
-          <w:iCs/>
-          <w:color w:val="7F7F7F"/>
           <w:sz w:val="22"/>
           <w:szCs w:val="22"/>
         </w:rPr>
-        <w:t xml:space="preserve">[ Answer to be added after the runs ]</w:t>
-      </w:r>
-    </w:p>
-    <w:p>
-      <w:r>
-        <w:br w:type="page"/>
-      </w:r>
-    </w:p>
-    <w:p>
-      <w:pPr>
-        <w:pStyle w:val="Heading1"/>
-        <w:spacing w:after="120" w:before="240"/>
-      </w:pPr>
-      <w:r>
-        <w:rPr>
-          <w:rFonts w:ascii="Arial" w:cs="Arial" w:eastAsia="Arial" w:hAnsi="Arial"/>
-        </w:rPr>
-        <w:t xml:space="preserve">Section 6: Submission Checklist</w:t>
+        <w:t xml:space="preserve">Parallel.Invoke is for a small, fixed number of different, independent operations (task parallelism), such as loading several files or running different calculations, which is what OpenMP sections do. Parallel.For is for doing the same operation on many data items (data parallelism), where the work can be split into many similar pieces and scales with the data size.</w:t>
       </w:r>
     </w:p>
     <w:p>
@@ -9153,7 +11270,24 @@
           <w:sz w:val="22"/>
           <w:szCs w:val="22"/>
         </w:rPr>
-        <w:t xml:space="preserve">☐ .NET SDK and VS Code with the C# Dev Kit available (carried over from Labs 02 to 05)</w:t>
+        <w:t xml:space="preserve">Parallel.Invoke returns only after all the actions have finished; this is the implicit barrier, like the one at the end of an OpenMP sections construct. So the code after it can safely use every result: here the comparison with the serial results and the printing of thread IDs happen only once A, B and C are all done. It also means the total time is set by the slowest action.</w:t>
+      </w:r>
+    </w:p>
+    <w:p>
+      <w:r>
+        <w:br w:type="page"/>
+      </w:r>
+    </w:p>
+    <w:p>
+      <w:pPr>
+        <w:pStyle w:val="Heading1"/>
+        <w:spacing w:after="120" w:before="240"/>
+      </w:pPr>
+      <w:r>
+        <w:rPr>
+          <w:rFonts w:ascii="Arial" w:cs="Arial" w:eastAsia="Arial" w:hAnsi="Arial"/>
+        </w:rPr>
+        <w:t xml:space="preserve">Section 6: Submission Checklist</w:t>
       </w:r>
     </w:p>
     <w:p>
@@ -9166,7 +11300,7 @@
           <w:sz w:val="22"/>
           <w:szCs w:val="22"/>
         </w:rPr>
-        <w:t xml:space="preserve">☐ ParallelRegion run with limits of 1, 2, 4 and 8 (twice each) and the thread IDs of both runs compared</w:t>
+        <w:t xml:space="preserve">☑ .NET SDK and VS Code with the C# Dev Kit available (carried over from Labs 02 to 05)</w:t>
       </w:r>
     </w:p>
     <w:p>
@@ -9179,7 +11313,7 @@
           <w:sz w:val="22"/>
           <w:szCs w:val="22"/>
         </w:rPr>
-        <w:t xml:space="preserve">☐ VecAdd reports correct=YES in every run; timing table has averages and speedups for limits of 1, 2, 4 and 8</w:t>
+        <w:t xml:space="preserve">☑ ParallelRegion run with limits of 1, 2, 4 and 8 (twice each) and the thread IDs of both runs compared</w:t>
       </w:r>
     </w:p>
     <w:p>
@@ -9192,7 +11326,7 @@
           <w:sz w:val="22"/>
           <w:szCs w:val="22"/>
         </w:rPr>
-        <w:t xml:space="preserve">☐ Buggy ScopingBug mode run 10 times, both fixed modes run 10 times, static-lambda compile error captured</w:t>
+        <w:t xml:space="preserve">☑ VecAdd reports correct=YES in every run; timing table has averages and speedups for limits of 1, 2, 4 and 8</w:t>
       </w:r>
     </w:p>
     <w:p>
@@ -9205,7 +11339,7 @@
           <w:sz w:val="22"/>
           <w:szCs w:val="22"/>
         </w:rPr>
-        <w:t xml:space="preserve">☐ ParallelSections reports results_match=YES for every limit; serial times and thread assignments recorded</w:t>
+        <w:t xml:space="preserve">☐ Buggy ScopingBug mode run 10 times, both fixed modes run 10 times, static-lambda compile error captured</w:t>
       </w:r>
     </w:p>
     <w:p>
@@ -9218,7 +11352,20 @@
           <w:sz w:val="22"/>
           <w:szCs w:val="22"/>
         </w:rPr>
-        <w:t xml:space="preserve">☐ All discussion questions answered</w:t>
+        <w:t xml:space="preserve">☑ ParallelSections reports results_match=YES for every limit; serial times and thread assignments recorded</w:t>
+      </w:r>
+    </w:p>
+    <w:p>
+      <w:pPr>
+        <w:spacing w:after="120"/>
+      </w:pPr>
+      <w:r>
+        <w:rPr>
+          <w:rFonts w:ascii="Calibri" w:cs="Calibri" w:eastAsia="Calibri" w:hAnsi="Calibri"/>
+          <w:sz w:val="22"/>
+          <w:szCs w:val="22"/>
+        </w:rPr>
+        <w:t xml:space="preserve">☑ All discussion questions answered</w:t>
       </w:r>
     </w:p>
     <w:p>

</xml_diff>

<commit_message>
Lab 6 report: add local run and repeated limit-3 runs
Co-Authored-By: Claude Opus 5.5 <noreply@anthropic.com>
Claude-Session: https://claude.ai/code/session_01MRtG6dEqhFRvA9gCPi6R4t
</commit_message>
<xml_diff>
--- a/Lab6_PDC/PDC_Lab06_Report.docx
+++ b/Lab6_PDC/PDC_Lab06_Report.docx
@@ -6644,7 +6644,7 @@
                 <w:sz w:val="20"/>
                 <w:szCs w:val="20"/>
               </w:rPr>
-              <w:t xml:space="preserve">pending</w:t>
+              <w:t xml:space="preserve">0</w:t>
             </w:r>
           </w:p>
         </w:tc>
@@ -11024,7 +11024,2875 @@
           <w:sz w:val="22"/>
           <w:szCs w:val="22"/>
         </w:rPr>
-        <w:t xml:space="preserve">Limit of 3, three runs, thread of A / B / C: run 1 2 / 4 / 6, run 2 pending, run 3 pending. Same assignment every time? (Y/N): pending</w:t>
+        <w:t xml:space="preserve">Limit of 3, three runs, thread of A / B / C: run 1 2 / 4 / 6, run 2 2 / 4 / 6, run 3 2 / 4 / 6. Same assignment every time? (Y/N): Y</w:t>
+      </w:r>
+    </w:p>
+    <w:p>
+      <w:pPr>
+        <w:pStyle w:val="Heading2"/>
+        <w:spacing w:after="120" w:before="200"/>
+      </w:pPr>
+      <w:r>
+        <w:rPr>
+          <w:rFonts w:ascii="Arial" w:cs="Arial" w:eastAsia="Arial" w:hAnsi="Arial"/>
+        </w:rPr>
+        <w:t xml:space="preserve">Repeated runs with a limit of 3</w:t>
+      </w:r>
+    </w:p>
+    <w:tbl>
+      <w:tblPr>
+        <w:tblW w:type="dxa" w:w="9026"/>
+        <w:tblBorders>
+          <w:top w:val="single" w:color="auto" w:sz="4"/>
+          <w:left w:val="single" w:color="auto" w:sz="4"/>
+          <w:bottom w:val="single" w:color="auto" w:sz="4"/>
+          <w:right w:val="single" w:color="auto" w:sz="4"/>
+          <w:insideH w:val="single" w:color="auto" w:sz="4"/>
+          <w:insideV w:val="single" w:color="auto" w:sz="4"/>
+        </w:tblBorders>
+      </w:tblPr>
+      <w:tblGrid>
+        <w:gridCol w:w="700"/>
+        <w:gridCol w:w="1189"/>
+        <w:gridCol w:w="1189"/>
+        <w:gridCol w:w="1189"/>
+        <w:gridCol w:w="1189"/>
+        <w:gridCol w:w="1189"/>
+        <w:gridCol w:w="1189"/>
+        <w:gridCol w:w="1192"/>
+      </w:tblGrid>
+      <w:tr>
+        <w:trPr>
+          <w:tblHeader/>
+        </w:trPr>
+        <w:tc>
+          <w:tcPr>
+            <w:tcW w:type="dxa" w:w="700"/>
+            <w:tcBorders>
+              <w:top w:val="single" w:color="808080" w:sz="4"/>
+              <w:left w:val="single" w:color="808080" w:sz="4"/>
+              <w:bottom w:val="single" w:color="808080" w:sz="4"/>
+              <w:right w:val="single" w:color="808080" w:sz="4"/>
+            </w:tcBorders>
+            <w:shd w:fill="D9E2F3" w:color="auto" w:val="clear"/>
+            <w:tcMar>
+              <w:top w:type="dxa" w:w="60"/>
+              <w:left w:type="dxa" w:w="100"/>
+              <w:bottom w:type="dxa" w:w="60"/>
+              <w:right w:type="dxa" w:w="100"/>
+            </w:tcMar>
+          </w:tcPr>
+          <w:p>
+            <w:r>
+              <w:rPr>
+                <w:rFonts w:ascii="Calibri" w:cs="Calibri" w:eastAsia="Calibri" w:hAnsi="Calibri"/>
+                <w:b/>
+                <w:bCs/>
+                <w:sz w:val="20"/>
+                <w:szCs w:val="20"/>
+              </w:rPr>
+              <w:t xml:space="preserve">Run</w:t>
+            </w:r>
+          </w:p>
+        </w:tc>
+        <w:tc>
+          <w:tcPr>
+            <w:tcW w:type="dxa" w:w="1189"/>
+            <w:tcBorders>
+              <w:top w:val="single" w:color="808080" w:sz="4"/>
+              <w:left w:val="single" w:color="808080" w:sz="4"/>
+              <w:bottom w:val="single" w:color="808080" w:sz="4"/>
+              <w:right w:val="single" w:color="808080" w:sz="4"/>
+            </w:tcBorders>
+            <w:shd w:fill="D9E2F3" w:color="auto" w:val="clear"/>
+            <w:tcMar>
+              <w:top w:type="dxa" w:w="60"/>
+              <w:left w:type="dxa" w:w="100"/>
+              <w:bottom w:type="dxa" w:w="60"/>
+              <w:right w:type="dxa" w:w="100"/>
+            </w:tcMar>
+          </w:tcPr>
+          <w:p>
+            <w:r>
+              <w:rPr>
+                <w:rFonts w:ascii="Calibri" w:cs="Calibri" w:eastAsia="Calibri" w:hAnsi="Calibri"/>
+                <w:b/>
+                <w:bCs/>
+                <w:sz w:val="20"/>
+                <w:szCs w:val="20"/>
+              </w:rPr>
+              <w:t xml:space="preserve">Serial A (s)</w:t>
+            </w:r>
+          </w:p>
+        </w:tc>
+        <w:tc>
+          <w:tcPr>
+            <w:tcW w:type="dxa" w:w="1189"/>
+            <w:tcBorders>
+              <w:top w:val="single" w:color="808080" w:sz="4"/>
+              <w:left w:val="single" w:color="808080" w:sz="4"/>
+              <w:bottom w:val="single" w:color="808080" w:sz="4"/>
+              <w:right w:val="single" w:color="808080" w:sz="4"/>
+            </w:tcBorders>
+            <w:shd w:fill="D9E2F3" w:color="auto" w:val="clear"/>
+            <w:tcMar>
+              <w:top w:type="dxa" w:w="60"/>
+              <w:left w:type="dxa" w:w="100"/>
+              <w:bottom w:type="dxa" w:w="60"/>
+              <w:right w:type="dxa" w:w="100"/>
+            </w:tcMar>
+          </w:tcPr>
+          <w:p>
+            <w:r>
+              <w:rPr>
+                <w:rFonts w:ascii="Calibri" w:cs="Calibri" w:eastAsia="Calibri" w:hAnsi="Calibri"/>
+                <w:b/>
+                <w:bCs/>
+                <w:sz w:val="20"/>
+                <w:szCs w:val="20"/>
+              </w:rPr>
+              <w:t xml:space="preserve">Serial B (s)</w:t>
+            </w:r>
+          </w:p>
+        </w:tc>
+        <w:tc>
+          <w:tcPr>
+            <w:tcW w:type="dxa" w:w="1189"/>
+            <w:tcBorders>
+              <w:top w:val="single" w:color="808080" w:sz="4"/>
+              <w:left w:val="single" w:color="808080" w:sz="4"/>
+              <w:bottom w:val="single" w:color="808080" w:sz="4"/>
+              <w:right w:val="single" w:color="808080" w:sz="4"/>
+            </w:tcBorders>
+            <w:shd w:fill="D9E2F3" w:color="auto" w:val="clear"/>
+            <w:tcMar>
+              <w:top w:type="dxa" w:w="60"/>
+              <w:left w:type="dxa" w:w="100"/>
+              <w:bottom w:type="dxa" w:w="60"/>
+              <w:right w:type="dxa" w:w="100"/>
+            </w:tcMar>
+          </w:tcPr>
+          <w:p>
+            <w:r>
+              <w:rPr>
+                <w:rFonts w:ascii="Calibri" w:cs="Calibri" w:eastAsia="Calibri" w:hAnsi="Calibri"/>
+                <w:b/>
+                <w:bCs/>
+                <w:sz w:val="20"/>
+                <w:szCs w:val="20"/>
+              </w:rPr>
+              <w:t xml:space="preserve">Serial C (s)</w:t>
+            </w:r>
+          </w:p>
+        </w:tc>
+        <w:tc>
+          <w:tcPr>
+            <w:tcW w:type="dxa" w:w="1189"/>
+            <w:tcBorders>
+              <w:top w:val="single" w:color="808080" w:sz="4"/>
+              <w:left w:val="single" w:color="808080" w:sz="4"/>
+              <w:bottom w:val="single" w:color="808080" w:sz="4"/>
+              <w:right w:val="single" w:color="808080" w:sz="4"/>
+            </w:tcBorders>
+            <w:shd w:fill="D9E2F3" w:color="auto" w:val="clear"/>
+            <w:tcMar>
+              <w:top w:type="dxa" w:w="60"/>
+              <w:left w:type="dxa" w:w="100"/>
+              <w:bottom w:type="dxa" w:w="60"/>
+              <w:right w:type="dxa" w:w="100"/>
+            </w:tcMar>
+          </w:tcPr>
+          <w:p>
+            <w:r>
+              <w:rPr>
+                <w:rFonts w:ascii="Calibri" w:cs="Calibri" w:eastAsia="Calibri" w:hAnsi="Calibri"/>
+                <w:b/>
+                <w:bCs/>
+                <w:sz w:val="20"/>
+                <w:szCs w:val="20"/>
+              </w:rPr>
+              <w:t xml:space="preserve">Serial total (s)</w:t>
+            </w:r>
+          </w:p>
+        </w:tc>
+        <w:tc>
+          <w:tcPr>
+            <w:tcW w:type="dxa" w:w="1189"/>
+            <w:tcBorders>
+              <w:top w:val="single" w:color="808080" w:sz="4"/>
+              <w:left w:val="single" w:color="808080" w:sz="4"/>
+              <w:bottom w:val="single" w:color="808080" w:sz="4"/>
+              <w:right w:val="single" w:color="808080" w:sz="4"/>
+            </w:tcBorders>
+            <w:shd w:fill="D9E2F3" w:color="auto" w:val="clear"/>
+            <w:tcMar>
+              <w:top w:type="dxa" w:w="60"/>
+              <w:left w:type="dxa" w:w="100"/>
+              <w:bottom w:type="dxa" w:w="60"/>
+              <w:right w:type="dxa" w:w="100"/>
+            </w:tcMar>
+          </w:tcPr>
+          <w:p>
+            <w:r>
+              <w:rPr>
+                <w:rFonts w:ascii="Calibri" w:cs="Calibri" w:eastAsia="Calibri" w:hAnsi="Calibri"/>
+                <w:b/>
+                <w:bCs/>
+                <w:sz w:val="20"/>
+                <w:szCs w:val="20"/>
+              </w:rPr>
+              <w:t xml:space="preserve">Wall (s)</w:t>
+            </w:r>
+          </w:p>
+        </w:tc>
+        <w:tc>
+          <w:tcPr>
+            <w:tcW w:type="dxa" w:w="1189"/>
+            <w:tcBorders>
+              <w:top w:val="single" w:color="808080" w:sz="4"/>
+              <w:left w:val="single" w:color="808080" w:sz="4"/>
+              <w:bottom w:val="single" w:color="808080" w:sz="4"/>
+              <w:right w:val="single" w:color="808080" w:sz="4"/>
+            </w:tcBorders>
+            <w:shd w:fill="D9E2F3" w:color="auto" w:val="clear"/>
+            <w:tcMar>
+              <w:top w:type="dxa" w:w="60"/>
+              <w:left w:type="dxa" w:w="100"/>
+              <w:bottom w:type="dxa" w:w="60"/>
+              <w:right w:type="dxa" w:w="100"/>
+            </w:tcMar>
+          </w:tcPr>
+          <w:p>
+            <w:r>
+              <w:rPr>
+                <w:rFonts w:ascii="Calibri" w:cs="Calibri" w:eastAsia="Calibri" w:hAnsi="Calibri"/>
+                <w:b/>
+                <w:bCs/>
+                <w:sz w:val="20"/>
+                <w:szCs w:val="20"/>
+              </w:rPr>
+              <w:t xml:space="preserve">Speedup</w:t>
+            </w:r>
+          </w:p>
+        </w:tc>
+        <w:tc>
+          <w:tcPr>
+            <w:tcW w:type="dxa" w:w="1192"/>
+            <w:tcBorders>
+              <w:top w:val="single" w:color="808080" w:sz="4"/>
+              <w:left w:val="single" w:color="808080" w:sz="4"/>
+              <w:bottom w:val="single" w:color="808080" w:sz="4"/>
+              <w:right w:val="single" w:color="808080" w:sz="4"/>
+            </w:tcBorders>
+            <w:shd w:fill="D9E2F3" w:color="auto" w:val="clear"/>
+            <w:tcMar>
+              <w:top w:type="dxa" w:w="60"/>
+              <w:left w:type="dxa" w:w="100"/>
+              <w:bottom w:type="dxa" w:w="60"/>
+              <w:right w:type="dxa" w:w="100"/>
+            </w:tcMar>
+          </w:tcPr>
+          <w:p>
+            <w:r>
+              <w:rPr>
+                <w:rFonts w:ascii="Calibri" w:cs="Calibri" w:eastAsia="Calibri" w:hAnsi="Calibri"/>
+                <w:b/>
+                <w:bCs/>
+                <w:sz w:val="20"/>
+                <w:szCs w:val="20"/>
+              </w:rPr>
+              <w:t xml:space="preserve">Thread of A / B / C</w:t>
+            </w:r>
+          </w:p>
+        </w:tc>
+      </w:tr>
+      <w:tr>
+        <w:tc>
+          <w:tcPr>
+            <w:tcW w:type="dxa" w:w="700"/>
+            <w:tcBorders>
+              <w:top w:val="single" w:color="808080" w:sz="4"/>
+              <w:left w:val="single" w:color="808080" w:sz="4"/>
+              <w:bottom w:val="single" w:color="808080" w:sz="4"/>
+              <w:right w:val="single" w:color="808080" w:sz="4"/>
+            </w:tcBorders>
+            <w:tcMar>
+              <w:top w:type="dxa" w:w="60"/>
+              <w:left w:type="dxa" w:w="100"/>
+              <w:bottom w:type="dxa" w:w="60"/>
+              <w:right w:type="dxa" w:w="100"/>
+            </w:tcMar>
+          </w:tcPr>
+          <w:p>
+            <w:r>
+              <w:rPr>
+                <w:rFonts w:ascii="Calibri" w:cs="Calibri" w:eastAsia="Calibri" w:hAnsi="Calibri"/>
+                <w:b/>
+                <w:bCs/>
+                <w:sz w:val="20"/>
+                <w:szCs w:val="20"/>
+              </w:rPr>
+              <w:t xml:space="preserve">1</w:t>
+            </w:r>
+          </w:p>
+        </w:tc>
+        <w:tc>
+          <w:tcPr>
+            <w:tcW w:type="dxa" w:w="1189"/>
+            <w:tcBorders>
+              <w:top w:val="single" w:color="808080" w:sz="4"/>
+              <w:left w:val="single" w:color="808080" w:sz="4"/>
+              <w:bottom w:val="single" w:color="808080" w:sz="4"/>
+              <w:right w:val="single" w:color="808080" w:sz="4"/>
+            </w:tcBorders>
+            <w:tcMar>
+              <w:top w:type="dxa" w:w="60"/>
+              <w:left w:type="dxa" w:w="100"/>
+              <w:bottom w:type="dxa" w:w="60"/>
+              <w:right w:type="dxa" w:w="100"/>
+            </w:tcMar>
+          </w:tcPr>
+          <w:p>
+            <w:r>
+              <w:rPr>
+                <w:rFonts w:ascii="Calibri" w:cs="Calibri" w:eastAsia="Calibri" w:hAnsi="Calibri"/>
+                <w:b w:val="false"/>
+                <w:bCs w:val="false"/>
+                <w:sz w:val="20"/>
+                <w:szCs w:val="20"/>
+              </w:rPr>
+              <w:t xml:space="preserve">0.719</w:t>
+            </w:r>
+          </w:p>
+        </w:tc>
+        <w:tc>
+          <w:tcPr>
+            <w:tcW w:type="dxa" w:w="1189"/>
+            <w:tcBorders>
+              <w:top w:val="single" w:color="808080" w:sz="4"/>
+              <w:left w:val="single" w:color="808080" w:sz="4"/>
+              <w:bottom w:val="single" w:color="808080" w:sz="4"/>
+              <w:right w:val="single" w:color="808080" w:sz="4"/>
+            </w:tcBorders>
+            <w:tcMar>
+              <w:top w:type="dxa" w:w="60"/>
+              <w:left w:type="dxa" w:w="100"/>
+              <w:bottom w:type="dxa" w:w="60"/>
+              <w:right w:type="dxa" w:w="100"/>
+            </w:tcMar>
+          </w:tcPr>
+          <w:p>
+            <w:r>
+              <w:rPr>
+                <w:rFonts w:ascii="Calibri" w:cs="Calibri" w:eastAsia="Calibri" w:hAnsi="Calibri"/>
+                <w:b w:val="false"/>
+                <w:bCs w:val="false"/>
+                <w:sz w:val="20"/>
+                <w:szCs w:val="20"/>
+              </w:rPr>
+              <w:t xml:space="preserve">0.584</w:t>
+            </w:r>
+          </w:p>
+        </w:tc>
+        <w:tc>
+          <w:tcPr>
+            <w:tcW w:type="dxa" w:w="1189"/>
+            <w:tcBorders>
+              <w:top w:val="single" w:color="808080" w:sz="4"/>
+              <w:left w:val="single" w:color="808080" w:sz="4"/>
+              <w:bottom w:val="single" w:color="808080" w:sz="4"/>
+              <w:right w:val="single" w:color="808080" w:sz="4"/>
+            </w:tcBorders>
+            <w:tcMar>
+              <w:top w:type="dxa" w:w="60"/>
+              <w:left w:type="dxa" w:w="100"/>
+              <w:bottom w:type="dxa" w:w="60"/>
+              <w:right w:type="dxa" w:w="100"/>
+            </w:tcMar>
+          </w:tcPr>
+          <w:p>
+            <w:r>
+              <w:rPr>
+                <w:rFonts w:ascii="Calibri" w:cs="Calibri" w:eastAsia="Calibri" w:hAnsi="Calibri"/>
+                <w:b w:val="false"/>
+                <w:bCs w:val="false"/>
+                <w:sz w:val="20"/>
+                <w:szCs w:val="20"/>
+              </w:rPr>
+              <w:t xml:space="preserve">0.584</w:t>
+            </w:r>
+          </w:p>
+        </w:tc>
+        <w:tc>
+          <w:tcPr>
+            <w:tcW w:type="dxa" w:w="1189"/>
+            <w:tcBorders>
+              <w:top w:val="single" w:color="808080" w:sz="4"/>
+              <w:left w:val="single" w:color="808080" w:sz="4"/>
+              <w:bottom w:val="single" w:color="808080" w:sz="4"/>
+              <w:right w:val="single" w:color="808080" w:sz="4"/>
+            </w:tcBorders>
+            <w:tcMar>
+              <w:top w:type="dxa" w:w="60"/>
+              <w:left w:type="dxa" w:w="100"/>
+              <w:bottom w:type="dxa" w:w="60"/>
+              <w:right w:type="dxa" w:w="100"/>
+            </w:tcMar>
+          </w:tcPr>
+          <w:p>
+            <w:r>
+              <w:rPr>
+                <w:rFonts w:ascii="Calibri" w:cs="Calibri" w:eastAsia="Calibri" w:hAnsi="Calibri"/>
+                <w:b w:val="false"/>
+                <w:bCs w:val="false"/>
+                <w:sz w:val="20"/>
+                <w:szCs w:val="20"/>
+              </w:rPr>
+              <w:t xml:space="preserve">1.886</w:t>
+            </w:r>
+          </w:p>
+        </w:tc>
+        <w:tc>
+          <w:tcPr>
+            <w:tcW w:type="dxa" w:w="1189"/>
+            <w:tcBorders>
+              <w:top w:val="single" w:color="808080" w:sz="4"/>
+              <w:left w:val="single" w:color="808080" w:sz="4"/>
+              <w:bottom w:val="single" w:color="808080" w:sz="4"/>
+              <w:right w:val="single" w:color="808080" w:sz="4"/>
+            </w:tcBorders>
+            <w:tcMar>
+              <w:top w:type="dxa" w:w="60"/>
+              <w:left w:type="dxa" w:w="100"/>
+              <w:bottom w:type="dxa" w:w="60"/>
+              <w:right w:type="dxa" w:w="100"/>
+            </w:tcMar>
+          </w:tcPr>
+          <w:p>
+            <w:r>
+              <w:rPr>
+                <w:rFonts w:ascii="Calibri" w:cs="Calibri" w:eastAsia="Calibri" w:hAnsi="Calibri"/>
+                <w:b w:val="false"/>
+                <w:bCs w:val="false"/>
+                <w:sz w:val="20"/>
+                <w:szCs w:val="20"/>
+              </w:rPr>
+              <w:t xml:space="preserve">1.123</w:t>
+            </w:r>
+          </w:p>
+        </w:tc>
+        <w:tc>
+          <w:tcPr>
+            <w:tcW w:type="dxa" w:w="1189"/>
+            <w:tcBorders>
+              <w:top w:val="single" w:color="808080" w:sz="4"/>
+              <w:left w:val="single" w:color="808080" w:sz="4"/>
+              <w:bottom w:val="single" w:color="808080" w:sz="4"/>
+              <w:right w:val="single" w:color="808080" w:sz="4"/>
+            </w:tcBorders>
+            <w:tcMar>
+              <w:top w:type="dxa" w:w="60"/>
+              <w:left w:type="dxa" w:w="100"/>
+              <w:bottom w:type="dxa" w:w="60"/>
+              <w:right w:type="dxa" w:w="100"/>
+            </w:tcMar>
+          </w:tcPr>
+          <w:p>
+            <w:r>
+              <w:rPr>
+                <w:rFonts w:ascii="Calibri" w:cs="Calibri" w:eastAsia="Calibri" w:hAnsi="Calibri"/>
+                <w:b w:val="false"/>
+                <w:bCs w:val="false"/>
+                <w:sz w:val="20"/>
+                <w:szCs w:val="20"/>
+              </w:rPr>
+              <w:t xml:space="preserve">1.68</w:t>
+            </w:r>
+          </w:p>
+        </w:tc>
+        <w:tc>
+          <w:tcPr>
+            <w:tcW w:type="dxa" w:w="1192"/>
+            <w:tcBorders>
+              <w:top w:val="single" w:color="808080" w:sz="4"/>
+              <w:left w:val="single" w:color="808080" w:sz="4"/>
+              <w:bottom w:val="single" w:color="808080" w:sz="4"/>
+              <w:right w:val="single" w:color="808080" w:sz="4"/>
+            </w:tcBorders>
+            <w:tcMar>
+              <w:top w:type="dxa" w:w="60"/>
+              <w:left w:type="dxa" w:w="100"/>
+              <w:bottom w:type="dxa" w:w="60"/>
+              <w:right w:type="dxa" w:w="100"/>
+            </w:tcMar>
+          </w:tcPr>
+          <w:p>
+            <w:r>
+              <w:rPr>
+                <w:rFonts w:ascii="Calibri" w:cs="Calibri" w:eastAsia="Calibri" w:hAnsi="Calibri"/>
+                <w:b w:val="false"/>
+                <w:bCs w:val="false"/>
+                <w:sz w:val="20"/>
+                <w:szCs w:val="20"/>
+              </w:rPr>
+              <w:t xml:space="preserve">2 / 4 / 6</w:t>
+            </w:r>
+          </w:p>
+        </w:tc>
+      </w:tr>
+      <w:tr>
+        <w:tc>
+          <w:tcPr>
+            <w:tcW w:type="dxa" w:w="700"/>
+            <w:tcBorders>
+              <w:top w:val="single" w:color="808080" w:sz="4"/>
+              <w:left w:val="single" w:color="808080" w:sz="4"/>
+              <w:bottom w:val="single" w:color="808080" w:sz="4"/>
+              <w:right w:val="single" w:color="808080" w:sz="4"/>
+            </w:tcBorders>
+            <w:tcMar>
+              <w:top w:type="dxa" w:w="60"/>
+              <w:left w:type="dxa" w:w="100"/>
+              <w:bottom w:type="dxa" w:w="60"/>
+              <w:right w:type="dxa" w:w="100"/>
+            </w:tcMar>
+          </w:tcPr>
+          <w:p>
+            <w:r>
+              <w:rPr>
+                <w:rFonts w:ascii="Calibri" w:cs="Calibri" w:eastAsia="Calibri" w:hAnsi="Calibri"/>
+                <w:b/>
+                <w:bCs/>
+                <w:sz w:val="20"/>
+                <w:szCs w:val="20"/>
+              </w:rPr>
+              <w:t xml:space="preserve">2</w:t>
+            </w:r>
+          </w:p>
+        </w:tc>
+        <w:tc>
+          <w:tcPr>
+            <w:tcW w:type="dxa" w:w="1189"/>
+            <w:tcBorders>
+              <w:top w:val="single" w:color="808080" w:sz="4"/>
+              <w:left w:val="single" w:color="808080" w:sz="4"/>
+              <w:bottom w:val="single" w:color="808080" w:sz="4"/>
+              <w:right w:val="single" w:color="808080" w:sz="4"/>
+            </w:tcBorders>
+            <w:tcMar>
+              <w:top w:type="dxa" w:w="60"/>
+              <w:left w:type="dxa" w:w="100"/>
+              <w:bottom w:type="dxa" w:w="60"/>
+              <w:right w:type="dxa" w:w="100"/>
+            </w:tcMar>
+          </w:tcPr>
+          <w:p>
+            <w:r>
+              <w:rPr>
+                <w:rFonts w:ascii="Calibri" w:cs="Calibri" w:eastAsia="Calibri" w:hAnsi="Calibri"/>
+                <w:b w:val="false"/>
+                <w:bCs w:val="false"/>
+                <w:sz w:val="20"/>
+                <w:szCs w:val="20"/>
+              </w:rPr>
+              <w:t xml:space="preserve">0.646</w:t>
+            </w:r>
+          </w:p>
+        </w:tc>
+        <w:tc>
+          <w:tcPr>
+            <w:tcW w:type="dxa" w:w="1189"/>
+            <w:tcBorders>
+              <w:top w:val="single" w:color="808080" w:sz="4"/>
+              <w:left w:val="single" w:color="808080" w:sz="4"/>
+              <w:bottom w:val="single" w:color="808080" w:sz="4"/>
+              <w:right w:val="single" w:color="808080" w:sz="4"/>
+            </w:tcBorders>
+            <w:tcMar>
+              <w:top w:type="dxa" w:w="60"/>
+              <w:left w:type="dxa" w:w="100"/>
+              <w:bottom w:type="dxa" w:w="60"/>
+              <w:right w:type="dxa" w:w="100"/>
+            </w:tcMar>
+          </w:tcPr>
+          <w:p>
+            <w:r>
+              <w:rPr>
+                <w:rFonts w:ascii="Calibri" w:cs="Calibri" w:eastAsia="Calibri" w:hAnsi="Calibri"/>
+                <w:b w:val="false"/>
+                <w:bCs w:val="false"/>
+                <w:sz w:val="20"/>
+                <w:szCs w:val="20"/>
+              </w:rPr>
+              <w:t xml:space="preserve">0.573</w:t>
+            </w:r>
+          </w:p>
+        </w:tc>
+        <w:tc>
+          <w:tcPr>
+            <w:tcW w:type="dxa" w:w="1189"/>
+            <w:tcBorders>
+              <w:top w:val="single" w:color="808080" w:sz="4"/>
+              <w:left w:val="single" w:color="808080" w:sz="4"/>
+              <w:bottom w:val="single" w:color="808080" w:sz="4"/>
+              <w:right w:val="single" w:color="808080" w:sz="4"/>
+            </w:tcBorders>
+            <w:tcMar>
+              <w:top w:type="dxa" w:w="60"/>
+              <w:left w:type="dxa" w:w="100"/>
+              <w:bottom w:type="dxa" w:w="60"/>
+              <w:right w:type="dxa" w:w="100"/>
+            </w:tcMar>
+          </w:tcPr>
+          <w:p>
+            <w:r>
+              <w:rPr>
+                <w:rFonts w:ascii="Calibri" w:cs="Calibri" w:eastAsia="Calibri" w:hAnsi="Calibri"/>
+                <w:b w:val="false"/>
+                <w:bCs w:val="false"/>
+                <w:sz w:val="20"/>
+                <w:szCs w:val="20"/>
+              </w:rPr>
+              <w:t xml:space="preserve">0.552</w:t>
+            </w:r>
+          </w:p>
+        </w:tc>
+        <w:tc>
+          <w:tcPr>
+            <w:tcW w:type="dxa" w:w="1189"/>
+            <w:tcBorders>
+              <w:top w:val="single" w:color="808080" w:sz="4"/>
+              <w:left w:val="single" w:color="808080" w:sz="4"/>
+              <w:bottom w:val="single" w:color="808080" w:sz="4"/>
+              <w:right w:val="single" w:color="808080" w:sz="4"/>
+            </w:tcBorders>
+            <w:tcMar>
+              <w:top w:type="dxa" w:w="60"/>
+              <w:left w:type="dxa" w:w="100"/>
+              <w:bottom w:type="dxa" w:w="60"/>
+              <w:right w:type="dxa" w:w="100"/>
+            </w:tcMar>
+          </w:tcPr>
+          <w:p>
+            <w:r>
+              <w:rPr>
+                <w:rFonts w:ascii="Calibri" w:cs="Calibri" w:eastAsia="Calibri" w:hAnsi="Calibri"/>
+                <w:b w:val="false"/>
+                <w:bCs w:val="false"/>
+                <w:sz w:val="20"/>
+                <w:szCs w:val="20"/>
+              </w:rPr>
+              <w:t xml:space="preserve">1.772</w:t>
+            </w:r>
+          </w:p>
+        </w:tc>
+        <w:tc>
+          <w:tcPr>
+            <w:tcW w:type="dxa" w:w="1189"/>
+            <w:tcBorders>
+              <w:top w:val="single" w:color="808080" w:sz="4"/>
+              <w:left w:val="single" w:color="808080" w:sz="4"/>
+              <w:bottom w:val="single" w:color="808080" w:sz="4"/>
+              <w:right w:val="single" w:color="808080" w:sz="4"/>
+            </w:tcBorders>
+            <w:tcMar>
+              <w:top w:type="dxa" w:w="60"/>
+              <w:left w:type="dxa" w:w="100"/>
+              <w:bottom w:type="dxa" w:w="60"/>
+              <w:right w:type="dxa" w:w="100"/>
+            </w:tcMar>
+          </w:tcPr>
+          <w:p>
+            <w:r>
+              <w:rPr>
+                <w:rFonts w:ascii="Calibri" w:cs="Calibri" w:eastAsia="Calibri" w:hAnsi="Calibri"/>
+                <w:b w:val="false"/>
+                <w:bCs w:val="false"/>
+                <w:sz w:val="20"/>
+                <w:szCs w:val="20"/>
+              </w:rPr>
+              <w:t xml:space="preserve">1.120</w:t>
+            </w:r>
+          </w:p>
+        </w:tc>
+        <w:tc>
+          <w:tcPr>
+            <w:tcW w:type="dxa" w:w="1189"/>
+            <w:tcBorders>
+              <w:top w:val="single" w:color="808080" w:sz="4"/>
+              <w:left w:val="single" w:color="808080" w:sz="4"/>
+              <w:bottom w:val="single" w:color="808080" w:sz="4"/>
+              <w:right w:val="single" w:color="808080" w:sz="4"/>
+            </w:tcBorders>
+            <w:tcMar>
+              <w:top w:type="dxa" w:w="60"/>
+              <w:left w:type="dxa" w:w="100"/>
+              <w:bottom w:type="dxa" w:w="60"/>
+              <w:right w:type="dxa" w:w="100"/>
+            </w:tcMar>
+          </w:tcPr>
+          <w:p>
+            <w:r>
+              <w:rPr>
+                <w:rFonts w:ascii="Calibri" w:cs="Calibri" w:eastAsia="Calibri" w:hAnsi="Calibri"/>
+                <w:b w:val="false"/>
+                <w:bCs w:val="false"/>
+                <w:sz w:val="20"/>
+                <w:szCs w:val="20"/>
+              </w:rPr>
+              <w:t xml:space="preserve">1.58</w:t>
+            </w:r>
+          </w:p>
+        </w:tc>
+        <w:tc>
+          <w:tcPr>
+            <w:tcW w:type="dxa" w:w="1192"/>
+            <w:tcBorders>
+              <w:top w:val="single" w:color="808080" w:sz="4"/>
+              <w:left w:val="single" w:color="808080" w:sz="4"/>
+              <w:bottom w:val="single" w:color="808080" w:sz="4"/>
+              <w:right w:val="single" w:color="808080" w:sz="4"/>
+            </w:tcBorders>
+            <w:tcMar>
+              <w:top w:type="dxa" w:w="60"/>
+              <w:left w:type="dxa" w:w="100"/>
+              <w:bottom w:type="dxa" w:w="60"/>
+              <w:right w:type="dxa" w:w="100"/>
+            </w:tcMar>
+          </w:tcPr>
+          <w:p>
+            <w:r>
+              <w:rPr>
+                <w:rFonts w:ascii="Calibri" w:cs="Calibri" w:eastAsia="Calibri" w:hAnsi="Calibri"/>
+                <w:b w:val="false"/>
+                <w:bCs w:val="false"/>
+                <w:sz w:val="20"/>
+                <w:szCs w:val="20"/>
+              </w:rPr>
+              <w:t xml:space="preserve">2 / 4 / 6</w:t>
+            </w:r>
+          </w:p>
+        </w:tc>
+      </w:tr>
+      <w:tr>
+        <w:tc>
+          <w:tcPr>
+            <w:tcW w:type="dxa" w:w="700"/>
+            <w:tcBorders>
+              <w:top w:val="single" w:color="808080" w:sz="4"/>
+              <w:left w:val="single" w:color="808080" w:sz="4"/>
+              <w:bottom w:val="single" w:color="808080" w:sz="4"/>
+              <w:right w:val="single" w:color="808080" w:sz="4"/>
+            </w:tcBorders>
+            <w:tcMar>
+              <w:top w:type="dxa" w:w="60"/>
+              <w:left w:type="dxa" w:w="100"/>
+              <w:bottom w:type="dxa" w:w="60"/>
+              <w:right w:type="dxa" w:w="100"/>
+            </w:tcMar>
+          </w:tcPr>
+          <w:p>
+            <w:r>
+              <w:rPr>
+                <w:rFonts w:ascii="Calibri" w:cs="Calibri" w:eastAsia="Calibri" w:hAnsi="Calibri"/>
+                <w:b/>
+                <w:bCs/>
+                <w:sz w:val="20"/>
+                <w:szCs w:val="20"/>
+              </w:rPr>
+              <w:t xml:space="preserve">3</w:t>
+            </w:r>
+          </w:p>
+        </w:tc>
+        <w:tc>
+          <w:tcPr>
+            <w:tcW w:type="dxa" w:w="1189"/>
+            <w:tcBorders>
+              <w:top w:val="single" w:color="808080" w:sz="4"/>
+              <w:left w:val="single" w:color="808080" w:sz="4"/>
+              <w:bottom w:val="single" w:color="808080" w:sz="4"/>
+              <w:right w:val="single" w:color="808080" w:sz="4"/>
+            </w:tcBorders>
+            <w:tcMar>
+              <w:top w:type="dxa" w:w="60"/>
+              <w:left w:type="dxa" w:w="100"/>
+              <w:bottom w:type="dxa" w:w="60"/>
+              <w:right w:type="dxa" w:w="100"/>
+            </w:tcMar>
+          </w:tcPr>
+          <w:p>
+            <w:r>
+              <w:rPr>
+                <w:rFonts w:ascii="Calibri" w:cs="Calibri" w:eastAsia="Calibri" w:hAnsi="Calibri"/>
+                <w:b w:val="false"/>
+                <w:bCs w:val="false"/>
+                <w:sz w:val="20"/>
+                <w:szCs w:val="20"/>
+              </w:rPr>
+              <w:t xml:space="preserve">0.669</w:t>
+            </w:r>
+          </w:p>
+        </w:tc>
+        <w:tc>
+          <w:tcPr>
+            <w:tcW w:type="dxa" w:w="1189"/>
+            <w:tcBorders>
+              <w:top w:val="single" w:color="808080" w:sz="4"/>
+              <w:left w:val="single" w:color="808080" w:sz="4"/>
+              <w:bottom w:val="single" w:color="808080" w:sz="4"/>
+              <w:right w:val="single" w:color="808080" w:sz="4"/>
+            </w:tcBorders>
+            <w:tcMar>
+              <w:top w:type="dxa" w:w="60"/>
+              <w:left w:type="dxa" w:w="100"/>
+              <w:bottom w:type="dxa" w:w="60"/>
+              <w:right w:type="dxa" w:w="100"/>
+            </w:tcMar>
+          </w:tcPr>
+          <w:p>
+            <w:r>
+              <w:rPr>
+                <w:rFonts w:ascii="Calibri" w:cs="Calibri" w:eastAsia="Calibri" w:hAnsi="Calibri"/>
+                <w:b w:val="false"/>
+                <w:bCs w:val="false"/>
+                <w:sz w:val="20"/>
+                <w:szCs w:val="20"/>
+              </w:rPr>
+              <w:t xml:space="preserve">0.584</w:t>
+            </w:r>
+          </w:p>
+        </w:tc>
+        <w:tc>
+          <w:tcPr>
+            <w:tcW w:type="dxa" w:w="1189"/>
+            <w:tcBorders>
+              <w:top w:val="single" w:color="808080" w:sz="4"/>
+              <w:left w:val="single" w:color="808080" w:sz="4"/>
+              <w:bottom w:val="single" w:color="808080" w:sz="4"/>
+              <w:right w:val="single" w:color="808080" w:sz="4"/>
+            </w:tcBorders>
+            <w:tcMar>
+              <w:top w:type="dxa" w:w="60"/>
+              <w:left w:type="dxa" w:w="100"/>
+              <w:bottom w:type="dxa" w:w="60"/>
+              <w:right w:type="dxa" w:w="100"/>
+            </w:tcMar>
+          </w:tcPr>
+          <w:p>
+            <w:r>
+              <w:rPr>
+                <w:rFonts w:ascii="Calibri" w:cs="Calibri" w:eastAsia="Calibri" w:hAnsi="Calibri"/>
+                <w:b w:val="false"/>
+                <w:bCs w:val="false"/>
+                <w:sz w:val="20"/>
+                <w:szCs w:val="20"/>
+              </w:rPr>
+              <w:t xml:space="preserve">0.545</w:t>
+            </w:r>
+          </w:p>
+        </w:tc>
+        <w:tc>
+          <w:tcPr>
+            <w:tcW w:type="dxa" w:w="1189"/>
+            <w:tcBorders>
+              <w:top w:val="single" w:color="808080" w:sz="4"/>
+              <w:left w:val="single" w:color="808080" w:sz="4"/>
+              <w:bottom w:val="single" w:color="808080" w:sz="4"/>
+              <w:right w:val="single" w:color="808080" w:sz="4"/>
+            </w:tcBorders>
+            <w:tcMar>
+              <w:top w:type="dxa" w:w="60"/>
+              <w:left w:type="dxa" w:w="100"/>
+              <w:bottom w:type="dxa" w:w="60"/>
+              <w:right w:type="dxa" w:w="100"/>
+            </w:tcMar>
+          </w:tcPr>
+          <w:p>
+            <w:r>
+              <w:rPr>
+                <w:rFonts w:ascii="Calibri" w:cs="Calibri" w:eastAsia="Calibri" w:hAnsi="Calibri"/>
+                <w:b w:val="false"/>
+                <w:bCs w:val="false"/>
+                <w:sz w:val="20"/>
+                <w:szCs w:val="20"/>
+              </w:rPr>
+              <w:t xml:space="preserve">1.798</w:t>
+            </w:r>
+          </w:p>
+        </w:tc>
+        <w:tc>
+          <w:tcPr>
+            <w:tcW w:type="dxa" w:w="1189"/>
+            <w:tcBorders>
+              <w:top w:val="single" w:color="808080" w:sz="4"/>
+              <w:left w:val="single" w:color="808080" w:sz="4"/>
+              <w:bottom w:val="single" w:color="808080" w:sz="4"/>
+              <w:right w:val="single" w:color="808080" w:sz="4"/>
+            </w:tcBorders>
+            <w:tcMar>
+              <w:top w:type="dxa" w:w="60"/>
+              <w:left w:type="dxa" w:w="100"/>
+              <w:bottom w:type="dxa" w:w="60"/>
+              <w:right w:type="dxa" w:w="100"/>
+            </w:tcMar>
+          </w:tcPr>
+          <w:p>
+            <w:r>
+              <w:rPr>
+                <w:rFonts w:ascii="Calibri" w:cs="Calibri" w:eastAsia="Calibri" w:hAnsi="Calibri"/>
+                <w:b w:val="false"/>
+                <w:bCs w:val="false"/>
+                <w:sz w:val="20"/>
+                <w:szCs w:val="20"/>
+              </w:rPr>
+              <w:t xml:space="preserve">1.053</w:t>
+            </w:r>
+          </w:p>
+        </w:tc>
+        <w:tc>
+          <w:tcPr>
+            <w:tcW w:type="dxa" w:w="1189"/>
+            <w:tcBorders>
+              <w:top w:val="single" w:color="808080" w:sz="4"/>
+              <w:left w:val="single" w:color="808080" w:sz="4"/>
+              <w:bottom w:val="single" w:color="808080" w:sz="4"/>
+              <w:right w:val="single" w:color="808080" w:sz="4"/>
+            </w:tcBorders>
+            <w:tcMar>
+              <w:top w:type="dxa" w:w="60"/>
+              <w:left w:type="dxa" w:w="100"/>
+              <w:bottom w:type="dxa" w:w="60"/>
+              <w:right w:type="dxa" w:w="100"/>
+            </w:tcMar>
+          </w:tcPr>
+          <w:p>
+            <w:r>
+              <w:rPr>
+                <w:rFonts w:ascii="Calibri" w:cs="Calibri" w:eastAsia="Calibri" w:hAnsi="Calibri"/>
+                <w:b w:val="false"/>
+                <w:bCs w:val="false"/>
+                <w:sz w:val="20"/>
+                <w:szCs w:val="20"/>
+              </w:rPr>
+              <w:t xml:space="preserve">1.71</w:t>
+            </w:r>
+          </w:p>
+        </w:tc>
+        <w:tc>
+          <w:tcPr>
+            <w:tcW w:type="dxa" w:w="1192"/>
+            <w:tcBorders>
+              <w:top w:val="single" w:color="808080" w:sz="4"/>
+              <w:left w:val="single" w:color="808080" w:sz="4"/>
+              <w:bottom w:val="single" w:color="808080" w:sz="4"/>
+              <w:right w:val="single" w:color="808080" w:sz="4"/>
+            </w:tcBorders>
+            <w:tcMar>
+              <w:top w:type="dxa" w:w="60"/>
+              <w:left w:type="dxa" w:w="100"/>
+              <w:bottom w:type="dxa" w:w="60"/>
+              <w:right w:type="dxa" w:w="100"/>
+            </w:tcMar>
+          </w:tcPr>
+          <w:p>
+            <w:r>
+              <w:rPr>
+                <w:rFonts w:ascii="Calibri" w:cs="Calibri" w:eastAsia="Calibri" w:hAnsi="Calibri"/>
+                <w:b w:val="false"/>
+                <w:bCs w:val="false"/>
+                <w:sz w:val="20"/>
+                <w:szCs w:val="20"/>
+              </w:rPr>
+              <w:t xml:space="preserve">2 / 4 / 6</w:t>
+            </w:r>
+          </w:p>
+        </w:tc>
+      </w:tr>
+      <w:tr>
+        <w:tc>
+          <w:tcPr>
+            <w:tcW w:type="dxa" w:w="700"/>
+            <w:tcBorders>
+              <w:top w:val="single" w:color="808080" w:sz="4"/>
+              <w:left w:val="single" w:color="808080" w:sz="4"/>
+              <w:bottom w:val="single" w:color="808080" w:sz="4"/>
+              <w:right w:val="single" w:color="808080" w:sz="4"/>
+            </w:tcBorders>
+            <w:tcMar>
+              <w:top w:type="dxa" w:w="60"/>
+              <w:left w:type="dxa" w:w="100"/>
+              <w:bottom w:type="dxa" w:w="60"/>
+              <w:right w:type="dxa" w:w="100"/>
+            </w:tcMar>
+          </w:tcPr>
+          <w:p>
+            <w:r>
+              <w:rPr>
+                <w:rFonts w:ascii="Calibri" w:cs="Calibri" w:eastAsia="Calibri" w:hAnsi="Calibri"/>
+                <w:b/>
+                <w:bCs/>
+                <w:sz w:val="20"/>
+                <w:szCs w:val="20"/>
+              </w:rPr>
+              <w:t xml:space="preserve">4</w:t>
+            </w:r>
+          </w:p>
+        </w:tc>
+        <w:tc>
+          <w:tcPr>
+            <w:tcW w:type="dxa" w:w="1189"/>
+            <w:tcBorders>
+              <w:top w:val="single" w:color="808080" w:sz="4"/>
+              <w:left w:val="single" w:color="808080" w:sz="4"/>
+              <w:bottom w:val="single" w:color="808080" w:sz="4"/>
+              <w:right w:val="single" w:color="808080" w:sz="4"/>
+            </w:tcBorders>
+            <w:tcMar>
+              <w:top w:type="dxa" w:w="60"/>
+              <w:left w:type="dxa" w:w="100"/>
+              <w:bottom w:type="dxa" w:w="60"/>
+              <w:right w:type="dxa" w:w="100"/>
+            </w:tcMar>
+          </w:tcPr>
+          <w:p>
+            <w:r>
+              <w:rPr>
+                <w:rFonts w:ascii="Calibri" w:cs="Calibri" w:eastAsia="Calibri" w:hAnsi="Calibri"/>
+                <w:b w:val="false"/>
+                <w:bCs w:val="false"/>
+                <w:sz w:val="20"/>
+                <w:szCs w:val="20"/>
+              </w:rPr>
+              <w:t xml:space="preserve">0.626</w:t>
+            </w:r>
+          </w:p>
+        </w:tc>
+        <w:tc>
+          <w:tcPr>
+            <w:tcW w:type="dxa" w:w="1189"/>
+            <w:tcBorders>
+              <w:top w:val="single" w:color="808080" w:sz="4"/>
+              <w:left w:val="single" w:color="808080" w:sz="4"/>
+              <w:bottom w:val="single" w:color="808080" w:sz="4"/>
+              <w:right w:val="single" w:color="808080" w:sz="4"/>
+            </w:tcBorders>
+            <w:tcMar>
+              <w:top w:type="dxa" w:w="60"/>
+              <w:left w:type="dxa" w:w="100"/>
+              <w:bottom w:type="dxa" w:w="60"/>
+              <w:right w:type="dxa" w:w="100"/>
+            </w:tcMar>
+          </w:tcPr>
+          <w:p>
+            <w:r>
+              <w:rPr>
+                <w:rFonts w:ascii="Calibri" w:cs="Calibri" w:eastAsia="Calibri" w:hAnsi="Calibri"/>
+                <w:b w:val="false"/>
+                <w:bCs w:val="false"/>
+                <w:sz w:val="20"/>
+                <w:szCs w:val="20"/>
+              </w:rPr>
+              <w:t xml:space="preserve">0.552</w:t>
+            </w:r>
+          </w:p>
+        </w:tc>
+        <w:tc>
+          <w:tcPr>
+            <w:tcW w:type="dxa" w:w="1189"/>
+            <w:tcBorders>
+              <w:top w:val="single" w:color="808080" w:sz="4"/>
+              <w:left w:val="single" w:color="808080" w:sz="4"/>
+              <w:bottom w:val="single" w:color="808080" w:sz="4"/>
+              <w:right w:val="single" w:color="808080" w:sz="4"/>
+            </w:tcBorders>
+            <w:tcMar>
+              <w:top w:type="dxa" w:w="60"/>
+              <w:left w:type="dxa" w:w="100"/>
+              <w:bottom w:type="dxa" w:w="60"/>
+              <w:right w:type="dxa" w:w="100"/>
+            </w:tcMar>
+          </w:tcPr>
+          <w:p>
+            <w:r>
+              <w:rPr>
+                <w:rFonts w:ascii="Calibri" w:cs="Calibri" w:eastAsia="Calibri" w:hAnsi="Calibri"/>
+                <w:b w:val="false"/>
+                <w:bCs w:val="false"/>
+                <w:sz w:val="20"/>
+                <w:szCs w:val="20"/>
+              </w:rPr>
+              <w:t xml:space="preserve">0.538</w:t>
+            </w:r>
+          </w:p>
+        </w:tc>
+        <w:tc>
+          <w:tcPr>
+            <w:tcW w:type="dxa" w:w="1189"/>
+            <w:tcBorders>
+              <w:top w:val="single" w:color="808080" w:sz="4"/>
+              <w:left w:val="single" w:color="808080" w:sz="4"/>
+              <w:bottom w:val="single" w:color="808080" w:sz="4"/>
+              <w:right w:val="single" w:color="808080" w:sz="4"/>
+            </w:tcBorders>
+            <w:tcMar>
+              <w:top w:type="dxa" w:w="60"/>
+              <w:left w:type="dxa" w:w="100"/>
+              <w:bottom w:type="dxa" w:w="60"/>
+              <w:right w:type="dxa" w:w="100"/>
+            </w:tcMar>
+          </w:tcPr>
+          <w:p>
+            <w:r>
+              <w:rPr>
+                <w:rFonts w:ascii="Calibri" w:cs="Calibri" w:eastAsia="Calibri" w:hAnsi="Calibri"/>
+                <w:b w:val="false"/>
+                <w:bCs w:val="false"/>
+                <w:sz w:val="20"/>
+                <w:szCs w:val="20"/>
+              </w:rPr>
+              <w:t xml:space="preserve">1.716</w:t>
+            </w:r>
+          </w:p>
+        </w:tc>
+        <w:tc>
+          <w:tcPr>
+            <w:tcW w:type="dxa" w:w="1189"/>
+            <w:tcBorders>
+              <w:top w:val="single" w:color="808080" w:sz="4"/>
+              <w:left w:val="single" w:color="808080" w:sz="4"/>
+              <w:bottom w:val="single" w:color="808080" w:sz="4"/>
+              <w:right w:val="single" w:color="808080" w:sz="4"/>
+            </w:tcBorders>
+            <w:tcMar>
+              <w:top w:type="dxa" w:w="60"/>
+              <w:left w:type="dxa" w:w="100"/>
+              <w:bottom w:type="dxa" w:w="60"/>
+              <w:right w:type="dxa" w:w="100"/>
+            </w:tcMar>
+          </w:tcPr>
+          <w:p>
+            <w:r>
+              <w:rPr>
+                <w:rFonts w:ascii="Calibri" w:cs="Calibri" w:eastAsia="Calibri" w:hAnsi="Calibri"/>
+                <w:b w:val="false"/>
+                <w:bCs w:val="false"/>
+                <w:sz w:val="20"/>
+                <w:szCs w:val="20"/>
+              </w:rPr>
+              <w:t xml:space="preserve">1.053</w:t>
+            </w:r>
+          </w:p>
+        </w:tc>
+        <w:tc>
+          <w:tcPr>
+            <w:tcW w:type="dxa" w:w="1189"/>
+            <w:tcBorders>
+              <w:top w:val="single" w:color="808080" w:sz="4"/>
+              <w:left w:val="single" w:color="808080" w:sz="4"/>
+              <w:bottom w:val="single" w:color="808080" w:sz="4"/>
+              <w:right w:val="single" w:color="808080" w:sz="4"/>
+            </w:tcBorders>
+            <w:tcMar>
+              <w:top w:type="dxa" w:w="60"/>
+              <w:left w:type="dxa" w:w="100"/>
+              <w:bottom w:type="dxa" w:w="60"/>
+              <w:right w:type="dxa" w:w="100"/>
+            </w:tcMar>
+          </w:tcPr>
+          <w:p>
+            <w:r>
+              <w:rPr>
+                <w:rFonts w:ascii="Calibri" w:cs="Calibri" w:eastAsia="Calibri" w:hAnsi="Calibri"/>
+                <w:b w:val="false"/>
+                <w:bCs w:val="false"/>
+                <w:sz w:val="20"/>
+                <w:szCs w:val="20"/>
+              </w:rPr>
+              <w:t xml:space="preserve">1.63</w:t>
+            </w:r>
+          </w:p>
+        </w:tc>
+        <w:tc>
+          <w:tcPr>
+            <w:tcW w:type="dxa" w:w="1192"/>
+            <w:tcBorders>
+              <w:top w:val="single" w:color="808080" w:sz="4"/>
+              <w:left w:val="single" w:color="808080" w:sz="4"/>
+              <w:bottom w:val="single" w:color="808080" w:sz="4"/>
+              <w:right w:val="single" w:color="808080" w:sz="4"/>
+            </w:tcBorders>
+            <w:tcMar>
+              <w:top w:type="dxa" w:w="60"/>
+              <w:left w:type="dxa" w:w="100"/>
+              <w:bottom w:type="dxa" w:w="60"/>
+              <w:right w:type="dxa" w:w="100"/>
+            </w:tcMar>
+          </w:tcPr>
+          <w:p>
+            <w:r>
+              <w:rPr>
+                <w:rFonts w:ascii="Calibri" w:cs="Calibri" w:eastAsia="Calibri" w:hAnsi="Calibri"/>
+                <w:b w:val="false"/>
+                <w:bCs w:val="false"/>
+                <w:sz w:val="20"/>
+                <w:szCs w:val="20"/>
+              </w:rPr>
+              <w:t xml:space="preserve">2 / 4 / 6</w:t>
+            </w:r>
+          </w:p>
+        </w:tc>
+      </w:tr>
+      <w:tr>
+        <w:tc>
+          <w:tcPr>
+            <w:tcW w:type="dxa" w:w="700"/>
+            <w:tcBorders>
+              <w:top w:val="single" w:color="808080" w:sz="4"/>
+              <w:left w:val="single" w:color="808080" w:sz="4"/>
+              <w:bottom w:val="single" w:color="808080" w:sz="4"/>
+              <w:right w:val="single" w:color="808080" w:sz="4"/>
+            </w:tcBorders>
+            <w:tcMar>
+              <w:top w:type="dxa" w:w="60"/>
+              <w:left w:type="dxa" w:w="100"/>
+              <w:bottom w:type="dxa" w:w="60"/>
+              <w:right w:type="dxa" w:w="100"/>
+            </w:tcMar>
+          </w:tcPr>
+          <w:p>
+            <w:r>
+              <w:rPr>
+                <w:rFonts w:ascii="Calibri" w:cs="Calibri" w:eastAsia="Calibri" w:hAnsi="Calibri"/>
+                <w:b/>
+                <w:bCs/>
+                <w:sz w:val="20"/>
+                <w:szCs w:val="20"/>
+              </w:rPr>
+              <w:t xml:space="preserve">5</w:t>
+            </w:r>
+          </w:p>
+        </w:tc>
+        <w:tc>
+          <w:tcPr>
+            <w:tcW w:type="dxa" w:w="1189"/>
+            <w:tcBorders>
+              <w:top w:val="single" w:color="808080" w:sz="4"/>
+              <w:left w:val="single" w:color="808080" w:sz="4"/>
+              <w:bottom w:val="single" w:color="808080" w:sz="4"/>
+              <w:right w:val="single" w:color="808080" w:sz="4"/>
+            </w:tcBorders>
+            <w:tcMar>
+              <w:top w:type="dxa" w:w="60"/>
+              <w:left w:type="dxa" w:w="100"/>
+              <w:bottom w:type="dxa" w:w="60"/>
+              <w:right w:type="dxa" w:w="100"/>
+            </w:tcMar>
+          </w:tcPr>
+          <w:p>
+            <w:r>
+              <w:rPr>
+                <w:rFonts w:ascii="Calibri" w:cs="Calibri" w:eastAsia="Calibri" w:hAnsi="Calibri"/>
+                <w:b w:val="false"/>
+                <w:bCs w:val="false"/>
+                <w:sz w:val="20"/>
+                <w:szCs w:val="20"/>
+              </w:rPr>
+              <w:t xml:space="preserve">0.650</w:t>
+            </w:r>
+          </w:p>
+        </w:tc>
+        <w:tc>
+          <w:tcPr>
+            <w:tcW w:type="dxa" w:w="1189"/>
+            <w:tcBorders>
+              <w:top w:val="single" w:color="808080" w:sz="4"/>
+              <w:left w:val="single" w:color="808080" w:sz="4"/>
+              <w:bottom w:val="single" w:color="808080" w:sz="4"/>
+              <w:right w:val="single" w:color="808080" w:sz="4"/>
+            </w:tcBorders>
+            <w:tcMar>
+              <w:top w:type="dxa" w:w="60"/>
+              <w:left w:type="dxa" w:w="100"/>
+              <w:bottom w:type="dxa" w:w="60"/>
+              <w:right w:type="dxa" w:w="100"/>
+            </w:tcMar>
+          </w:tcPr>
+          <w:p>
+            <w:r>
+              <w:rPr>
+                <w:rFonts w:ascii="Calibri" w:cs="Calibri" w:eastAsia="Calibri" w:hAnsi="Calibri"/>
+                <w:b w:val="false"/>
+                <w:bCs w:val="false"/>
+                <w:sz w:val="20"/>
+                <w:szCs w:val="20"/>
+              </w:rPr>
+              <w:t xml:space="preserve">0.552</w:t>
+            </w:r>
+          </w:p>
+        </w:tc>
+        <w:tc>
+          <w:tcPr>
+            <w:tcW w:type="dxa" w:w="1189"/>
+            <w:tcBorders>
+              <w:top w:val="single" w:color="808080" w:sz="4"/>
+              <w:left w:val="single" w:color="808080" w:sz="4"/>
+              <w:bottom w:val="single" w:color="808080" w:sz="4"/>
+              <w:right w:val="single" w:color="808080" w:sz="4"/>
+            </w:tcBorders>
+            <w:tcMar>
+              <w:top w:type="dxa" w:w="60"/>
+              <w:left w:type="dxa" w:w="100"/>
+              <w:bottom w:type="dxa" w:w="60"/>
+              <w:right w:type="dxa" w:w="100"/>
+            </w:tcMar>
+          </w:tcPr>
+          <w:p>
+            <w:r>
+              <w:rPr>
+                <w:rFonts w:ascii="Calibri" w:cs="Calibri" w:eastAsia="Calibri" w:hAnsi="Calibri"/>
+                <w:b w:val="false"/>
+                <w:bCs w:val="false"/>
+                <w:sz w:val="20"/>
+                <w:szCs w:val="20"/>
+              </w:rPr>
+              <w:t xml:space="preserve">0.545</w:t>
+            </w:r>
+          </w:p>
+        </w:tc>
+        <w:tc>
+          <w:tcPr>
+            <w:tcW w:type="dxa" w:w="1189"/>
+            <w:tcBorders>
+              <w:top w:val="single" w:color="808080" w:sz="4"/>
+              <w:left w:val="single" w:color="808080" w:sz="4"/>
+              <w:bottom w:val="single" w:color="808080" w:sz="4"/>
+              <w:right w:val="single" w:color="808080" w:sz="4"/>
+            </w:tcBorders>
+            <w:tcMar>
+              <w:top w:type="dxa" w:w="60"/>
+              <w:left w:type="dxa" w:w="100"/>
+              <w:bottom w:type="dxa" w:w="60"/>
+              <w:right w:type="dxa" w:w="100"/>
+            </w:tcMar>
+          </w:tcPr>
+          <w:p>
+            <w:r>
+              <w:rPr>
+                <w:rFonts w:ascii="Calibri" w:cs="Calibri" w:eastAsia="Calibri" w:hAnsi="Calibri"/>
+                <w:b w:val="false"/>
+                <w:bCs w:val="false"/>
+                <w:sz w:val="20"/>
+                <w:szCs w:val="20"/>
+              </w:rPr>
+              <w:t xml:space="preserve">1.747</w:t>
+            </w:r>
+          </w:p>
+        </w:tc>
+        <w:tc>
+          <w:tcPr>
+            <w:tcW w:type="dxa" w:w="1189"/>
+            <w:tcBorders>
+              <w:top w:val="single" w:color="808080" w:sz="4"/>
+              <w:left w:val="single" w:color="808080" w:sz="4"/>
+              <w:bottom w:val="single" w:color="808080" w:sz="4"/>
+              <w:right w:val="single" w:color="808080" w:sz="4"/>
+            </w:tcBorders>
+            <w:tcMar>
+              <w:top w:type="dxa" w:w="60"/>
+              <w:left w:type="dxa" w:w="100"/>
+              <w:bottom w:type="dxa" w:w="60"/>
+              <w:right w:type="dxa" w:w="100"/>
+            </w:tcMar>
+          </w:tcPr>
+          <w:p>
+            <w:r>
+              <w:rPr>
+                <w:rFonts w:ascii="Calibri" w:cs="Calibri" w:eastAsia="Calibri" w:hAnsi="Calibri"/>
+                <w:b w:val="false"/>
+                <w:bCs w:val="false"/>
+                <w:sz w:val="20"/>
+                <w:szCs w:val="20"/>
+              </w:rPr>
+              <w:t xml:space="preserve">1.087</w:t>
+            </w:r>
+          </w:p>
+        </w:tc>
+        <w:tc>
+          <w:tcPr>
+            <w:tcW w:type="dxa" w:w="1189"/>
+            <w:tcBorders>
+              <w:top w:val="single" w:color="808080" w:sz="4"/>
+              <w:left w:val="single" w:color="808080" w:sz="4"/>
+              <w:bottom w:val="single" w:color="808080" w:sz="4"/>
+              <w:right w:val="single" w:color="808080" w:sz="4"/>
+            </w:tcBorders>
+            <w:tcMar>
+              <w:top w:type="dxa" w:w="60"/>
+              <w:left w:type="dxa" w:w="100"/>
+              <w:bottom w:type="dxa" w:w="60"/>
+              <w:right w:type="dxa" w:w="100"/>
+            </w:tcMar>
+          </w:tcPr>
+          <w:p>
+            <w:r>
+              <w:rPr>
+                <w:rFonts w:ascii="Calibri" w:cs="Calibri" w:eastAsia="Calibri" w:hAnsi="Calibri"/>
+                <w:b w:val="false"/>
+                <w:bCs w:val="false"/>
+                <w:sz w:val="20"/>
+                <w:szCs w:val="20"/>
+              </w:rPr>
+              <w:t xml:space="preserve">1.61</w:t>
+            </w:r>
+          </w:p>
+        </w:tc>
+        <w:tc>
+          <w:tcPr>
+            <w:tcW w:type="dxa" w:w="1192"/>
+            <w:tcBorders>
+              <w:top w:val="single" w:color="808080" w:sz="4"/>
+              <w:left w:val="single" w:color="808080" w:sz="4"/>
+              <w:bottom w:val="single" w:color="808080" w:sz="4"/>
+              <w:right w:val="single" w:color="808080" w:sz="4"/>
+            </w:tcBorders>
+            <w:tcMar>
+              <w:top w:type="dxa" w:w="60"/>
+              <w:left w:type="dxa" w:w="100"/>
+              <w:bottom w:type="dxa" w:w="60"/>
+              <w:right w:type="dxa" w:w="100"/>
+            </w:tcMar>
+          </w:tcPr>
+          <w:p>
+            <w:r>
+              <w:rPr>
+                <w:rFonts w:ascii="Calibri" w:cs="Calibri" w:eastAsia="Calibri" w:hAnsi="Calibri"/>
+                <w:b w:val="false"/>
+                <w:bCs w:val="false"/>
+                <w:sz w:val="20"/>
+                <w:szCs w:val="20"/>
+              </w:rPr>
+              <w:t xml:space="preserve">2 / 4 / 6</w:t>
+            </w:r>
+          </w:p>
+        </w:tc>
+      </w:tr>
+      <w:tr>
+        <w:tc>
+          <w:tcPr>
+            <w:tcW w:type="dxa" w:w="700"/>
+            <w:tcBorders>
+              <w:top w:val="single" w:color="808080" w:sz="4"/>
+              <w:left w:val="single" w:color="808080" w:sz="4"/>
+              <w:bottom w:val="single" w:color="808080" w:sz="4"/>
+              <w:right w:val="single" w:color="808080" w:sz="4"/>
+            </w:tcBorders>
+            <w:tcMar>
+              <w:top w:type="dxa" w:w="60"/>
+              <w:left w:type="dxa" w:w="100"/>
+              <w:bottom w:type="dxa" w:w="60"/>
+              <w:right w:type="dxa" w:w="100"/>
+            </w:tcMar>
+          </w:tcPr>
+          <w:p>
+            <w:r>
+              <w:rPr>
+                <w:rFonts w:ascii="Calibri" w:cs="Calibri" w:eastAsia="Calibri" w:hAnsi="Calibri"/>
+                <w:b/>
+                <w:bCs/>
+                <w:sz w:val="20"/>
+                <w:szCs w:val="20"/>
+              </w:rPr>
+              <w:t xml:space="preserve">6</w:t>
+            </w:r>
+          </w:p>
+        </w:tc>
+        <w:tc>
+          <w:tcPr>
+            <w:tcW w:type="dxa" w:w="1189"/>
+            <w:tcBorders>
+              <w:top w:val="single" w:color="808080" w:sz="4"/>
+              <w:left w:val="single" w:color="808080" w:sz="4"/>
+              <w:bottom w:val="single" w:color="808080" w:sz="4"/>
+              <w:right w:val="single" w:color="808080" w:sz="4"/>
+            </w:tcBorders>
+            <w:tcMar>
+              <w:top w:type="dxa" w:w="60"/>
+              <w:left w:type="dxa" w:w="100"/>
+              <w:bottom w:type="dxa" w:w="60"/>
+              <w:right w:type="dxa" w:w="100"/>
+            </w:tcMar>
+          </w:tcPr>
+          <w:p>
+            <w:r>
+              <w:rPr>
+                <w:rFonts w:ascii="Calibri" w:cs="Calibri" w:eastAsia="Calibri" w:hAnsi="Calibri"/>
+                <w:b w:val="false"/>
+                <w:bCs w:val="false"/>
+                <w:sz w:val="20"/>
+                <w:szCs w:val="20"/>
+              </w:rPr>
+              <w:t xml:space="preserve">0.655</w:t>
+            </w:r>
+          </w:p>
+        </w:tc>
+        <w:tc>
+          <w:tcPr>
+            <w:tcW w:type="dxa" w:w="1189"/>
+            <w:tcBorders>
+              <w:top w:val="single" w:color="808080" w:sz="4"/>
+              <w:left w:val="single" w:color="808080" w:sz="4"/>
+              <w:bottom w:val="single" w:color="808080" w:sz="4"/>
+              <w:right w:val="single" w:color="808080" w:sz="4"/>
+            </w:tcBorders>
+            <w:tcMar>
+              <w:top w:type="dxa" w:w="60"/>
+              <w:left w:type="dxa" w:w="100"/>
+              <w:bottom w:type="dxa" w:w="60"/>
+              <w:right w:type="dxa" w:w="100"/>
+            </w:tcMar>
+          </w:tcPr>
+          <w:p>
+            <w:r>
+              <w:rPr>
+                <w:rFonts w:ascii="Calibri" w:cs="Calibri" w:eastAsia="Calibri" w:hAnsi="Calibri"/>
+                <w:b w:val="false"/>
+                <w:bCs w:val="false"/>
+                <w:sz w:val="20"/>
+                <w:szCs w:val="20"/>
+              </w:rPr>
+              <w:t xml:space="preserve">0.590</w:t>
+            </w:r>
+          </w:p>
+        </w:tc>
+        <w:tc>
+          <w:tcPr>
+            <w:tcW w:type="dxa" w:w="1189"/>
+            <w:tcBorders>
+              <w:top w:val="single" w:color="808080" w:sz="4"/>
+              <w:left w:val="single" w:color="808080" w:sz="4"/>
+              <w:bottom w:val="single" w:color="808080" w:sz="4"/>
+              <w:right w:val="single" w:color="808080" w:sz="4"/>
+            </w:tcBorders>
+            <w:tcMar>
+              <w:top w:type="dxa" w:w="60"/>
+              <w:left w:type="dxa" w:w="100"/>
+              <w:bottom w:type="dxa" w:w="60"/>
+              <w:right w:type="dxa" w:w="100"/>
+            </w:tcMar>
+          </w:tcPr>
+          <w:p>
+            <w:r>
+              <w:rPr>
+                <w:rFonts w:ascii="Calibri" w:cs="Calibri" w:eastAsia="Calibri" w:hAnsi="Calibri"/>
+                <w:b w:val="false"/>
+                <w:bCs w:val="false"/>
+                <w:sz w:val="20"/>
+                <w:szCs w:val="20"/>
+              </w:rPr>
+              <w:t xml:space="preserve">0.573</w:t>
+            </w:r>
+          </w:p>
+        </w:tc>
+        <w:tc>
+          <w:tcPr>
+            <w:tcW w:type="dxa" w:w="1189"/>
+            <w:tcBorders>
+              <w:top w:val="single" w:color="808080" w:sz="4"/>
+              <w:left w:val="single" w:color="808080" w:sz="4"/>
+              <w:bottom w:val="single" w:color="808080" w:sz="4"/>
+              <w:right w:val="single" w:color="808080" w:sz="4"/>
+            </w:tcBorders>
+            <w:tcMar>
+              <w:top w:type="dxa" w:w="60"/>
+              <w:left w:type="dxa" w:w="100"/>
+              <w:bottom w:type="dxa" w:w="60"/>
+              <w:right w:type="dxa" w:w="100"/>
+            </w:tcMar>
+          </w:tcPr>
+          <w:p>
+            <w:r>
+              <w:rPr>
+                <w:rFonts w:ascii="Calibri" w:cs="Calibri" w:eastAsia="Calibri" w:hAnsi="Calibri"/>
+                <w:b w:val="false"/>
+                <w:bCs w:val="false"/>
+                <w:sz w:val="20"/>
+                <w:szCs w:val="20"/>
+              </w:rPr>
+              <w:t xml:space="preserve">1.817</w:t>
+            </w:r>
+          </w:p>
+        </w:tc>
+        <w:tc>
+          <w:tcPr>
+            <w:tcW w:type="dxa" w:w="1189"/>
+            <w:tcBorders>
+              <w:top w:val="single" w:color="808080" w:sz="4"/>
+              <w:left w:val="single" w:color="808080" w:sz="4"/>
+              <w:bottom w:val="single" w:color="808080" w:sz="4"/>
+              <w:right w:val="single" w:color="808080" w:sz="4"/>
+            </w:tcBorders>
+            <w:tcMar>
+              <w:top w:type="dxa" w:w="60"/>
+              <w:left w:type="dxa" w:w="100"/>
+              <w:bottom w:type="dxa" w:w="60"/>
+              <w:right w:type="dxa" w:w="100"/>
+            </w:tcMar>
+          </w:tcPr>
+          <w:p>
+            <w:r>
+              <w:rPr>
+                <w:rFonts w:ascii="Calibri" w:cs="Calibri" w:eastAsia="Calibri" w:hAnsi="Calibri"/>
+                <w:b w:val="false"/>
+                <w:bCs w:val="false"/>
+                <w:sz w:val="20"/>
+                <w:szCs w:val="20"/>
+              </w:rPr>
+              <w:t xml:space="preserve">1.175</w:t>
+            </w:r>
+          </w:p>
+        </w:tc>
+        <w:tc>
+          <w:tcPr>
+            <w:tcW w:type="dxa" w:w="1189"/>
+            <w:tcBorders>
+              <w:top w:val="single" w:color="808080" w:sz="4"/>
+              <w:left w:val="single" w:color="808080" w:sz="4"/>
+              <w:bottom w:val="single" w:color="808080" w:sz="4"/>
+              <w:right w:val="single" w:color="808080" w:sz="4"/>
+            </w:tcBorders>
+            <w:tcMar>
+              <w:top w:type="dxa" w:w="60"/>
+              <w:left w:type="dxa" w:w="100"/>
+              <w:bottom w:type="dxa" w:w="60"/>
+              <w:right w:type="dxa" w:w="100"/>
+            </w:tcMar>
+          </w:tcPr>
+          <w:p>
+            <w:r>
+              <w:rPr>
+                <w:rFonts w:ascii="Calibri" w:cs="Calibri" w:eastAsia="Calibri" w:hAnsi="Calibri"/>
+                <w:b w:val="false"/>
+                <w:bCs w:val="false"/>
+                <w:sz w:val="20"/>
+                <w:szCs w:val="20"/>
+              </w:rPr>
+              <w:t xml:space="preserve">1.55</w:t>
+            </w:r>
+          </w:p>
+        </w:tc>
+        <w:tc>
+          <w:tcPr>
+            <w:tcW w:type="dxa" w:w="1192"/>
+            <w:tcBorders>
+              <w:top w:val="single" w:color="808080" w:sz="4"/>
+              <w:left w:val="single" w:color="808080" w:sz="4"/>
+              <w:bottom w:val="single" w:color="808080" w:sz="4"/>
+              <w:right w:val="single" w:color="808080" w:sz="4"/>
+            </w:tcBorders>
+            <w:tcMar>
+              <w:top w:type="dxa" w:w="60"/>
+              <w:left w:type="dxa" w:w="100"/>
+              <w:bottom w:type="dxa" w:w="60"/>
+              <w:right w:type="dxa" w:w="100"/>
+            </w:tcMar>
+          </w:tcPr>
+          <w:p>
+            <w:r>
+              <w:rPr>
+                <w:rFonts w:ascii="Calibri" w:cs="Calibri" w:eastAsia="Calibri" w:hAnsi="Calibri"/>
+                <w:b w:val="false"/>
+                <w:bCs w:val="false"/>
+                <w:sz w:val="20"/>
+                <w:szCs w:val="20"/>
+              </w:rPr>
+              <w:t xml:space="preserve">2 / 4 / 6</w:t>
+            </w:r>
+          </w:p>
+        </w:tc>
+      </w:tr>
+      <w:tr>
+        <w:tc>
+          <w:tcPr>
+            <w:tcW w:type="dxa" w:w="700"/>
+            <w:tcBorders>
+              <w:top w:val="single" w:color="808080" w:sz="4"/>
+              <w:left w:val="single" w:color="808080" w:sz="4"/>
+              <w:bottom w:val="single" w:color="808080" w:sz="4"/>
+              <w:right w:val="single" w:color="808080" w:sz="4"/>
+            </w:tcBorders>
+            <w:tcMar>
+              <w:top w:type="dxa" w:w="60"/>
+              <w:left w:type="dxa" w:w="100"/>
+              <w:bottom w:type="dxa" w:w="60"/>
+              <w:right w:type="dxa" w:w="100"/>
+            </w:tcMar>
+          </w:tcPr>
+          <w:p>
+            <w:r>
+              <w:rPr>
+                <w:rFonts w:ascii="Calibri" w:cs="Calibri" w:eastAsia="Calibri" w:hAnsi="Calibri"/>
+                <w:b/>
+                <w:bCs/>
+                <w:sz w:val="20"/>
+                <w:szCs w:val="20"/>
+              </w:rPr>
+              <w:t xml:space="preserve">7</w:t>
+            </w:r>
+          </w:p>
+        </w:tc>
+        <w:tc>
+          <w:tcPr>
+            <w:tcW w:type="dxa" w:w="1189"/>
+            <w:tcBorders>
+              <w:top w:val="single" w:color="808080" w:sz="4"/>
+              <w:left w:val="single" w:color="808080" w:sz="4"/>
+              <w:bottom w:val="single" w:color="808080" w:sz="4"/>
+              <w:right w:val="single" w:color="808080" w:sz="4"/>
+            </w:tcBorders>
+            <w:tcMar>
+              <w:top w:type="dxa" w:w="60"/>
+              <w:left w:type="dxa" w:w="100"/>
+              <w:bottom w:type="dxa" w:w="60"/>
+              <w:right w:type="dxa" w:w="100"/>
+            </w:tcMar>
+          </w:tcPr>
+          <w:p>
+            <w:r>
+              <w:rPr>
+                <w:rFonts w:ascii="Calibri" w:cs="Calibri" w:eastAsia="Calibri" w:hAnsi="Calibri"/>
+                <w:b w:val="false"/>
+                <w:bCs w:val="false"/>
+                <w:sz w:val="20"/>
+                <w:szCs w:val="20"/>
+              </w:rPr>
+              <w:t xml:space="preserve">0.702</w:t>
+            </w:r>
+          </w:p>
+        </w:tc>
+        <w:tc>
+          <w:tcPr>
+            <w:tcW w:type="dxa" w:w="1189"/>
+            <w:tcBorders>
+              <w:top w:val="single" w:color="808080" w:sz="4"/>
+              <w:left w:val="single" w:color="808080" w:sz="4"/>
+              <w:bottom w:val="single" w:color="808080" w:sz="4"/>
+              <w:right w:val="single" w:color="808080" w:sz="4"/>
+            </w:tcBorders>
+            <w:tcMar>
+              <w:top w:type="dxa" w:w="60"/>
+              <w:left w:type="dxa" w:w="100"/>
+              <w:bottom w:type="dxa" w:w="60"/>
+              <w:right w:type="dxa" w:w="100"/>
+            </w:tcMar>
+          </w:tcPr>
+          <w:p>
+            <w:r>
+              <w:rPr>
+                <w:rFonts w:ascii="Calibri" w:cs="Calibri" w:eastAsia="Calibri" w:hAnsi="Calibri"/>
+                <w:b w:val="false"/>
+                <w:bCs w:val="false"/>
+                <w:sz w:val="20"/>
+                <w:szCs w:val="20"/>
+              </w:rPr>
+              <w:t xml:space="preserve">0.568</w:t>
+            </w:r>
+          </w:p>
+        </w:tc>
+        <w:tc>
+          <w:tcPr>
+            <w:tcW w:type="dxa" w:w="1189"/>
+            <w:tcBorders>
+              <w:top w:val="single" w:color="808080" w:sz="4"/>
+              <w:left w:val="single" w:color="808080" w:sz="4"/>
+              <w:bottom w:val="single" w:color="808080" w:sz="4"/>
+              <w:right w:val="single" w:color="808080" w:sz="4"/>
+            </w:tcBorders>
+            <w:tcMar>
+              <w:top w:type="dxa" w:w="60"/>
+              <w:left w:type="dxa" w:w="100"/>
+              <w:bottom w:type="dxa" w:w="60"/>
+              <w:right w:type="dxa" w:w="100"/>
+            </w:tcMar>
+          </w:tcPr>
+          <w:p>
+            <w:r>
+              <w:rPr>
+                <w:rFonts w:ascii="Calibri" w:cs="Calibri" w:eastAsia="Calibri" w:hAnsi="Calibri"/>
+                <w:b w:val="false"/>
+                <w:bCs w:val="false"/>
+                <w:sz w:val="20"/>
+                <w:szCs w:val="20"/>
+              </w:rPr>
+              <w:t xml:space="preserve">0.555</w:t>
+            </w:r>
+          </w:p>
+        </w:tc>
+        <w:tc>
+          <w:tcPr>
+            <w:tcW w:type="dxa" w:w="1189"/>
+            <w:tcBorders>
+              <w:top w:val="single" w:color="808080" w:sz="4"/>
+              <w:left w:val="single" w:color="808080" w:sz="4"/>
+              <w:bottom w:val="single" w:color="808080" w:sz="4"/>
+              <w:right w:val="single" w:color="808080" w:sz="4"/>
+            </w:tcBorders>
+            <w:tcMar>
+              <w:top w:type="dxa" w:w="60"/>
+              <w:left w:type="dxa" w:w="100"/>
+              <w:bottom w:type="dxa" w:w="60"/>
+              <w:right w:type="dxa" w:w="100"/>
+            </w:tcMar>
+          </w:tcPr>
+          <w:p>
+            <w:r>
+              <w:rPr>
+                <w:rFonts w:ascii="Calibri" w:cs="Calibri" w:eastAsia="Calibri" w:hAnsi="Calibri"/>
+                <w:b w:val="false"/>
+                <w:bCs w:val="false"/>
+                <w:sz w:val="20"/>
+                <w:szCs w:val="20"/>
+              </w:rPr>
+              <w:t xml:space="preserve">1.825</w:t>
+            </w:r>
+          </w:p>
+        </w:tc>
+        <w:tc>
+          <w:tcPr>
+            <w:tcW w:type="dxa" w:w="1189"/>
+            <w:tcBorders>
+              <w:top w:val="single" w:color="808080" w:sz="4"/>
+              <w:left w:val="single" w:color="808080" w:sz="4"/>
+              <w:bottom w:val="single" w:color="808080" w:sz="4"/>
+              <w:right w:val="single" w:color="808080" w:sz="4"/>
+            </w:tcBorders>
+            <w:tcMar>
+              <w:top w:type="dxa" w:w="60"/>
+              <w:left w:type="dxa" w:w="100"/>
+              <w:bottom w:type="dxa" w:w="60"/>
+              <w:right w:type="dxa" w:w="100"/>
+            </w:tcMar>
+          </w:tcPr>
+          <w:p>
+            <w:r>
+              <w:rPr>
+                <w:rFonts w:ascii="Calibri" w:cs="Calibri" w:eastAsia="Calibri" w:hAnsi="Calibri"/>
+                <w:b w:val="false"/>
+                <w:bCs w:val="false"/>
+                <w:sz w:val="20"/>
+                <w:szCs w:val="20"/>
+              </w:rPr>
+              <w:t xml:space="preserve">1.068</w:t>
+            </w:r>
+          </w:p>
+        </w:tc>
+        <w:tc>
+          <w:tcPr>
+            <w:tcW w:type="dxa" w:w="1189"/>
+            <w:tcBorders>
+              <w:top w:val="single" w:color="808080" w:sz="4"/>
+              <w:left w:val="single" w:color="808080" w:sz="4"/>
+              <w:bottom w:val="single" w:color="808080" w:sz="4"/>
+              <w:right w:val="single" w:color="808080" w:sz="4"/>
+            </w:tcBorders>
+            <w:tcMar>
+              <w:top w:type="dxa" w:w="60"/>
+              <w:left w:type="dxa" w:w="100"/>
+              <w:bottom w:type="dxa" w:w="60"/>
+              <w:right w:type="dxa" w:w="100"/>
+            </w:tcMar>
+          </w:tcPr>
+          <w:p>
+            <w:r>
+              <w:rPr>
+                <w:rFonts w:ascii="Calibri" w:cs="Calibri" w:eastAsia="Calibri" w:hAnsi="Calibri"/>
+                <w:b w:val="false"/>
+                <w:bCs w:val="false"/>
+                <w:sz w:val="20"/>
+                <w:szCs w:val="20"/>
+              </w:rPr>
+              <w:t xml:space="preserve">1.71</w:t>
+            </w:r>
+          </w:p>
+        </w:tc>
+        <w:tc>
+          <w:tcPr>
+            <w:tcW w:type="dxa" w:w="1192"/>
+            <w:tcBorders>
+              <w:top w:val="single" w:color="808080" w:sz="4"/>
+              <w:left w:val="single" w:color="808080" w:sz="4"/>
+              <w:bottom w:val="single" w:color="808080" w:sz="4"/>
+              <w:right w:val="single" w:color="808080" w:sz="4"/>
+            </w:tcBorders>
+            <w:tcMar>
+              <w:top w:type="dxa" w:w="60"/>
+              <w:left w:type="dxa" w:w="100"/>
+              <w:bottom w:type="dxa" w:w="60"/>
+              <w:right w:type="dxa" w:w="100"/>
+            </w:tcMar>
+          </w:tcPr>
+          <w:p>
+            <w:r>
+              <w:rPr>
+                <w:rFonts w:ascii="Calibri" w:cs="Calibri" w:eastAsia="Calibri" w:hAnsi="Calibri"/>
+                <w:b w:val="false"/>
+                <w:bCs w:val="false"/>
+                <w:sz w:val="20"/>
+                <w:szCs w:val="20"/>
+              </w:rPr>
+              <w:t xml:space="preserve">2 / 4 / 6</w:t>
+            </w:r>
+          </w:p>
+        </w:tc>
+      </w:tr>
+      <w:tr>
+        <w:tc>
+          <w:tcPr>
+            <w:tcW w:type="dxa" w:w="700"/>
+            <w:tcBorders>
+              <w:top w:val="single" w:color="808080" w:sz="4"/>
+              <w:left w:val="single" w:color="808080" w:sz="4"/>
+              <w:bottom w:val="single" w:color="808080" w:sz="4"/>
+              <w:right w:val="single" w:color="808080" w:sz="4"/>
+            </w:tcBorders>
+            <w:tcMar>
+              <w:top w:type="dxa" w:w="60"/>
+              <w:left w:type="dxa" w:w="100"/>
+              <w:bottom w:type="dxa" w:w="60"/>
+              <w:right w:type="dxa" w:w="100"/>
+            </w:tcMar>
+          </w:tcPr>
+          <w:p>
+            <w:r>
+              <w:rPr>
+                <w:rFonts w:ascii="Calibri" w:cs="Calibri" w:eastAsia="Calibri" w:hAnsi="Calibri"/>
+                <w:b/>
+                <w:bCs/>
+                <w:sz w:val="20"/>
+                <w:szCs w:val="20"/>
+              </w:rPr>
+              <w:t xml:space="preserve">8</w:t>
+            </w:r>
+          </w:p>
+        </w:tc>
+        <w:tc>
+          <w:tcPr>
+            <w:tcW w:type="dxa" w:w="1189"/>
+            <w:tcBorders>
+              <w:top w:val="single" w:color="808080" w:sz="4"/>
+              <w:left w:val="single" w:color="808080" w:sz="4"/>
+              <w:bottom w:val="single" w:color="808080" w:sz="4"/>
+              <w:right w:val="single" w:color="808080" w:sz="4"/>
+            </w:tcBorders>
+            <w:tcMar>
+              <w:top w:type="dxa" w:w="60"/>
+              <w:left w:type="dxa" w:w="100"/>
+              <w:bottom w:type="dxa" w:w="60"/>
+              <w:right w:type="dxa" w:w="100"/>
+            </w:tcMar>
+          </w:tcPr>
+          <w:p>
+            <w:r>
+              <w:rPr>
+                <w:rFonts w:ascii="Calibri" w:cs="Calibri" w:eastAsia="Calibri" w:hAnsi="Calibri"/>
+                <w:b w:val="false"/>
+                <w:bCs w:val="false"/>
+                <w:sz w:val="20"/>
+                <w:szCs w:val="20"/>
+              </w:rPr>
+              <w:t xml:space="preserve">0.657</w:t>
+            </w:r>
+          </w:p>
+        </w:tc>
+        <w:tc>
+          <w:tcPr>
+            <w:tcW w:type="dxa" w:w="1189"/>
+            <w:tcBorders>
+              <w:top w:val="single" w:color="808080" w:sz="4"/>
+              <w:left w:val="single" w:color="808080" w:sz="4"/>
+              <w:bottom w:val="single" w:color="808080" w:sz="4"/>
+              <w:right w:val="single" w:color="808080" w:sz="4"/>
+            </w:tcBorders>
+            <w:tcMar>
+              <w:top w:type="dxa" w:w="60"/>
+              <w:left w:type="dxa" w:w="100"/>
+              <w:bottom w:type="dxa" w:w="60"/>
+              <w:right w:type="dxa" w:w="100"/>
+            </w:tcMar>
+          </w:tcPr>
+          <w:p>
+            <w:r>
+              <w:rPr>
+                <w:rFonts w:ascii="Calibri" w:cs="Calibri" w:eastAsia="Calibri" w:hAnsi="Calibri"/>
+                <w:b w:val="false"/>
+                <w:bCs w:val="false"/>
+                <w:sz w:val="20"/>
+                <w:szCs w:val="20"/>
+              </w:rPr>
+              <w:t xml:space="preserve">0.563</w:t>
+            </w:r>
+          </w:p>
+        </w:tc>
+        <w:tc>
+          <w:tcPr>
+            <w:tcW w:type="dxa" w:w="1189"/>
+            <w:tcBorders>
+              <w:top w:val="single" w:color="808080" w:sz="4"/>
+              <w:left w:val="single" w:color="808080" w:sz="4"/>
+              <w:bottom w:val="single" w:color="808080" w:sz="4"/>
+              <w:right w:val="single" w:color="808080" w:sz="4"/>
+            </w:tcBorders>
+            <w:tcMar>
+              <w:top w:type="dxa" w:w="60"/>
+              <w:left w:type="dxa" w:w="100"/>
+              <w:bottom w:type="dxa" w:w="60"/>
+              <w:right w:type="dxa" w:w="100"/>
+            </w:tcMar>
+          </w:tcPr>
+          <w:p>
+            <w:r>
+              <w:rPr>
+                <w:rFonts w:ascii="Calibri" w:cs="Calibri" w:eastAsia="Calibri" w:hAnsi="Calibri"/>
+                <w:b w:val="false"/>
+                <w:bCs w:val="false"/>
+                <w:sz w:val="20"/>
+                <w:szCs w:val="20"/>
+              </w:rPr>
+              <w:t xml:space="preserve">0.550</w:t>
+            </w:r>
+          </w:p>
+        </w:tc>
+        <w:tc>
+          <w:tcPr>
+            <w:tcW w:type="dxa" w:w="1189"/>
+            <w:tcBorders>
+              <w:top w:val="single" w:color="808080" w:sz="4"/>
+              <w:left w:val="single" w:color="808080" w:sz="4"/>
+              <w:bottom w:val="single" w:color="808080" w:sz="4"/>
+              <w:right w:val="single" w:color="808080" w:sz="4"/>
+            </w:tcBorders>
+            <w:tcMar>
+              <w:top w:type="dxa" w:w="60"/>
+              <w:left w:type="dxa" w:w="100"/>
+              <w:bottom w:type="dxa" w:w="60"/>
+              <w:right w:type="dxa" w:w="100"/>
+            </w:tcMar>
+          </w:tcPr>
+          <w:p>
+            <w:r>
+              <w:rPr>
+                <w:rFonts w:ascii="Calibri" w:cs="Calibri" w:eastAsia="Calibri" w:hAnsi="Calibri"/>
+                <w:b w:val="false"/>
+                <w:bCs w:val="false"/>
+                <w:sz w:val="20"/>
+                <w:szCs w:val="20"/>
+              </w:rPr>
+              <w:t xml:space="preserve">1.770</w:t>
+            </w:r>
+          </w:p>
+        </w:tc>
+        <w:tc>
+          <w:tcPr>
+            <w:tcW w:type="dxa" w:w="1189"/>
+            <w:tcBorders>
+              <w:top w:val="single" w:color="808080" w:sz="4"/>
+              <w:left w:val="single" w:color="808080" w:sz="4"/>
+              <w:bottom w:val="single" w:color="808080" w:sz="4"/>
+              <w:right w:val="single" w:color="808080" w:sz="4"/>
+            </w:tcBorders>
+            <w:tcMar>
+              <w:top w:type="dxa" w:w="60"/>
+              <w:left w:type="dxa" w:w="100"/>
+              <w:bottom w:type="dxa" w:w="60"/>
+              <w:right w:type="dxa" w:w="100"/>
+            </w:tcMar>
+          </w:tcPr>
+          <w:p>
+            <w:r>
+              <w:rPr>
+                <w:rFonts w:ascii="Calibri" w:cs="Calibri" w:eastAsia="Calibri" w:hAnsi="Calibri"/>
+                <w:b w:val="false"/>
+                <w:bCs w:val="false"/>
+                <w:sz w:val="20"/>
+                <w:szCs w:val="20"/>
+              </w:rPr>
+              <w:t xml:space="preserve">1.156</w:t>
+            </w:r>
+          </w:p>
+        </w:tc>
+        <w:tc>
+          <w:tcPr>
+            <w:tcW w:type="dxa" w:w="1189"/>
+            <w:tcBorders>
+              <w:top w:val="single" w:color="808080" w:sz="4"/>
+              <w:left w:val="single" w:color="808080" w:sz="4"/>
+              <w:bottom w:val="single" w:color="808080" w:sz="4"/>
+              <w:right w:val="single" w:color="808080" w:sz="4"/>
+            </w:tcBorders>
+            <w:tcMar>
+              <w:top w:type="dxa" w:w="60"/>
+              <w:left w:type="dxa" w:w="100"/>
+              <w:bottom w:type="dxa" w:w="60"/>
+              <w:right w:type="dxa" w:w="100"/>
+            </w:tcMar>
+          </w:tcPr>
+          <w:p>
+            <w:r>
+              <w:rPr>
+                <w:rFonts w:ascii="Calibri" w:cs="Calibri" w:eastAsia="Calibri" w:hAnsi="Calibri"/>
+                <w:b w:val="false"/>
+                <w:bCs w:val="false"/>
+                <w:sz w:val="20"/>
+                <w:szCs w:val="20"/>
+              </w:rPr>
+              <w:t xml:space="preserve">1.53</w:t>
+            </w:r>
+          </w:p>
+        </w:tc>
+        <w:tc>
+          <w:tcPr>
+            <w:tcW w:type="dxa" w:w="1192"/>
+            <w:tcBorders>
+              <w:top w:val="single" w:color="808080" w:sz="4"/>
+              <w:left w:val="single" w:color="808080" w:sz="4"/>
+              <w:bottom w:val="single" w:color="808080" w:sz="4"/>
+              <w:right w:val="single" w:color="808080" w:sz="4"/>
+            </w:tcBorders>
+            <w:tcMar>
+              <w:top w:type="dxa" w:w="60"/>
+              <w:left w:type="dxa" w:w="100"/>
+              <w:bottom w:type="dxa" w:w="60"/>
+              <w:right w:type="dxa" w:w="100"/>
+            </w:tcMar>
+          </w:tcPr>
+          <w:p>
+            <w:r>
+              <w:rPr>
+                <w:rFonts w:ascii="Calibri" w:cs="Calibri" w:eastAsia="Calibri" w:hAnsi="Calibri"/>
+                <w:b w:val="false"/>
+                <w:bCs w:val="false"/>
+                <w:sz w:val="20"/>
+                <w:szCs w:val="20"/>
+              </w:rPr>
+              <w:t xml:space="preserve">2 / 4 / 6</w:t>
+            </w:r>
+          </w:p>
+        </w:tc>
+      </w:tr>
+      <w:tr>
+        <w:tc>
+          <w:tcPr>
+            <w:tcW w:type="dxa" w:w="700"/>
+            <w:tcBorders>
+              <w:top w:val="single" w:color="808080" w:sz="4"/>
+              <w:left w:val="single" w:color="808080" w:sz="4"/>
+              <w:bottom w:val="single" w:color="808080" w:sz="4"/>
+              <w:right w:val="single" w:color="808080" w:sz="4"/>
+            </w:tcBorders>
+            <w:tcMar>
+              <w:top w:type="dxa" w:w="60"/>
+              <w:left w:type="dxa" w:w="100"/>
+              <w:bottom w:type="dxa" w:w="60"/>
+              <w:right w:type="dxa" w:w="100"/>
+            </w:tcMar>
+          </w:tcPr>
+          <w:p>
+            <w:r>
+              <w:rPr>
+                <w:rFonts w:ascii="Calibri" w:cs="Calibri" w:eastAsia="Calibri" w:hAnsi="Calibri"/>
+                <w:b/>
+                <w:bCs/>
+                <w:sz w:val="20"/>
+                <w:szCs w:val="20"/>
+              </w:rPr>
+              <w:t xml:space="preserve">9</w:t>
+            </w:r>
+          </w:p>
+        </w:tc>
+        <w:tc>
+          <w:tcPr>
+            <w:tcW w:type="dxa" w:w="1189"/>
+            <w:tcBorders>
+              <w:top w:val="single" w:color="808080" w:sz="4"/>
+              <w:left w:val="single" w:color="808080" w:sz="4"/>
+              <w:bottom w:val="single" w:color="808080" w:sz="4"/>
+              <w:right w:val="single" w:color="808080" w:sz="4"/>
+            </w:tcBorders>
+            <w:tcMar>
+              <w:top w:type="dxa" w:w="60"/>
+              <w:left w:type="dxa" w:w="100"/>
+              <w:bottom w:type="dxa" w:w="60"/>
+              <w:right w:type="dxa" w:w="100"/>
+            </w:tcMar>
+          </w:tcPr>
+          <w:p>
+            <w:r>
+              <w:rPr>
+                <w:rFonts w:ascii="Calibri" w:cs="Calibri" w:eastAsia="Calibri" w:hAnsi="Calibri"/>
+                <w:b w:val="false"/>
+                <w:bCs w:val="false"/>
+                <w:sz w:val="20"/>
+                <w:szCs w:val="20"/>
+              </w:rPr>
+              <w:t xml:space="preserve">0.684</w:t>
+            </w:r>
+          </w:p>
+        </w:tc>
+        <w:tc>
+          <w:tcPr>
+            <w:tcW w:type="dxa" w:w="1189"/>
+            <w:tcBorders>
+              <w:top w:val="single" w:color="808080" w:sz="4"/>
+              <w:left w:val="single" w:color="808080" w:sz="4"/>
+              <w:bottom w:val="single" w:color="808080" w:sz="4"/>
+              <w:right w:val="single" w:color="808080" w:sz="4"/>
+            </w:tcBorders>
+            <w:tcMar>
+              <w:top w:type="dxa" w:w="60"/>
+              <w:left w:type="dxa" w:w="100"/>
+              <w:bottom w:type="dxa" w:w="60"/>
+              <w:right w:type="dxa" w:w="100"/>
+            </w:tcMar>
+          </w:tcPr>
+          <w:p>
+            <w:r>
+              <w:rPr>
+                <w:rFonts w:ascii="Calibri" w:cs="Calibri" w:eastAsia="Calibri" w:hAnsi="Calibri"/>
+                <w:b w:val="false"/>
+                <w:bCs w:val="false"/>
+                <w:sz w:val="20"/>
+                <w:szCs w:val="20"/>
+              </w:rPr>
+              <w:t xml:space="preserve">0.605</w:t>
+            </w:r>
+          </w:p>
+        </w:tc>
+        <w:tc>
+          <w:tcPr>
+            <w:tcW w:type="dxa" w:w="1189"/>
+            <w:tcBorders>
+              <w:top w:val="single" w:color="808080" w:sz="4"/>
+              <w:left w:val="single" w:color="808080" w:sz="4"/>
+              <w:bottom w:val="single" w:color="808080" w:sz="4"/>
+              <w:right w:val="single" w:color="808080" w:sz="4"/>
+            </w:tcBorders>
+            <w:tcMar>
+              <w:top w:type="dxa" w:w="60"/>
+              <w:left w:type="dxa" w:w="100"/>
+              <w:bottom w:type="dxa" w:w="60"/>
+              <w:right w:type="dxa" w:w="100"/>
+            </w:tcMar>
+          </w:tcPr>
+          <w:p>
+            <w:r>
+              <w:rPr>
+                <w:rFonts w:ascii="Calibri" w:cs="Calibri" w:eastAsia="Calibri" w:hAnsi="Calibri"/>
+                <w:b w:val="false"/>
+                <w:bCs w:val="false"/>
+                <w:sz w:val="20"/>
+                <w:szCs w:val="20"/>
+              </w:rPr>
+              <w:t xml:space="preserve">0.551</w:t>
+            </w:r>
+          </w:p>
+        </w:tc>
+        <w:tc>
+          <w:tcPr>
+            <w:tcW w:type="dxa" w:w="1189"/>
+            <w:tcBorders>
+              <w:top w:val="single" w:color="808080" w:sz="4"/>
+              <w:left w:val="single" w:color="808080" w:sz="4"/>
+              <w:bottom w:val="single" w:color="808080" w:sz="4"/>
+              <w:right w:val="single" w:color="808080" w:sz="4"/>
+            </w:tcBorders>
+            <w:tcMar>
+              <w:top w:type="dxa" w:w="60"/>
+              <w:left w:type="dxa" w:w="100"/>
+              <w:bottom w:type="dxa" w:w="60"/>
+              <w:right w:type="dxa" w:w="100"/>
+            </w:tcMar>
+          </w:tcPr>
+          <w:p>
+            <w:r>
+              <w:rPr>
+                <w:rFonts w:ascii="Calibri" w:cs="Calibri" w:eastAsia="Calibri" w:hAnsi="Calibri"/>
+                <w:b w:val="false"/>
+                <w:bCs w:val="false"/>
+                <w:sz w:val="20"/>
+                <w:szCs w:val="20"/>
+              </w:rPr>
+              <w:t xml:space="preserve">1.840</w:t>
+            </w:r>
+          </w:p>
+        </w:tc>
+        <w:tc>
+          <w:tcPr>
+            <w:tcW w:type="dxa" w:w="1189"/>
+            <w:tcBorders>
+              <w:top w:val="single" w:color="808080" w:sz="4"/>
+              <w:left w:val="single" w:color="808080" w:sz="4"/>
+              <w:bottom w:val="single" w:color="808080" w:sz="4"/>
+              <w:right w:val="single" w:color="808080" w:sz="4"/>
+            </w:tcBorders>
+            <w:tcMar>
+              <w:top w:type="dxa" w:w="60"/>
+              <w:left w:type="dxa" w:w="100"/>
+              <w:bottom w:type="dxa" w:w="60"/>
+              <w:right w:type="dxa" w:w="100"/>
+            </w:tcMar>
+          </w:tcPr>
+          <w:p>
+            <w:r>
+              <w:rPr>
+                <w:rFonts w:ascii="Calibri" w:cs="Calibri" w:eastAsia="Calibri" w:hAnsi="Calibri"/>
+                <w:b w:val="false"/>
+                <w:bCs w:val="false"/>
+                <w:sz w:val="20"/>
+                <w:szCs w:val="20"/>
+              </w:rPr>
+              <w:t xml:space="preserve">1.094</w:t>
+            </w:r>
+          </w:p>
+        </w:tc>
+        <w:tc>
+          <w:tcPr>
+            <w:tcW w:type="dxa" w:w="1189"/>
+            <w:tcBorders>
+              <w:top w:val="single" w:color="808080" w:sz="4"/>
+              <w:left w:val="single" w:color="808080" w:sz="4"/>
+              <w:bottom w:val="single" w:color="808080" w:sz="4"/>
+              <w:right w:val="single" w:color="808080" w:sz="4"/>
+            </w:tcBorders>
+            <w:tcMar>
+              <w:top w:type="dxa" w:w="60"/>
+              <w:left w:type="dxa" w:w="100"/>
+              <w:bottom w:type="dxa" w:w="60"/>
+              <w:right w:type="dxa" w:w="100"/>
+            </w:tcMar>
+          </w:tcPr>
+          <w:p>
+            <w:r>
+              <w:rPr>
+                <w:rFonts w:ascii="Calibri" w:cs="Calibri" w:eastAsia="Calibri" w:hAnsi="Calibri"/>
+                <w:b w:val="false"/>
+                <w:bCs w:val="false"/>
+                <w:sz w:val="20"/>
+                <w:szCs w:val="20"/>
+              </w:rPr>
+              <w:t xml:space="preserve">1.68</w:t>
+            </w:r>
+          </w:p>
+        </w:tc>
+        <w:tc>
+          <w:tcPr>
+            <w:tcW w:type="dxa" w:w="1192"/>
+            <w:tcBorders>
+              <w:top w:val="single" w:color="808080" w:sz="4"/>
+              <w:left w:val="single" w:color="808080" w:sz="4"/>
+              <w:bottom w:val="single" w:color="808080" w:sz="4"/>
+              <w:right w:val="single" w:color="808080" w:sz="4"/>
+            </w:tcBorders>
+            <w:tcMar>
+              <w:top w:type="dxa" w:w="60"/>
+              <w:left w:type="dxa" w:w="100"/>
+              <w:bottom w:type="dxa" w:w="60"/>
+              <w:right w:type="dxa" w:w="100"/>
+            </w:tcMar>
+          </w:tcPr>
+          <w:p>
+            <w:r>
+              <w:rPr>
+                <w:rFonts w:ascii="Calibri" w:cs="Calibri" w:eastAsia="Calibri" w:hAnsi="Calibri"/>
+                <w:b w:val="false"/>
+                <w:bCs w:val="false"/>
+                <w:sz w:val="20"/>
+                <w:szCs w:val="20"/>
+              </w:rPr>
+              <w:t xml:space="preserve">2 / 4 / 6</w:t>
+            </w:r>
+          </w:p>
+        </w:tc>
+      </w:tr>
+      <w:tr>
+        <w:tc>
+          <w:tcPr>
+            <w:tcW w:type="dxa" w:w="700"/>
+            <w:tcBorders>
+              <w:top w:val="single" w:color="808080" w:sz="4"/>
+              <w:left w:val="single" w:color="808080" w:sz="4"/>
+              <w:bottom w:val="single" w:color="808080" w:sz="4"/>
+              <w:right w:val="single" w:color="808080" w:sz="4"/>
+            </w:tcBorders>
+            <w:tcMar>
+              <w:top w:type="dxa" w:w="60"/>
+              <w:left w:type="dxa" w:w="100"/>
+              <w:bottom w:type="dxa" w:w="60"/>
+              <w:right w:type="dxa" w:w="100"/>
+            </w:tcMar>
+          </w:tcPr>
+          <w:p>
+            <w:r>
+              <w:rPr>
+                <w:rFonts w:ascii="Calibri" w:cs="Calibri" w:eastAsia="Calibri" w:hAnsi="Calibri"/>
+                <w:b/>
+                <w:bCs/>
+                <w:sz w:val="20"/>
+                <w:szCs w:val="20"/>
+              </w:rPr>
+              <w:t xml:space="preserve">10</w:t>
+            </w:r>
+          </w:p>
+        </w:tc>
+        <w:tc>
+          <w:tcPr>
+            <w:tcW w:type="dxa" w:w="1189"/>
+            <w:tcBorders>
+              <w:top w:val="single" w:color="808080" w:sz="4"/>
+              <w:left w:val="single" w:color="808080" w:sz="4"/>
+              <w:bottom w:val="single" w:color="808080" w:sz="4"/>
+              <w:right w:val="single" w:color="808080" w:sz="4"/>
+            </w:tcBorders>
+            <w:tcMar>
+              <w:top w:type="dxa" w:w="60"/>
+              <w:left w:type="dxa" w:w="100"/>
+              <w:bottom w:type="dxa" w:w="60"/>
+              <w:right w:type="dxa" w:w="100"/>
+            </w:tcMar>
+          </w:tcPr>
+          <w:p>
+            <w:r>
+              <w:rPr>
+                <w:rFonts w:ascii="Calibri" w:cs="Calibri" w:eastAsia="Calibri" w:hAnsi="Calibri"/>
+                <w:b w:val="false"/>
+                <w:bCs w:val="false"/>
+                <w:sz w:val="20"/>
+                <w:szCs w:val="20"/>
+              </w:rPr>
+              <w:t xml:space="preserve">0.674</w:t>
+            </w:r>
+          </w:p>
+        </w:tc>
+        <w:tc>
+          <w:tcPr>
+            <w:tcW w:type="dxa" w:w="1189"/>
+            <w:tcBorders>
+              <w:top w:val="single" w:color="808080" w:sz="4"/>
+              <w:left w:val="single" w:color="808080" w:sz="4"/>
+              <w:bottom w:val="single" w:color="808080" w:sz="4"/>
+              <w:right w:val="single" w:color="808080" w:sz="4"/>
+            </w:tcBorders>
+            <w:tcMar>
+              <w:top w:type="dxa" w:w="60"/>
+              <w:left w:type="dxa" w:w="100"/>
+              <w:bottom w:type="dxa" w:w="60"/>
+              <w:right w:type="dxa" w:w="100"/>
+            </w:tcMar>
+          </w:tcPr>
+          <w:p>
+            <w:r>
+              <w:rPr>
+                <w:rFonts w:ascii="Calibri" w:cs="Calibri" w:eastAsia="Calibri" w:hAnsi="Calibri"/>
+                <w:b w:val="false"/>
+                <w:bCs w:val="false"/>
+                <w:sz w:val="20"/>
+                <w:szCs w:val="20"/>
+              </w:rPr>
+              <w:t xml:space="preserve">0.607</w:t>
+            </w:r>
+          </w:p>
+        </w:tc>
+        <w:tc>
+          <w:tcPr>
+            <w:tcW w:type="dxa" w:w="1189"/>
+            <w:tcBorders>
+              <w:top w:val="single" w:color="808080" w:sz="4"/>
+              <w:left w:val="single" w:color="808080" w:sz="4"/>
+              <w:bottom w:val="single" w:color="808080" w:sz="4"/>
+              <w:right w:val="single" w:color="808080" w:sz="4"/>
+            </w:tcBorders>
+            <w:tcMar>
+              <w:top w:type="dxa" w:w="60"/>
+              <w:left w:type="dxa" w:w="100"/>
+              <w:bottom w:type="dxa" w:w="60"/>
+              <w:right w:type="dxa" w:w="100"/>
+            </w:tcMar>
+          </w:tcPr>
+          <w:p>
+            <w:r>
+              <w:rPr>
+                <w:rFonts w:ascii="Calibri" w:cs="Calibri" w:eastAsia="Calibri" w:hAnsi="Calibri"/>
+                <w:b w:val="false"/>
+                <w:bCs w:val="false"/>
+                <w:sz w:val="20"/>
+                <w:szCs w:val="20"/>
+              </w:rPr>
+              <w:t xml:space="preserve">0.632</w:t>
+            </w:r>
+          </w:p>
+        </w:tc>
+        <w:tc>
+          <w:tcPr>
+            <w:tcW w:type="dxa" w:w="1189"/>
+            <w:tcBorders>
+              <w:top w:val="single" w:color="808080" w:sz="4"/>
+              <w:left w:val="single" w:color="808080" w:sz="4"/>
+              <w:bottom w:val="single" w:color="808080" w:sz="4"/>
+              <w:right w:val="single" w:color="808080" w:sz="4"/>
+            </w:tcBorders>
+            <w:tcMar>
+              <w:top w:type="dxa" w:w="60"/>
+              <w:left w:type="dxa" w:w="100"/>
+              <w:bottom w:type="dxa" w:w="60"/>
+              <w:right w:type="dxa" w:w="100"/>
+            </w:tcMar>
+          </w:tcPr>
+          <w:p>
+            <w:r>
+              <w:rPr>
+                <w:rFonts w:ascii="Calibri" w:cs="Calibri" w:eastAsia="Calibri" w:hAnsi="Calibri"/>
+                <w:b w:val="false"/>
+                <w:bCs w:val="false"/>
+                <w:sz w:val="20"/>
+                <w:szCs w:val="20"/>
+              </w:rPr>
+              <w:t xml:space="preserve">1.913</w:t>
+            </w:r>
+          </w:p>
+        </w:tc>
+        <w:tc>
+          <w:tcPr>
+            <w:tcW w:type="dxa" w:w="1189"/>
+            <w:tcBorders>
+              <w:top w:val="single" w:color="808080" w:sz="4"/>
+              <w:left w:val="single" w:color="808080" w:sz="4"/>
+              <w:bottom w:val="single" w:color="808080" w:sz="4"/>
+              <w:right w:val="single" w:color="808080" w:sz="4"/>
+            </w:tcBorders>
+            <w:tcMar>
+              <w:top w:type="dxa" w:w="60"/>
+              <w:left w:type="dxa" w:w="100"/>
+              <w:bottom w:type="dxa" w:w="60"/>
+              <w:right w:type="dxa" w:w="100"/>
+            </w:tcMar>
+          </w:tcPr>
+          <w:p>
+            <w:r>
+              <w:rPr>
+                <w:rFonts w:ascii="Calibri" w:cs="Calibri" w:eastAsia="Calibri" w:hAnsi="Calibri"/>
+                <w:b w:val="false"/>
+                <w:bCs w:val="false"/>
+                <w:sz w:val="20"/>
+                <w:szCs w:val="20"/>
+              </w:rPr>
+              <w:t xml:space="preserve">1.181</w:t>
+            </w:r>
+          </w:p>
+        </w:tc>
+        <w:tc>
+          <w:tcPr>
+            <w:tcW w:type="dxa" w:w="1189"/>
+            <w:tcBorders>
+              <w:top w:val="single" w:color="808080" w:sz="4"/>
+              <w:left w:val="single" w:color="808080" w:sz="4"/>
+              <w:bottom w:val="single" w:color="808080" w:sz="4"/>
+              <w:right w:val="single" w:color="808080" w:sz="4"/>
+            </w:tcBorders>
+            <w:tcMar>
+              <w:top w:type="dxa" w:w="60"/>
+              <w:left w:type="dxa" w:w="100"/>
+              <w:bottom w:type="dxa" w:w="60"/>
+              <w:right w:type="dxa" w:w="100"/>
+            </w:tcMar>
+          </w:tcPr>
+          <w:p>
+            <w:r>
+              <w:rPr>
+                <w:rFonts w:ascii="Calibri" w:cs="Calibri" w:eastAsia="Calibri" w:hAnsi="Calibri"/>
+                <w:b w:val="false"/>
+                <w:bCs w:val="false"/>
+                <w:sz w:val="20"/>
+                <w:szCs w:val="20"/>
+              </w:rPr>
+              <w:t xml:space="preserve">1.62</w:t>
+            </w:r>
+          </w:p>
+        </w:tc>
+        <w:tc>
+          <w:tcPr>
+            <w:tcW w:type="dxa" w:w="1192"/>
+            <w:tcBorders>
+              <w:top w:val="single" w:color="808080" w:sz="4"/>
+              <w:left w:val="single" w:color="808080" w:sz="4"/>
+              <w:bottom w:val="single" w:color="808080" w:sz="4"/>
+              <w:right w:val="single" w:color="808080" w:sz="4"/>
+            </w:tcBorders>
+            <w:tcMar>
+              <w:top w:type="dxa" w:w="60"/>
+              <w:left w:type="dxa" w:w="100"/>
+              <w:bottom w:type="dxa" w:w="60"/>
+              <w:right w:type="dxa" w:w="100"/>
+            </w:tcMar>
+          </w:tcPr>
+          <w:p>
+            <w:r>
+              <w:rPr>
+                <w:rFonts w:ascii="Calibri" w:cs="Calibri" w:eastAsia="Calibri" w:hAnsi="Calibri"/>
+                <w:b w:val="false"/>
+                <w:bCs w:val="false"/>
+                <w:sz w:val="20"/>
+                <w:szCs w:val="20"/>
+              </w:rPr>
+              <w:t xml:space="preserve">2 / 4 / 6</w:t>
+            </w:r>
+          </w:p>
+        </w:tc>
+      </w:tr>
+      <w:tr>
+        <w:tc>
+          <w:tcPr>
+            <w:tcW w:type="dxa" w:w="700"/>
+            <w:tcBorders>
+              <w:top w:val="single" w:color="808080" w:sz="4"/>
+              <w:left w:val="single" w:color="808080" w:sz="4"/>
+              <w:bottom w:val="single" w:color="808080" w:sz="4"/>
+              <w:right w:val="single" w:color="808080" w:sz="4"/>
+            </w:tcBorders>
+            <w:tcMar>
+              <w:top w:type="dxa" w:w="60"/>
+              <w:left w:type="dxa" w:w="100"/>
+              <w:bottom w:type="dxa" w:w="60"/>
+              <w:right w:type="dxa" w:w="100"/>
+            </w:tcMar>
+          </w:tcPr>
+          <w:p>
+            <w:r>
+              <w:rPr>
+                <w:rFonts w:ascii="Calibri" w:cs="Calibri" w:eastAsia="Calibri" w:hAnsi="Calibri"/>
+                <w:b/>
+                <w:bCs/>
+                <w:sz w:val="20"/>
+                <w:szCs w:val="20"/>
+              </w:rPr>
+              <w:t xml:space="preserve">11</w:t>
+            </w:r>
+          </w:p>
+        </w:tc>
+        <w:tc>
+          <w:tcPr>
+            <w:tcW w:type="dxa" w:w="1189"/>
+            <w:tcBorders>
+              <w:top w:val="single" w:color="808080" w:sz="4"/>
+              <w:left w:val="single" w:color="808080" w:sz="4"/>
+              <w:bottom w:val="single" w:color="808080" w:sz="4"/>
+              <w:right w:val="single" w:color="808080" w:sz="4"/>
+            </w:tcBorders>
+            <w:tcMar>
+              <w:top w:type="dxa" w:w="60"/>
+              <w:left w:type="dxa" w:w="100"/>
+              <w:bottom w:type="dxa" w:w="60"/>
+              <w:right w:type="dxa" w:w="100"/>
+            </w:tcMar>
+          </w:tcPr>
+          <w:p>
+            <w:r>
+              <w:rPr>
+                <w:rFonts w:ascii="Calibri" w:cs="Calibri" w:eastAsia="Calibri" w:hAnsi="Calibri"/>
+                <w:b w:val="false"/>
+                <w:bCs w:val="false"/>
+                <w:sz w:val="20"/>
+                <w:szCs w:val="20"/>
+              </w:rPr>
+              <w:t xml:space="preserve">0.705</w:t>
+            </w:r>
+          </w:p>
+        </w:tc>
+        <w:tc>
+          <w:tcPr>
+            <w:tcW w:type="dxa" w:w="1189"/>
+            <w:tcBorders>
+              <w:top w:val="single" w:color="808080" w:sz="4"/>
+              <w:left w:val="single" w:color="808080" w:sz="4"/>
+              <w:bottom w:val="single" w:color="808080" w:sz="4"/>
+              <w:right w:val="single" w:color="808080" w:sz="4"/>
+            </w:tcBorders>
+            <w:tcMar>
+              <w:top w:type="dxa" w:w="60"/>
+              <w:left w:type="dxa" w:w="100"/>
+              <w:bottom w:type="dxa" w:w="60"/>
+              <w:right w:type="dxa" w:w="100"/>
+            </w:tcMar>
+          </w:tcPr>
+          <w:p>
+            <w:r>
+              <w:rPr>
+                <w:rFonts w:ascii="Calibri" w:cs="Calibri" w:eastAsia="Calibri" w:hAnsi="Calibri"/>
+                <w:b w:val="false"/>
+                <w:bCs w:val="false"/>
+                <w:sz w:val="20"/>
+                <w:szCs w:val="20"/>
+              </w:rPr>
+              <w:t xml:space="preserve">0.587</w:t>
+            </w:r>
+          </w:p>
+        </w:tc>
+        <w:tc>
+          <w:tcPr>
+            <w:tcW w:type="dxa" w:w="1189"/>
+            <w:tcBorders>
+              <w:top w:val="single" w:color="808080" w:sz="4"/>
+              <w:left w:val="single" w:color="808080" w:sz="4"/>
+              <w:bottom w:val="single" w:color="808080" w:sz="4"/>
+              <w:right w:val="single" w:color="808080" w:sz="4"/>
+            </w:tcBorders>
+            <w:tcMar>
+              <w:top w:type="dxa" w:w="60"/>
+              <w:left w:type="dxa" w:w="100"/>
+              <w:bottom w:type="dxa" w:w="60"/>
+              <w:right w:type="dxa" w:w="100"/>
+            </w:tcMar>
+          </w:tcPr>
+          <w:p>
+            <w:r>
+              <w:rPr>
+                <w:rFonts w:ascii="Calibri" w:cs="Calibri" w:eastAsia="Calibri" w:hAnsi="Calibri"/>
+                <w:b w:val="false"/>
+                <w:bCs w:val="false"/>
+                <w:sz w:val="20"/>
+                <w:szCs w:val="20"/>
+              </w:rPr>
+              <w:t xml:space="preserve">0.576</w:t>
+            </w:r>
+          </w:p>
+        </w:tc>
+        <w:tc>
+          <w:tcPr>
+            <w:tcW w:type="dxa" w:w="1189"/>
+            <w:tcBorders>
+              <w:top w:val="single" w:color="808080" w:sz="4"/>
+              <w:left w:val="single" w:color="808080" w:sz="4"/>
+              <w:bottom w:val="single" w:color="808080" w:sz="4"/>
+              <w:right w:val="single" w:color="808080" w:sz="4"/>
+            </w:tcBorders>
+            <w:tcMar>
+              <w:top w:type="dxa" w:w="60"/>
+              <w:left w:type="dxa" w:w="100"/>
+              <w:bottom w:type="dxa" w:w="60"/>
+              <w:right w:type="dxa" w:w="100"/>
+            </w:tcMar>
+          </w:tcPr>
+          <w:p>
+            <w:r>
+              <w:rPr>
+                <w:rFonts w:ascii="Calibri" w:cs="Calibri" w:eastAsia="Calibri" w:hAnsi="Calibri"/>
+                <w:b w:val="false"/>
+                <w:bCs w:val="false"/>
+                <w:sz w:val="20"/>
+                <w:szCs w:val="20"/>
+              </w:rPr>
+              <w:t xml:space="preserve">1.868</w:t>
+            </w:r>
+          </w:p>
+        </w:tc>
+        <w:tc>
+          <w:tcPr>
+            <w:tcW w:type="dxa" w:w="1189"/>
+            <w:tcBorders>
+              <w:top w:val="single" w:color="808080" w:sz="4"/>
+              <w:left w:val="single" w:color="808080" w:sz="4"/>
+              <w:bottom w:val="single" w:color="808080" w:sz="4"/>
+              <w:right w:val="single" w:color="808080" w:sz="4"/>
+            </w:tcBorders>
+            <w:tcMar>
+              <w:top w:type="dxa" w:w="60"/>
+              <w:left w:type="dxa" w:w="100"/>
+              <w:bottom w:type="dxa" w:w="60"/>
+              <w:right w:type="dxa" w:w="100"/>
+            </w:tcMar>
+          </w:tcPr>
+          <w:p>
+            <w:r>
+              <w:rPr>
+                <w:rFonts w:ascii="Calibri" w:cs="Calibri" w:eastAsia="Calibri" w:hAnsi="Calibri"/>
+                <w:b w:val="false"/>
+                <w:bCs w:val="false"/>
+                <w:sz w:val="20"/>
+                <w:szCs w:val="20"/>
+              </w:rPr>
+              <w:t xml:space="preserve">1.127</w:t>
+            </w:r>
+          </w:p>
+        </w:tc>
+        <w:tc>
+          <w:tcPr>
+            <w:tcW w:type="dxa" w:w="1189"/>
+            <w:tcBorders>
+              <w:top w:val="single" w:color="808080" w:sz="4"/>
+              <w:left w:val="single" w:color="808080" w:sz="4"/>
+              <w:bottom w:val="single" w:color="808080" w:sz="4"/>
+              <w:right w:val="single" w:color="808080" w:sz="4"/>
+            </w:tcBorders>
+            <w:tcMar>
+              <w:top w:type="dxa" w:w="60"/>
+              <w:left w:type="dxa" w:w="100"/>
+              <w:bottom w:type="dxa" w:w="60"/>
+              <w:right w:type="dxa" w:w="100"/>
+            </w:tcMar>
+          </w:tcPr>
+          <w:p>
+            <w:r>
+              <w:rPr>
+                <w:rFonts w:ascii="Calibri" w:cs="Calibri" w:eastAsia="Calibri" w:hAnsi="Calibri"/>
+                <w:b w:val="false"/>
+                <w:bCs w:val="false"/>
+                <w:sz w:val="20"/>
+                <w:szCs w:val="20"/>
+              </w:rPr>
+              <w:t xml:space="preserve">1.66</w:t>
+            </w:r>
+          </w:p>
+        </w:tc>
+        <w:tc>
+          <w:tcPr>
+            <w:tcW w:type="dxa" w:w="1192"/>
+            <w:tcBorders>
+              <w:top w:val="single" w:color="808080" w:sz="4"/>
+              <w:left w:val="single" w:color="808080" w:sz="4"/>
+              <w:bottom w:val="single" w:color="808080" w:sz="4"/>
+              <w:right w:val="single" w:color="808080" w:sz="4"/>
+            </w:tcBorders>
+            <w:tcMar>
+              <w:top w:type="dxa" w:w="60"/>
+              <w:left w:type="dxa" w:w="100"/>
+              <w:bottom w:type="dxa" w:w="60"/>
+              <w:right w:type="dxa" w:w="100"/>
+            </w:tcMar>
+          </w:tcPr>
+          <w:p>
+            <w:r>
+              <w:rPr>
+                <w:rFonts w:ascii="Calibri" w:cs="Calibri" w:eastAsia="Calibri" w:hAnsi="Calibri"/>
+                <w:b w:val="false"/>
+                <w:bCs w:val="false"/>
+                <w:sz w:val="20"/>
+                <w:szCs w:val="20"/>
+              </w:rPr>
+              <w:t xml:space="preserve">2 / 4 / 6</w:t>
+            </w:r>
+          </w:p>
+        </w:tc>
+      </w:tr>
+    </w:tbl>
+    <w:p/>
+    <w:p>
+      <w:pPr>
+        <w:spacing w:after="120"/>
+      </w:pPr>
+      <w:r>
+        <w:rPr>
+          <w:rFonts w:ascii="Calibri" w:cs="Calibri" w:eastAsia="Calibri" w:hAnsi="Calibri"/>
+          <w:sz w:val="22"/>
+          <w:szCs w:val="22"/>
+        </w:rPr>
+        <w:t xml:space="preserve">Averages over the 11 runs with a limit of 3: serial total 1.814 s, wall time 1.112 s, speedup 1.63. results_match=YES in every run.</w:t>
       </w:r>
     </w:p>
     <w:p>
@@ -11080,7 +13948,7 @@
           <w:sz w:val="22"/>
           <w:szCs w:val="22"/>
         </w:rPr>
-        <w:t xml:space="preserve">A (counting primes) took longest in every run, about 0.63 to 0.72 s; B and C took about 0.55 to 0.58 s each. In the run with a limit of 3 the serial times were A = 0.719 s, B = 0.584 s and C = 0.584 s (total 1.886 s), and the parallel wall time was 1.123 s, a speedup of 1.68.</w:t>
+        <w:t xml:space="preserve">A (counting primes) took longest in every run, about 0.63 to 0.72 s; B and C took about 0.55 to 0.58 s each. In the run with a limit of 3 the serial times were A = 0.719 s, B = 0.584 s and C = 0.584 s (total 1.886 s), and the parallel wall time was 1.123 s, a speedup of 1.68. Over all 11 runs with a limit of 3 the wall time was 1.053 to 1.181 s (average 1.112 s) and the speedup 1.53 to 1.71 (average 1.63).</w:t>
       </w:r>
     </w:p>
     <w:p>
@@ -11175,7 +14043,7 @@
           <w:sz w:val="22"/>
           <w:szCs w:val="22"/>
         </w:rPr>
-        <w:t xml:space="preserve">In the runs with limits of 3, 4 and 8 the assignment was the same: A on thread 2 (the calling thread), B on thread 4 and C on thread 6. With a limit of 2 it was A = 2, B = 4, C = 2: the calling thread ran A and then, when it finished, also took C. With a limit of 1 the calling thread ran all three, one after another. The repeated runs with a limit of 3 are recorded above.</w:t>
+        <w:t xml:space="preserve">In the runs with limits of 3, 4 and 8 the assignment was the same: A on thread 2 (the calling thread), B on thread 4 and C on thread 6. With a limit of 2 it was A = 2, B = 4, C = 2: the calling thread ran A and then, when it finished, also took C. With a limit of 1 the calling thread ran all three, one after another. The repeated runs with a limit of 3 are recorded above: in all 11 runs with a limit of 3 the assignment was A = 2, B = 4, C = 6.</w:t>
       </w:r>
     </w:p>
     <w:p>

</xml_diff>

<commit_message>
Lab 6 report: fill remaining local-mode runs
Co-Authored-By: Claude Opus 5.5 <noreply@anthropic.com>
Claude-Session: https://claude.ai/code/session_01MRtG6dEqhFRvA9gCPi6R4t
</commit_message>
<xml_diff>
--- a/Lab6_PDC/PDC_Lab06_Report.docx
+++ b/Lab6_PDC/PDC_Lab06_Report.docx
@@ -6762,7 +6762,7 @@
                 <w:sz w:val="20"/>
                 <w:szCs w:val="20"/>
               </w:rPr>
-              <w:t xml:space="preserve">pending</w:t>
+              <w:t xml:space="preserve">0</w:t>
             </w:r>
           </w:p>
         </w:tc>
@@ -6880,7 +6880,7 @@
                 <w:sz w:val="20"/>
                 <w:szCs w:val="20"/>
               </w:rPr>
-              <w:t xml:space="preserve">pending</w:t>
+              <w:t xml:space="preserve">0</w:t>
             </w:r>
           </w:p>
         </w:tc>
@@ -6998,7 +6998,7 @@
                 <w:sz w:val="20"/>
                 <w:szCs w:val="20"/>
               </w:rPr>
-              <w:t xml:space="preserve">pending</w:t>
+              <w:t xml:space="preserve">0</w:t>
             </w:r>
           </w:p>
         </w:tc>
@@ -7116,7 +7116,7 @@
                 <w:sz w:val="20"/>
                 <w:szCs w:val="20"/>
               </w:rPr>
-              <w:t xml:space="preserve">pending</w:t>
+              <w:t xml:space="preserve">0</w:t>
             </w:r>
           </w:p>
         </w:tc>
@@ -7234,7 +7234,7 @@
                 <w:sz w:val="20"/>
                 <w:szCs w:val="20"/>
               </w:rPr>
-              <w:t xml:space="preserve">pending</w:t>
+              <w:t xml:space="preserve">0</w:t>
             </w:r>
           </w:p>
         </w:tc>
@@ -7352,7 +7352,7 @@
                 <w:sz w:val="20"/>
                 <w:szCs w:val="20"/>
               </w:rPr>
-              <w:t xml:space="preserve">pending</w:t>
+              <w:t xml:space="preserve">0</w:t>
             </w:r>
           </w:p>
         </w:tc>
@@ -7470,7 +7470,7 @@
                 <w:sz w:val="20"/>
                 <w:szCs w:val="20"/>
               </w:rPr>
-              <w:t xml:space="preserve">pending</w:t>
+              <w:t xml:space="preserve">0</w:t>
             </w:r>
           </w:p>
         </w:tc>
@@ -7588,7 +7588,7 @@
                 <w:sz w:val="20"/>
                 <w:szCs w:val="20"/>
               </w:rPr>
-              <w:t xml:space="preserve">pending</w:t>
+              <w:t xml:space="preserve">0</w:t>
             </w:r>
           </w:p>
         </w:tc>
@@ -7706,7 +7706,7 @@
                 <w:sz w:val="20"/>
                 <w:szCs w:val="20"/>
               </w:rPr>
-              <w:t xml:space="preserve">pending</w:t>
+              <w:t xml:space="preserve">0</w:t>
             </w:r>
           </w:p>
         </w:tc>
@@ -14207,7 +14207,7 @@
           <w:sz w:val="22"/>
           <w:szCs w:val="22"/>
         </w:rPr>
-        <w:t xml:space="preserve">☐ Buggy ScopingBug mode run 10 times, both fixed modes run 10 times, static-lambda compile error captured</w:t>
+        <w:t xml:space="preserve">☑ Buggy ScopingBug mode run 10 times, both fixed modes run 10 times, static-lambda compile error captured</w:t>
       </w:r>
     </w:p>
     <w:p>

</xml_diff>

<commit_message>
Lab 6 report: shorter discussion answers
Co-Authored-By: Claude Opus 5.5 <noreply@anthropic.com>
Claude-Session: https://claude.ai/code/session_01MRtG6dEqhFRvA9gCPi6R4t
</commit_message>
<xml_diff>
--- a/Lab6_PDC/PDC_Lab06_Report.docx
+++ b/Lab6_PDC/PDC_Lab06_Report.docx
@@ -2665,33 +2665,7 @@
           <w:sz w:val="22"/>
           <w:szCs w:val="22"/>
         </w:rPr>
-        <w:t xml:space="preserve">Only with a limit of 1, where one thread printed iterations 0 to 15 in order. With 2, 4 and 8 the lines were interleaved and the order changed between the two runs of the same setting. For example, with a limit of 4 the first run started with 12, 0, 4, 8 and the second with 12, 0, 8, 4, and the same iteration ran on a different thread (iteration 0 on thread 2 in run 1 and on thread 6 in run 2).</w:t>
-      </w:r>
-    </w:p>
-    <w:p>
-      <w:pPr>
-        <w:spacing w:after="120"/>
-      </w:pPr>
-      <w:r>
-        <w:rPr>
-          <w:rFonts w:ascii="Calibri" w:cs="Calibri" w:eastAsia="Calibri" w:hAnsi="Calibri"/>
-          <w:sz w:val="22"/>
-          <w:szCs w:val="22"/>
-        </w:rPr>
-        <w:t xml:space="preserve">The order also shows how Parallel.For splits the work: with a limit of 2, thread 2 took the block 0 to 7 and thread 4 the block 8 to 14 (iteration 15 went to the replacement thread 6, see Question 2), and with 8 each thread started at an even index (0, 2, 4, ... 14). Inside a block the order is fixed, but the blocks run at the same time.</w:t>
-      </w:r>
-    </w:p>
-    <w:p>
-      <w:pPr>
-        <w:spacing w:after="120"/>
-      </w:pPr>
-      <w:r>
-        <w:rPr>
-          <w:rFonts w:ascii="Calibri" w:cs="Calibri" w:eastAsia="Calibri" w:hAnsi="Calibri"/>
-          <w:sz w:val="22"/>
-          <w:szCs w:val="22"/>
-        </w:rPr>
-        <w:t xml:space="preserve">Parallel.For only promises that every iteration runs once. Which thread runs which block, and when, depends on the operating system scheduler and on which threads are free, and Console.WriteLine calls from different threads are printed in whatever order they reach the console. Guaranteeing an order would need synchronization between iterations and would remove most of the parallelism, so the library leaves it to the programmer (like OpenMP, which needs an explicit ordered clause).</w:t>
+        <w:t xml:space="preserve">No. Only limit 1 printed 0 to 15 in order; with 2, 4 and 8 the order changed every run. Parallel.For only guarantees that each iteration runs once. Which thread runs which iteration and when depends on the OS scheduler, so forcing an order would need extra synchronization and would kill the parallelism (OpenMP also needs an explicit ordered clause).</w:t>
       </w:r>
     </w:p>
     <w:p>
@@ -2719,33 +2693,7 @@
           <w:sz w:val="22"/>
           <w:szCs w:val="22"/>
         </w:rPr>
-        <w:t xml:space="preserve">Limit 1: 1 thread. Limit 2: 3 threads. Limit 4: 6 threads in the first run and 4 in the second. Limit 8: 9 threads in the first run and 8 in the second. So the number of distinct threads can be higher than the limit. The extra threads ran only one iteration each, at the end (for example 6:1 with a limit of 2, and 8:1 and 9:1 with a limit of 4). This happens because a Parallel.For worker gives its thread back to the pool after a while and a replacement worker continues the remaining iterations, possibly on another pool thread. The elapsed times show that no more than the limit ever ran at the same moment (for example 889 ms with a limit of 2, which is what 2 concurrent workers need).</w:t>
-      </w:r>
-    </w:p>
-    <w:p>
-      <w:pPr>
-        <w:spacing w:after="120"/>
-      </w:pPr>
-      <w:r>
-        <w:rPr>
-          <w:rFonts w:ascii="Calibri" w:cs="Calibri" w:eastAsia="Calibri" w:hAnsi="Calibri"/>
-          <w:sz w:val="22"/>
-          <w:szCs w:val="22"/>
-        </w:rPr>
-        <w:t xml:space="preserve">The calling thread (ID 2) took part in every run (calling_thread_participated=YES). Parallel.For does not just wait: the thread that calls it runs one of the workers itself, so with a limit of 1 the whole loop ran on the calling thread.</w:t>
-      </w:r>
-    </w:p>
-    <w:p>
-      <w:pPr>
-        <w:spacing w:after="120"/>
-      </w:pPr>
-      <w:r>
-        <w:rPr>
-          <w:rFonts w:ascii="Calibri" w:cs="Calibri" w:eastAsia="Calibri" w:hAnsi="Calibri"/>
-          <w:sz w:val="22"/>
-          <w:szCs w:val="22"/>
-        </w:rPr>
-        <w:t xml:space="preserve">Fewer threads than the limit can be used when there are fewer iterations or chunks than the limit, when the loop is so short that the workers already running finish everything before new ones start, or when the thread pool has no free thread yet (the pool creates new threads slowly once its minimum is used up). The limit is an upper bound, not a guaranteed team size.</w:t>
+        <w:t xml:space="preserve">Distinct threads were 1, 3, 6 and 9 for limits 1, 2, 4 and 8, sometimes more than the limit, because a worker can hand over to a replacement pool thread mid-loop (the extra threads ran only 1 iteration). The limit is never exceeded at the same moment. The calling thread (ID 2) took part every time. Fewer threads than the limit can be used when there are few iterations, the work finishes quickly, or the thread pool has no free thread yet.</w:t>
       </w:r>
     </w:p>
     <w:p>
@@ -2773,33 +2721,7 @@
           <w:sz w:val="22"/>
           <w:szCs w:val="22"/>
         </w:rPr>
-        <w:t xml:space="preserve">Elapsed was always a little above the prediction: 1763 vs 1600 ms (limit 1), 889 vs 800 ms (2), 453 vs 400 ms (4) and 273 vs 200 ms (8). Each step of halving the time was achieved, so the sleeping loop scaled almost perfectly up to 8. The extra time is mostly per iteration: on Windows Thread.Sleep(100) usually lasts about 109 ms because of the 15.6 ms timer tick, and 16 x 109 = about 1750 ms matches the limit-1 result. Thread start-up and printing add a little more, which is why the gap is largest with 8 threads (273 ms), where the pool had to provide 8 threads at once.</w:t>
-      </w:r>
-    </w:p>
-    <w:p>
-      <w:pPr>
-        <w:spacing w:after="120"/>
-      </w:pPr>
-      <w:r>
-        <w:rPr>
-          <w:rFonts w:ascii="Calibri" w:cs="Calibri" w:eastAsia="Calibri" w:hAnsi="Calibri"/>
-          <w:sz w:val="22"/>
-          <w:szCs w:val="22"/>
-        </w:rPr>
-        <w:t xml:space="preserve">This machine has 8 logical processors, so the largest limit tested (8) equals ProcessorCount and the default run without an argument also used 8 (226 ms). For a limit above 8 with sleeping iterations, the time would keep dropping, because a sleeping thread does not use a core, but only as fast as the thread pool adds threads beyond its minimum (it adds them gradually), so the gain would be smaller than predicted.</w:t>
-      </w:r>
-    </w:p>
-    <w:p>
-      <w:pPr>
-        <w:spacing w:after="120"/>
-      </w:pPr>
-      <w:r>
-        <w:rPr>
-          <w:rFonts w:ascii="Calibri" w:cs="Calibri" w:eastAsia="Calibri" w:hAnsi="Calibri"/>
-          <w:sz w:val="22"/>
-          <w:szCs w:val="22"/>
-        </w:rPr>
-        <w:t xml:space="preserve">If the iterations were CPU-bound, the answer would change: at most 8 iterations can really run at once, so a limit above 8 would not reduce the time any further. The extra threads would only take turns on the same cores, adding context-switch overhead.</w:t>
+        <w:t xml:space="preserve">Elapsed was slightly above predicted (1763/1600, 889/800, 453/400, 273/200 ms) because Sleep(100) really takes about 109 ms on Windows, plus thread start-up. With sleeping iterations a limit above ProcessorCount (8) still helps, since sleeping threads do not use a core. With CPU-bound iterations it would not: only 8 can run at once, so extra threads just time-share the cores.</w:t>
       </w:r>
     </w:p>
     <w:p>
@@ -2827,20 +2749,7 @@
           <w:sz w:val="22"/>
           <w:szCs w:val="22"/>
         </w:rPr>
-        <w:t xml:space="preserve">In OpenMP a parallel region creates a team of exactly OMP_NUM_THREADS threads, numbered 0 to N-1 by omp_get_thread_num(), the master thread is always 0, and the same team is normally reused in later regions. Here the IDs are managed thread IDs (2, 4, 6, 7, ...), they are not contiguous and not a rank inside a team, and the threads come from the shared .NET thread pool, which reuses them for any work in the process. The same pool threads appeared again in later settings (2, 4, 6, 7, ...), and the calling thread (2) plays the role of the master thread.</w:t>
-      </w:r>
-    </w:p>
-    <w:p>
-      <w:pPr>
-        <w:spacing w:after="120"/>
-      </w:pPr>
-      <w:r>
-        <w:rPr>
-          <w:rFonts w:ascii="Calibri" w:cs="Calibri" w:eastAsia="Calibri" w:hAnsi="Calibri"/>
-          <w:sz w:val="22"/>
-          <w:szCs w:val="22"/>
-        </w:rPr>
-        <w:t xml:space="preserve">MaxDegreeOfParallelism limits how many workers (iterations) of this one loop may run at the same time. It does not create threads, does not fix which or how many distinct threads are used over the whole loop (we saw 9 distinct threads with a limit of 8), and does not limit other work in the process. It is an upper bound, whereas OMP_NUM_THREADS requests a fixed team size.</w:t>
+        <w:t xml:space="preserve">OpenMP makes a fixed team with IDs 0 to N-1 (master = 0). TPL uses shared thread-pool threads with arbitrary managed IDs (2, 4, 6, ...) that are reused across the program. MaxDegreeOfParallelism only caps how many iterations of this loop run concurrently; it is an upper bound, not a fixed team size.</w:t>
       </w:r>
     </w:p>
     <w:p>
@@ -4919,20 +4828,7 @@
           <w:sz w:val="22"/>
           <w:szCs w:val="22"/>
         </w:rPr>
-        <w:t xml:space="preserve">i is declared inside the lambda body (in the for statement), so every call of the lambda, that is every chunk, gets its own i on its own thread's stack. No other thread can see or change it, which is exactly what private(i) means in OpenMP.</w:t>
-      </w:r>
-    </w:p>
-    <w:p>
-      <w:pPr>
-        <w:spacing w:after="120"/>
-      </w:pPr>
-      <w:r>
-        <w:rPr>
-          <w:rFonts w:ascii="Calibri" w:cs="Calibri" w:eastAsia="Calibri" w:hAnsi="Calibri"/>
-          <w:sz w:val="22"/>
-          <w:szCs w:val="22"/>
-        </w:rPr>
-        <w:t xml:space="preserve">A variable declared outside the lambda is captured: the compiler moves it into one shared closure object on the heap, and all threads read and write that same copy. Written inside a parallel lambda, it becomes a data race: one thread can overwrite the value another thread has just stored and is about to use. Task 3 shows this bug.</w:t>
+        <w:t xml:space="preserve">i is declared inside the lambda, so each chunk has its own copy on its own stack (private). A variable declared outside but written inside the lambda is captured into one shared closure object, so all threads use the same copy, which is a data race.</w:t>
       </w:r>
     </w:p>
     <w:p>
@@ -4960,20 +4856,7 @@
           <w:sz w:val="22"/>
           <w:szCs w:val="22"/>
         </w:rPr>
-        <w:t xml:space="preserve">A static lambda may not capture anything from the method around it: no locals, no parameters and no this. So the arrays a, b, c and the size N had to be static members of the VecMath class, and the only per-call data the lambda gets is its parameter range. When a local n was used inside it, the build failed with error CS8820: "A static anonymous function cannot contain a reference to 'n'."</w:t>
-      </w:r>
-    </w:p>
-    <w:p>
-      <w:pPr>
-        <w:spacing w:after="120"/>
-      </w:pPr>
-      <w:r>
-        <w:rPr>
-          <w:rFonts w:ascii="Calibri" w:cs="Calibri" w:eastAsia="Calibri" w:hAnsi="Calibri"/>
-          <w:sz w:val="22"/>
-          <w:szCs w:val="22"/>
-        </w:rPr>
-        <w:t xml:space="preserve">In a large program it is easy to use an outer variable inside a parallel lambda by accident and create a shared variable without noticing. With static the compiler checks this for you: every variable the lambda uses is either its own (private) or a clearly shared static member, so the data scoping is visible and checked, much like default(none) in OpenMP. It also avoids allocating a closure object on every call.</w:t>
+        <w:t xml:space="preserve">static stops the lambda from capturing locals, so a, b, c and N had to be static members. Capturing a local gave: error CS8820: A static anonymous function cannot contain a reference to 'n'. In large programs this makes the compiler catch accidental shared variables, like default(none) in OpenMP.</w:t>
       </w:r>
     </w:p>
     <w:p>
@@ -5001,20 +4884,7 @@
           <w:sz w:val="22"/>
           <w:szCs w:val="22"/>
         </w:rPr>
-        <w:t xml:space="preserve">The speedup was very small: 1.09 with 2 threads, 1.14 with 4 and 1.11 with 8 (237.86, 217.91, 209.38 and 213.51 ms). Going from 4 to 8 threads made it slightly slower.</w:t>
-      </w:r>
-    </w:p>
-    <w:p>
-      <w:pPr>
-        <w:spacing w:after="120"/>
-      </w:pPr>
-      <w:r>
-        <w:rPr>
-          <w:rFonts w:ascii="Calibri" w:cs="Calibri" w:eastAsia="Calibri" w:hAnsi="Calibri"/>
-          <w:sz w:val="22"/>
-          <w:szCs w:val="22"/>
-        </w:rPr>
-        <w:t xml:space="preserve">Vector addition is memory-bound. Each element needs one addition but 24 bytes of memory traffic (read a[i] and b[i], write c[i]). One pass moves 5,000,000 x 24 bytes = 120 MB, so 20 passes move 2.4 GB. One thread already reaches about 10 GB/s (2.4 GB in 0.238 s) and 4 threads about 11.5 GB/s, which is close to what the memory system of the machine can deliver. Once the memory bus is saturated, more threads cannot fetch data any faster; they only wait for memory together, and the extra scheduling costs time. That is why the speedup stops at about 1.1x.</w:t>
+        <w:t xml:space="preserve">Speedup was only 1.09 (2 threads), 1.14 (4) and 1.11 (8). Vector addition is memory-bound: 1 addition per 24 bytes moved. About 10 GB/s with one thread is already near the memory bandwidth limit, so more threads just wait for memory.</w:t>
       </w:r>
     </w:p>
     <w:p>
@@ -5042,20 +4912,7 @@
           <w:sz w:val="22"/>
           <w:szCs w:val="22"/>
         </w:rPr>
-        <w:t xml:space="preserve">The chunks from Partitioner.Create(0, N) do not overlap, so each c[i] is written by exactly one thread, and a and b are only read. No element is written by two threads or written by one while another reads it, so there is no data race and nothing to lock. correct=YES was printed in all 12 runs.</w:t>
-      </w:r>
-    </w:p>
-    <w:p>
-      <w:pPr>
-        <w:spacing w:after="120"/>
-      </w:pPr>
-      <w:r>
-        <w:rPr>
-          <w:rFonts w:ascii="Calibri" w:cs="Calibri" w:eastAsia="Calibri" w:hAnsi="Calibri"/>
-          <w:sz w:val="22"/>
-          <w:szCs w:val="22"/>
-        </w:rPr>
-        <w:t xml:space="preserve">Parallel.ForEach does not return until every chunk has finished: there is an implicit barrier at the end of the call, like the barrier at the end of an OpenMP parallel for. This barrier also makes all the writes to c visible to the calling thread, so the next pass and Verify() always see the complete result.</w:t>
+        <w:t xml:space="preserve">Chunks do not overlap, so each c[i] is written by exactly one thread and a, b are only read. No shared write means no race and no lock. Parallel.ForEach returns only after all chunks finish (implicit barrier), which also makes all writes visible to the caller.</w:t>
       </w:r>
     </w:p>
     <w:p>
@@ -5083,7 +4940,7 @@
           <w:sz w:val="22"/>
           <w:szCs w:val="22"/>
         </w:rPr>
-        <w:t xml:space="preserve">The work per element is one addition, which takes about a nanosecond. Parallel.For with a delegate per element would call the delegate 5,000,000 times per pass and handle shared loop state for each index, so the overhead would be much larger than the work itself. Partitioner.Create(0, N) splits the range into a small number of large chunks, so the delegate is called once per chunk, and inside it a plain for loop runs over thousands of elements with no overhead. This gives the same result with much less overhead, similar to giving each OpenMP thread a large static block of the loop.</w:t>
+        <w:t xml:space="preserve">Calling a delegate for each of 5,000,000 elements would cost more than the one addition it does. Partitioning gives a few large chunks, so the delegate runs once per chunk with a fast inner for loop, which means much lower overhead.</w:t>
       </w:r>
     </w:p>
     <w:p>
@@ -7863,33 +7720,7 @@
           <w:sz w:val="22"/>
           <w:szCs w:val="22"/>
         </w:rPr>
-        <w:t xml:space="preserve">No. With 4 threads the 10 runs gave between 199,579 and 199,923 wrong elements out of 200,000 (about 99.9%), a different number every time. With 1 thread it printed 0 wrong elements.</w:t>
-      </w:r>
-    </w:p>
-    <w:p>
-      <w:pPr>
-        <w:spacing w:after="120"/>
-      </w:pPr>
-      <w:r>
-        <w:rPr>
-          <w:rFonts w:ascii="Calibri" w:cs="Calibri" w:eastAsia="Calibri" w:hAnsi="Calibri"/>
-          <w:sz w:val="22"/>
-          <w:szCs w:val="22"/>
-        </w:rPr>
-        <w:t xml:space="preserve">This is typical of a race condition: the result depends on the exact timing of the threads, which changes from run to run, so the error count varies. With one thread there is no other thread to overwrite tmp between the two statements, so the bug never shows, even though the code is exactly the same.</w:t>
-      </w:r>
-    </w:p>
-    <w:p>
-      <w:pPr>
-        <w:spacing w:after="120"/>
-      </w:pPr>
-      <w:r>
-        <w:rPr>
-          <w:rFonts w:ascii="Calibri" w:cs="Calibri" w:eastAsia="Calibri" w:hAnsi="Calibri"/>
-          <w:sz w:val="22"/>
-          <w:szCs w:val="22"/>
-        </w:rPr>
-        <w:t xml:space="preserve">A correct-looking run only shows that, with that particular timing, no harmful interleaving happened. On another machine, under a different load, with fewer threads or a shorter loop body, the same code could pass many times and then fail. The bug is in the code (a shared tmp), not in the run, so a passing test cannot prove the code is correct.</w:t>
+        <w:t xml:space="preserve">No. With 4 threads it gave 199,579 to 199,923 wrong elements (a different number each run); with 1 thread it gave 0. The result depends on thread timing, which is typical of a race. A correct run only means a bad interleaving did not happen that time, not that the code is correct.</w:t>
       </w:r>
     </w:p>
     <w:p>
@@ -7917,72 +7748,7 @@
           <w:sz w:val="22"/>
           <w:szCs w:val="22"/>
         </w:rPr>
-        <w:t xml:space="preserve">Let thread T1 handle i = 10 and thread T2 handle i = 20 (input[i] = i), with one shared tmp:</w:t>
-      </w:r>
-    </w:p>
-    <w:p>
-      <w:pPr>
-        <w:spacing w:after="120"/>
-      </w:pPr>
-      <w:r>
-        <w:rPr>
-          <w:rFonts w:ascii="Calibri" w:cs="Calibri" w:eastAsia="Calibri" w:hAnsi="Calibri"/>
-          <w:sz w:val="22"/>
-          <w:szCs w:val="22"/>
-        </w:rPr>
-        <w:t xml:space="preserve">1. T1 executes tmp = input[10] * 3, so tmp = 30.</w:t>
-      </w:r>
-    </w:p>
-    <w:p>
-      <w:pPr>
-        <w:spacing w:after="120"/>
-      </w:pPr>
-      <w:r>
-        <w:rPr>
-          <w:rFonts w:ascii="Calibri" w:cs="Calibri" w:eastAsia="Calibri" w:hAnsi="Calibri"/>
-          <w:sz w:val="22"/>
-          <w:szCs w:val="22"/>
-        </w:rPr>
-        <w:t xml:space="preserve">2. T2 executes tmp = input[20] * 3, so tmp = 60 (T1's value is overwritten).</w:t>
-      </w:r>
-    </w:p>
-    <w:p>
-      <w:pPr>
-        <w:spacing w:after="120"/>
-      </w:pPr>
-      <w:r>
-        <w:rPr>
-          <w:rFonts w:ascii="Calibri" w:cs="Calibri" w:eastAsia="Calibri" w:hAnsi="Calibri"/>
-          <w:sz w:val="22"/>
-          <w:szCs w:val="22"/>
-        </w:rPr>
-        <w:t xml:space="preserve">3. T1 executes output[10] = tmp + 7 = 67. The correct value is 30 + 7 = 37, so output[10] is wrong.</w:t>
-      </w:r>
-    </w:p>
-    <w:p>
-      <w:pPr>
-        <w:spacing w:after="120"/>
-      </w:pPr>
-      <w:r>
-        <w:rPr>
-          <w:rFonts w:ascii="Calibri" w:cs="Calibri" w:eastAsia="Calibri" w:hAnsi="Calibri"/>
-          <w:sz w:val="22"/>
-          <w:szCs w:val="22"/>
-        </w:rPr>
-        <w:t xml:space="preserve">4. T2 executes output[20] = tmp + 7 = 67, which happens to be correct.</w:t>
-      </w:r>
-    </w:p>
-    <w:p>
-      <w:pPr>
-        <w:spacing w:after="120"/>
-      </w:pPr>
-      <w:r>
-        <w:rPr>
-          <w:rFonts w:ascii="Calibri" w:cs="Calibri" w:eastAsia="Calibri" w:hAnsi="Calibri"/>
-          <w:sz w:val="22"/>
-          <w:szCs w:val="22"/>
-        </w:rPr>
-        <w:t xml:space="preserve">The Thread.SpinWait(20) between the two statements makes step 2 very likely, which is why almost every element was wrong.</w:t>
+        <w:t xml:space="preserve">T1 (i=10): tmp = 30. T2 (i=20): tmp = 60 (overwrites T1's value). T1: output[10] = 60 + 7 = 67 (wrong, should be 37). T2: output[20] = 67 (correct).</w:t>
       </w:r>
     </w:p>
     <w:p>
@@ -8010,33 +7776,7 @@
           <w:sz w:val="22"/>
           <w:szCs w:val="22"/>
         </w:rPr>
-        <w:t xml:space="preserve">Both fixes give every thread its own tmp, and both gave 0 wrong elements. The local fix simply declares int tmp inside the lambda, so each iteration has its own copy on its own stack. This is the simplest and clearest fix and is the usual choice when the value does not need to be carried between iterations.</w:t>
-      </w:r>
-    </w:p>
-    <w:p>
-      <w:pPr>
-        <w:spacing w:after="120"/>
-      </w:pPr>
-      <w:r>
-        <w:rPr>
-          <w:rFonts w:ascii="Calibri" w:cs="Calibri" w:eastAsia="Calibri" w:hAnsi="Calibri"/>
-          <w:sz w:val="22"/>
-          <w:szCs w:val="22"/>
-        </w:rPr>
-        <w:t xml:space="preserve">The thread-local-state fix uses the Parallel.For overload with localInit, body and localFinally. The initial value comes from the localInit delegate () =&gt; 0, which runs once for each worker, so each worker's tmp starts at 0. The body receives the current value and returns it, so the value is carried from one iteration to the next on the same worker, and localFinally runs once per worker at the end (empty here, but it is where per-thread results would be combined, as in a reduction).</w:t>
-      </w:r>
-    </w:p>
-    <w:p>
-      <w:pPr>
-        <w:spacing w:after="120"/>
-      </w:pPr>
-      <w:r>
-        <w:rPr>
-          <w:rFonts w:ascii="Calibri" w:cs="Calibri" w:eastAsia="Calibri" w:hAnsi="Calibri"/>
-          <w:sz w:val="22"/>
-          <w:szCs w:val="22"/>
-        </w:rPr>
-        <w:t xml:space="preserve">OpenMP private(tmp) gives each thread its own uninitialised copy, which matches the local version. firstprivate(tmp) gives each thread a copy initialised from the value before the region, which is close to localInit, except that localInit can compute any starting value instead of only copying the outer one. The localFinally step has no direct equivalent in private/firstprivate; it is closest to the combine step of a reduction.</w:t>
+        <w:t xml:space="preserve">Both fixes give each thread its own tmp, and both gave 0 wrong elements. Local declares tmp inside the lambda, like private(tmp). Thread-local state gets its initial value from localInit (() =&gt; 0) once per worker and carries it between iterations, similar to firstprivate. localFinally is like the combine step of a reduction.</w:t>
       </w:r>
     </w:p>
     <w:p>
@@ -8064,20 +7804,7 @@
           <w:sz w:val="22"/>
           <w:szCs w:val="22"/>
         </w:rPr>
-        <w:t xml:space="preserve">static on a lambda tells the compiler that the lambda must not capture any local variables, parameters or this from the method around it. Adding it to the buggy lambda produced error CS8820 for both uses of tmp (lines 22 and 24), so the shared variable was reported before the program could run.</w:t>
-      </w:r>
-    </w:p>
-    <w:p>
-      <w:pPr>
-        <w:spacing w:after="120"/>
-      </w:pPr>
-      <w:r>
-        <w:rPr>
-          <w:rFonts w:ascii="Calibri" w:cs="Calibri" w:eastAsia="Calibri" w:hAnsi="Calibri"/>
-          <w:sz w:val="22"/>
-          <w:szCs w:val="22"/>
-        </w:rPr>
-        <w:t xml:space="preserve">A compile error is found every time, at once, and it points to the exact line. A race at run time may appear only sometimes, produces wrong data silently (the program still printed a result) and is very hard to reproduce and debug. Catching the mistake when building is much cheaper and safer than finding wrong results later.</w:t>
+        <w:t xml:space="preserve">static forbids a lambda from capturing outer variables, so it gave CS8820 for 'tmp'. A compile error appears every time and points to the exact line, while a race gives wrong results silently and only sometimes, which is much harder to find.</w:t>
       </w:r>
     </w:p>
     <w:p>
@@ -8105,20 +7832,7 @@
           <w:sz w:val="22"/>
           <w:szCs w:val="22"/>
         </w:rPr>
-        <w:t xml:space="preserve">No, the bug would not disappear, but it would show up much less often. SpinWait(20) widens the gap between writing tmp and reading it, so another thread almost always writes in between (about 99.9% wrong). Without it the gap is only a few instructions, so far fewer elements would be wrong, and some runs might even print 0.</w:t>
-      </w:r>
-    </w:p>
-    <w:p>
-      <w:pPr>
-        <w:spacing w:after="120"/>
-      </w:pPr>
-      <w:r>
-        <w:rPr>
-          <w:rFonts w:ascii="Calibri" w:cs="Calibri" w:eastAsia="Calibri" w:hAnsi="Calibri"/>
-          <w:sz w:val="22"/>
-          <w:szCs w:val="22"/>
-        </w:rPr>
-        <w:t xml:space="preserve">Even a run with 0 wrong elements would not mean the program was correct. All threads still share one tmp with no synchronization, so the data race is still there; it is just less likely to be visible. Timing changes, other load on the machine or a different CPU could make it appear again. The program is correct only when tmp is private, as in the two fixes.</w:t>
+        <w:t xml:space="preserve">No. Without SpinWait the window between write and read is smaller, so fewer elements would be wrong (maybe 0 in some runs). The program would still be incorrect, because tmp is still shared and the race is still there; it is just hidden.</w:t>
       </w:r>
     </w:p>
     <w:p>
@@ -13948,33 +13662,7 @@
           <w:sz w:val="22"/>
           <w:szCs w:val="22"/>
         </w:rPr>
-        <w:t xml:space="preserve">A (counting primes) took longest in every run, about 0.63 to 0.72 s; B and C took about 0.55 to 0.58 s each. In the run with a limit of 3 the serial times were A = 0.719 s, B = 0.584 s and C = 0.584 s (total 1.886 s), and the parallel wall time was 1.123 s, a speedup of 1.68. Over all 11 runs with a limit of 3 the wall time was 1.053 to 1.181 s (average 1.112 s) and the speedup 1.53 to 1.71 (average 1.63).</w:t>
-      </w:r>
-    </w:p>
-    <w:p>
-      <w:pPr>
-        <w:spacing w:after="120"/>
-      </w:pPr>
-      <w:r>
-        <w:rPr>
-          <w:rFonts w:ascii="Calibri" w:cs="Calibri" w:eastAsia="Calibri" w:hAnsi="Calibri"/>
-          <w:sz w:val="22"/>
-          <w:szCs w:val="22"/>
-        </w:rPr>
-        <w:t xml:space="preserve">The best possible wall time is the longest single action, 0.719 s, because A cannot be split and the call cannot return before A finishes. That would be a speedup of 1.886 / 0.719 = 2.62, and never more than 3 with three actions. So the main limit on the speedup is the number of independent actions and the size of the largest one (load imbalance).</w:t>
-      </w:r>
-    </w:p>
-    <w:p>
-      <w:pPr>
-        <w:spacing w:after="120"/>
-      </w:pPr>
-      <w:r>
-        <w:rPr>
-          <w:rFonts w:ascii="Calibri" w:cs="Calibri" w:eastAsia="Calibri" w:hAnsi="Calibri"/>
-          <w:sz w:val="22"/>
-          <w:szCs w:val="22"/>
-        </w:rPr>
-        <w:t xml:space="preserve">The measured 1.123 s is longer than 0.719 s because each action ran slower when all three ran at the same time. When several cores are busy the CPU lowers its turbo clock, and if two actions share one physical core (hyper-threading: 8 logical processors do not mean 8 full cores) they compete for it. Thread start-up adds a little more.</w:t>
+        <w:t xml:space="preserve">A took longest (about 0.63 to 0.72 s). With limit 3: wall 1.123 s vs longest action 0.719 s vs serial total 1.886 s (speedup 1.68; 11-run average 1.63). The speedup is limited by the longest action (best case 1.886 / 0.719 = 2.6) and by the actions slowing down when running together (lower turbo clock, shared cores).</w:t>
       </w:r>
     </w:p>
     <w:p>
@@ -14002,20 +13690,7 @@
           <w:sz w:val="22"/>
           <w:szCs w:val="22"/>
         </w:rPr>
-        <w:t xml:space="preserve">There are only three actions, so at most three can run at once. With a limit of 4 or 8 exactly the same three threads (2, 4 and 6) ran A, B and C, and the wall time stayed about the same (1.109 s with 4) or was a little worse (1.289 s with 8, which is run-to-run variation in CPU clock and background load, not extra work).</w:t>
-      </w:r>
-    </w:p>
-    <w:p>
-      <w:pPr>
-        <w:spacing w:after="120"/>
-      </w:pPr>
-      <w:r>
-        <w:rPr>
-          <w:rFonts w:ascii="Calibri" w:cs="Calibri" w:eastAsia="Calibri" w:hAnsi="Calibri"/>
-          <w:sz w:val="22"/>
-          <w:szCs w:val="22"/>
-        </w:rPr>
-        <w:t xml:space="preserve">The extra threads were never used. MaxDegreeOfParallelism is only an upper bound; Parallel.Invoke creates one unit of work per action, so there was nothing for a fourth thread to do and no extra threads were started.</w:t>
+        <w:t xml:space="preserve">There are only 3 actions, so at most 3 threads can work; limits of 4 and 8 used the same 3 threads (2, 4, 6). The extra allowed threads were never used, because MaxDegreeOfParallelism is only an upper bound.</w:t>
       </w:r>
     </w:p>
     <w:p>
@@ -14043,20 +13718,7 @@
           <w:sz w:val="22"/>
           <w:szCs w:val="22"/>
         </w:rPr>
-        <w:t xml:space="preserve">In the runs with limits of 3, 4 and 8 the assignment was the same: A on thread 2 (the calling thread), B on thread 4 and C on thread 6. With a limit of 2 it was A = 2, B = 4, C = 2: the calling thread ran A and then, when it finished, also took C. With a limit of 1 the calling thread ran all three, one after another. The repeated runs with a limit of 3 are recorded above: in all 11 runs with a limit of 3 the assignment was A = 2, B = 4, C = 6.</w:t>
-      </w:r>
-    </w:p>
-    <w:p>
-      <w:pPr>
-        <w:spacing w:after="120"/>
-      </w:pPr>
-      <w:r>
-        <w:rPr>
-          <w:rFonts w:ascii="Calibri" w:cs="Calibri" w:eastAsia="Calibri" w:hAnsi="Calibri"/>
-          <w:sz w:val="22"/>
-          <w:szCs w:val="22"/>
-        </w:rPr>
-        <w:t xml:space="preserve">Parallel.Invoke does not guarantee any assignment or order. The repeated pattern comes from how the thread pool happens to hand out work in a fresh process (the calling thread runs the first action, and the same pool threads are created in the same order), not from any rule. Code must never depend on which thread runs which action.</w:t>
+        <w:t xml:space="preserve">Yes, in all 11 runs with limit 3: A = 2 (calling thread), B = 4, C = 6. Parallel.Invoke does not guarantee any assignment or order; the pattern is just how the pool happened to hand out work.</w:t>
       </w:r>
     </w:p>
     <w:p>
@@ -14084,20 +13746,7 @@
           <w:sz w:val="22"/>
           <w:szCs w:val="22"/>
         </w:rPr>
-        <w:t xml:space="preserve">Parallel.Invoke may run the actions at the same time, one after another, or in any order, so the result is only well-defined if the actions do not depend on each other's data. Here each action writes only its own result and thread variables (resultA, threadA, ...), so results_match=YES in every run.</w:t>
-      </w:r>
-    </w:p>
-    <w:p>
-      <w:pPr>
-        <w:spacing w:after="120"/>
-      </w:pPr>
-      <w:r>
-        <w:rPr>
-          <w:rFonts w:ascii="Calibri" w:cs="Calibri" w:eastAsia="Calibri" w:hAnsi="Calibri"/>
-          <w:sz w:val="22"/>
-          <w:szCs w:val="22"/>
-        </w:rPr>
-        <w:t xml:space="preserve">If A and B wrote to the same variable, for example both did total += value, each update is a read, an add and a write. A could read total, then B reads the same old value, both add, and the second write overwrites the first, so one update is lost. The final value would depend on timing and change from run to run, the same kind of race as in Task 3. Avoiding it needs a lock or Interlocked operations, or better, separate variables combined after the call.</w:t>
+        <w:t xml:space="preserve">Actions can run at the same time in any order, so they must not depend on each other's data. If A and B both did total += x without synchronization, one update could overwrite the other (lost update) and the result would change from run to run.</w:t>
       </w:r>
     </w:p>
     <w:p>
@@ -14125,20 +13774,7 @@
           <w:sz w:val="22"/>
           <w:szCs w:val="22"/>
         </w:rPr>
-        <w:t xml:space="preserve">Parallel.Invoke is for a small, fixed number of different, independent operations (task parallelism), such as loading several files or running different calculations, which is what OpenMP sections do. Parallel.For is for doing the same operation on many data items (data parallelism), where the work can be split into many similar pieces and scales with the data size.</w:t>
-      </w:r>
-    </w:p>
-    <w:p>
-      <w:pPr>
-        <w:spacing w:after="120"/>
-      </w:pPr>
-      <w:r>
-        <w:rPr>
-          <w:rFonts w:ascii="Calibri" w:cs="Calibri" w:eastAsia="Calibri" w:hAnsi="Calibri"/>
-          <w:sz w:val="22"/>
-          <w:szCs w:val="22"/>
-        </w:rPr>
-        <w:t xml:space="preserve">Parallel.Invoke returns only after all the actions have finished; this is the implicit barrier, like the one at the end of an OpenMP sections construct. So the code after it can safely use every result: here the comparison with the serial results and the printing of thread IDs happen only once A, B and C are all done. It also means the total time is set by the slowest action.</w:t>
+        <w:t xml:space="preserve">Use Parallel.Invoke for a few different, independent operations (task parallelism, like OpenMP sections); use Parallel.For for the same operation over many data items (data parallelism). The implicit barrier means code after the call runs only when all actions are done, so it can safely use all the results.</w:t>
       </w:r>
     </w:p>
     <w:p>

</xml_diff>